<commit_message>
Trails of Blood & Dust: The Texas Rangers allegiance
Co-Authored-By: Claude Opus 5.5 <noreply@anthropic.com>
Claude-Session: https://claude.ai/code/session_015SADCFzhKijkC2foUmXrpC
</commit_message>
<xml_diff>
--- a/legend-dynamics/site/trails-of-blood-and-dust/Trails_of_Blood_Dust_Players_Guide.docx
+++ b/legend-dynamics/site/trails-of-blood-and-dust/Trails_of_Blood_Dust_Players_Guide.docx
@@ -4122,6 +4122,54 @@
                 <w:sz w:val="19"/>
               </w:rPr>
               <w:t xml:space="preserve">Duty: the marshal sends you after federal fugitives, and the men you’ve jailed have friends.</w:t>
+            </w:r>
+          </w:p>
+        </w:tc>
+      </w:tr>
+      <w:tr>
+        <w:tc>
+          <w:tcPr/>
+          <w:p>
+            <w:pPr>
+              <w:pStyle w:val="Compact"/>
+              <w:jc w:val="left"/>
+            </w:pPr>
+            <w:r>
+              <w:rPr>
+                <w:b/>
+                <w:sz w:val="19"/>
+              </w:rPr>
+              <w:t xml:space="preserve">The Texas Rangers</w:t>
+            </w:r>
+          </w:p>
+        </w:tc>
+        <w:tc>
+          <w:tcPr/>
+          <w:p>
+            <w:pPr>
+              <w:pStyle w:val="Compact"/>
+              <w:jc w:val="left"/>
+            </w:pPr>
+            <w:r>
+              <w:rPr>
+                <w:sz w:val="19"/>
+              </w:rPr>
+              <w:t xml:space="preserve">Once per job, a Ranger company riding with you, a warrant good anywhere in Texas, or word from a frontier post.</w:t>
+            </w:r>
+          </w:p>
+        </w:tc>
+        <w:tc>
+          <w:tcPr/>
+          <w:p>
+            <w:pPr>
+              <w:pStyle w:val="Compact"/>
+              <w:jc w:val="left"/>
+            </w:pPr>
+            <w:r>
+              <w:rPr>
+                <w:sz w:val="19"/>
+              </w:rPr>
+              <w:t xml:space="preserve">Duty: the Captain sends you wherever Texas is in trouble, and the Rangers’ hard reputation rides with you.</w:t>
             </w:r>
           </w:p>
         </w:tc>

</xml_diff>

<commit_message>
Trails of Blood & Dust: one Lawman calling
- Marshal, Deputy and Detective become Lawman: a U.S. marshal, a Texas
  Ranger, a sheriff or deputy, a city policeman or a Pinkerton detective.
  The Allegiance says which force; a Badge or Pinkerton Credentials
  advantage gives its authority. Core skills: Shooting, Investigation,
  Read People, Riding.
- Saved characters with the old callings open as Lawman (pack roleAliases).
- Ruth Calloway serves The U.S. Marshals; the guide's example lawman, the
  Pinkertons.

Co-Authored-By: Claude Opus 5.5 <noreply@anthropic.com>
Claude-Session: https://claude.ai/code/session_015SADCFzhKijkC2foUmXrpC
</commit_message>
<xml_diff>
--- a/legend-dynamics/site/trails-of-blood-and-dust/Trails_of_Blood_Dust_Players_Guide.docx
+++ b/legend-dynamics/site/trails-of-blood-and-dust/Trails_of_Blood_Dust_Players_Guide.docx
@@ -389,7 +389,7 @@
                 <w:b/>
                 <w:sz w:val="19"/>
               </w:rPr>
-              <w:t xml:space="preserve">Marshal</w:t>
+              <w:t xml:space="preserve">Lawman</w:t>
             </w:r>
           </w:p>
         </w:tc>
@@ -419,148 +419,22 @@
               <w:rPr>
                 <w:sz w:val="19"/>
               </w:rPr>
-              <w:t xml:space="preserve">carries what authority there is (take a Badge advantage), with Leadership and a steady gun.</w:t>
-            </w:r>
-          </w:p>
-        </w:tc>
-        <w:tc>
-          <w:tcPr/>
-          <w:p>
-            <w:pPr>
-              <w:pStyle w:val="Compact"/>
-              <w:jc w:val="left"/>
-            </w:pPr>
-            <w:r>
-              <w:rPr>
-                <w:sz w:val="19"/>
-              </w:rPr>
-              <w:t xml:space="preserve">Leadership, Shooting, Law, Riding</w:t>
-            </w:r>
-          </w:p>
-        </w:tc>
-      </w:tr>
-      <w:tr>
-        <w:tc>
-          <w:tcPr/>
-          <w:p>
-            <w:pPr>
-              <w:pStyle w:val="Compact"/>
-              <w:jc w:val="left"/>
-            </w:pPr>
-            <w:r>
-              <w:rPr>
-                <w:b/>
-                <w:sz w:val="19"/>
-              </w:rPr>
-              <w:t xml:space="preserve">Deputy</w:t>
-            </w:r>
-          </w:p>
-        </w:tc>
-        <w:tc>
-          <w:tcPr/>
-          <w:p>
-            <w:pPr>
-              <w:pStyle w:val="Compact"/>
-              <w:jc w:val="left"/>
-            </w:pPr>
-            <w:r>
-              <w:rPr>
-                <w:sz w:val="19"/>
-              </w:rPr>
-              <w:t xml:space="preserve">The Law</w:t>
-            </w:r>
-          </w:p>
-        </w:tc>
-        <w:tc>
-          <w:tcPr/>
-          <w:p>
-            <w:pPr>
-              <w:pStyle w:val="Compact"/>
-              <w:jc w:val="left"/>
-            </w:pPr>
-            <w:r>
-              <w:rPr>
-                <w:sz w:val="19"/>
-              </w:rPr>
-              <w:t xml:space="preserve">keeps order, guards prisoners, and backs up the marshal when it comes to shooting.</w:t>
-            </w:r>
-          </w:p>
-        </w:tc>
-        <w:tc>
-          <w:tcPr/>
-          <w:p>
-            <w:pPr>
-              <w:pStyle w:val="Compact"/>
-              <w:jc w:val="left"/>
-            </w:pPr>
-            <w:r>
-              <w:rPr>
-                <w:sz w:val="19"/>
-              </w:rPr>
-              <w:t xml:space="preserve">Shooting, Brawling, Riding, Read People</w:t>
-            </w:r>
-          </w:p>
-        </w:tc>
-      </w:tr>
-      <w:tr>
-        <w:tc>
-          <w:tcPr/>
-          <w:p>
-            <w:pPr>
-              <w:pStyle w:val="Compact"/>
-              <w:jc w:val="left"/>
-            </w:pPr>
-            <w:r>
-              <w:rPr>
-                <w:b/>
-                <w:sz w:val="19"/>
-              </w:rPr>
-              <w:t xml:space="preserve">Detective</w:t>
-            </w:r>
-          </w:p>
-        </w:tc>
-        <w:tc>
-          <w:tcPr/>
-          <w:p>
-            <w:pPr>
-              <w:pStyle w:val="Compact"/>
-              <w:jc w:val="left"/>
-            </w:pPr>
-            <w:r>
-              <w:rPr>
-                <w:sz w:val="19"/>
-              </w:rPr>
-              <w:t xml:space="preserve">The Law</w:t>
-            </w:r>
-          </w:p>
-        </w:tc>
-        <w:tc>
-          <w:tcPr/>
-          <w:p>
-            <w:pPr>
-              <w:pStyle w:val="Compact"/>
-              <w:jc w:val="left"/>
-            </w:pPr>
-            <w:r>
-              <w:rPr>
-                <w:sz w:val="19"/>
-              </w:rPr>
-              <w:t xml:space="preserve">investigates crimes for the Pinkertons (take Pinkerton Credentials) or a private client, and follows the paper trail nobody else reads.</w:t>
-            </w:r>
-          </w:p>
-        </w:tc>
-        <w:tc>
-          <w:tcPr/>
-          <w:p>
-            <w:pPr>
-              <w:pStyle w:val="Compact"/>
-              <w:jc w:val="left"/>
-            </w:pPr>
-            <w:r>
-              <w:rPr>
-                <w:sz w:val="19"/>
-              </w:rPr>
-              <w:t xml:space="preserve">Investigation, Read People, Deception, Stealth</w:t>
+              <w:t xml:space="preserve">wears a badge or carries credentials, and brings the guilty in: a U.S. marshal, a Texas Ranger, a sheriff or deputy, a city policeman, or a Pinkerton detective. Your Allegiance says which force you serve; a Badge or Pinkerton Credentials advantage gives its authority.</w:t>
+            </w:r>
+          </w:p>
+        </w:tc>
+        <w:tc>
+          <w:tcPr/>
+          <w:p>
+            <w:pPr>
+              <w:pStyle w:val="Compact"/>
+              <w:jc w:val="left"/>
+            </w:pPr>
+            <w:r>
+              <w:rPr>
+                <w:sz w:val="19"/>
+              </w:rPr>
+              <w:t xml:space="preserve">Shooting, Investigation, Read People, Riding</w:t>
             </w:r>
           </w:p>
         </w:tc>
@@ -17337,7 +17211,7 @@
           <w:iCs/>
           <w:i/>
         </w:rPr>
-        <w:t xml:space="preserve">Deputy U.S. Marshal, Marshal. Sighted (tier 1).</w:t>
+        <w:t xml:space="preserve">Deputy U.S. Marshal, Lawman. Sighted (tier 1).</w:t>
       </w:r>
       <w:r>
         <w:t xml:space="preserve"> </w:t>

</xml_diff>

<commit_message>
Rebuild the website with the rebalanced Trails callings
Co-Authored-By: Claude Opus 5.5 <noreply@anthropic.com>
Claude-Session: https://claude.ai/code/session_015SADCFzhKijkC2foUmXrpC
</commit_message>
<xml_diff>
--- a/legend-dynamics/site/trails-of-blood-and-dust/Trails_of_Blood_Dust_Players_Guide.docx
+++ b/legend-dynamics/site/trails-of-blood-and-dust/Trails_of_Blood_Dust_Players_Guide.docx
@@ -294,10 +294,11 @@
         </w:tblBorders>
       </w:tblPr>
       <w:tblGrid>
-        <w:gridCol w:w="1980"/>
-        <w:gridCol w:w="1980"/>
-        <w:gridCol w:w="1980"/>
-        <w:gridCol w:w="1980"/>
+        <w:gridCol w:w="1584"/>
+        <w:gridCol w:w="1584"/>
+        <w:gridCol w:w="1584"/>
+        <w:gridCol w:w="1584"/>
+        <w:gridCol w:w="1584"/>
       </w:tblGrid>
       <w:tr>
         <w:trPr>
@@ -375,6 +376,24 @@
             </w:r>
           </w:p>
         </w:tc>
+        <w:tc>
+          <w:tcPr>
+            <w:shd w:val="clear" w:fill="E6E8E6"/>
+          </w:tcPr>
+          <w:p>
+            <w:pPr>
+              <w:pStyle w:val="Compact"/>
+              <w:jc w:val="left"/>
+            </w:pPr>
+            <w:r>
+              <w:rPr>
+                <w:b/>
+                <w:sz w:val="19"/>
+              </w:rPr>
+              <w:t xml:space="preserve">Ability</w:t>
+            </w:r>
+          </w:p>
+        </w:tc>
       </w:tr>
       <w:tr>
         <w:tc>
@@ -434,7 +453,36 @@
               <w:rPr>
                 <w:sz w:val="19"/>
               </w:rPr>
-              <w:t xml:space="preserve">Shooting, Investigation, Read People, Riding</w:t>
+              <w:t xml:space="preserve">Shooting, Riding, Leadership, Law</w:t>
+            </w:r>
+          </w:p>
+        </w:tc>
+        <w:tc>
+          <w:tcPr/>
+          <w:p>
+            <w:pPr>
+              <w:pStyle w:val="Compact"/>
+              <w:jc w:val="left"/>
+            </w:pPr>
+            <w:r>
+              <w:rPr>
+                <w:bCs/>
+                <w:b/>
+                <w:sz w:val="19"/>
+              </w:rPr>
+              <w:t xml:space="preserve">The badge.</w:t>
+            </w:r>
+            <w:r>
+              <w:rPr>
+                <w:sz w:val="19"/>
+              </w:rPr>
+              <w:t xml:space="preserve"> </w:t>
+            </w:r>
+            <w:r>
+              <w:rPr>
+                <w:sz w:val="19"/>
+              </w:rPr>
+              <w:t xml:space="preserve">+2 to Leadership when you give orders in the law’s name: an arrest, raising a posse, clearing a street.</w:t>
             </w:r>
           </w:p>
         </w:tc>
@@ -497,7 +545,36 @@
               <w:rPr>
                 <w:sz w:val="19"/>
               </w:rPr>
-              <w:t xml:space="preserve">Tracking, Shooting, Riding, Survival</w:t>
+              <w:t xml:space="preserve">Shooting, Tracking, Read People, Investigation</w:t>
+            </w:r>
+          </w:p>
+        </w:tc>
+        <w:tc>
+          <w:tcPr/>
+          <w:p>
+            <w:pPr>
+              <w:pStyle w:val="Compact"/>
+              <w:jc w:val="left"/>
+            </w:pPr>
+            <w:r>
+              <w:rPr>
+                <w:bCs/>
+                <w:b/>
+                <w:sz w:val="19"/>
+              </w:rPr>
+              <w:t xml:space="preserve">Paper on them.</w:t>
+            </w:r>
+            <w:r>
+              <w:rPr>
+                <w:sz w:val="19"/>
+              </w:rPr>
+              <w:t xml:space="preserve"> </w:t>
+            </w:r>
+            <w:r>
+              <w:rPr>
+                <w:sz w:val="19"/>
+              </w:rPr>
+              <w:t xml:space="preserve">+2 to Tracking and Investigation to find someone with a price on their head or a warrant out.</w:t>
             </w:r>
           </w:p>
         </w:tc>
@@ -560,7 +637,36 @@
               <w:rPr>
                 <w:sz w:val="19"/>
               </w:rPr>
-              <w:t xml:space="preserve">Medicine, Investigation, Read People, Persuasion</w:t>
+              <w:t xml:space="preserve">Shooting, Riding, Persuasion, Medicine</w:t>
+            </w:r>
+          </w:p>
+        </w:tc>
+        <w:tc>
+          <w:tcPr/>
+          <w:p>
+            <w:pPr>
+              <w:pStyle w:val="Compact"/>
+              <w:jc w:val="left"/>
+            </w:pPr>
+            <w:r>
+              <w:rPr>
+                <w:bCs/>
+                <w:b/>
+                <w:sz w:val="19"/>
+              </w:rPr>
+              <w:t xml:space="preserve">Steady hands.</w:t>
+            </w:r>
+            <w:r>
+              <w:rPr>
+                <w:sz w:val="19"/>
+              </w:rPr>
+              <w:t xml:space="preserve"> </w:t>
+            </w:r>
+            <w:r>
+              <w:rPr>
+                <w:sz w:val="19"/>
+              </w:rPr>
+              <w:t xml:space="preserve">+2 to Medicine when stabilizing the Dying or working under fire.</w:t>
             </w:r>
           </w:p>
         </w:tc>
@@ -623,7 +729,36 @@
               <w:rPr>
                 <w:sz w:val="19"/>
               </w:rPr>
-              <w:t xml:space="preserve">Occult, Investigation, Persuasion, Read People</w:t>
+              <w:t xml:space="preserve">Melee, Stealth, Deception, Occult</w:t>
+            </w:r>
+          </w:p>
+        </w:tc>
+        <w:tc>
+          <w:tcPr/>
+          <w:p>
+            <w:pPr>
+              <w:pStyle w:val="Compact"/>
+              <w:jc w:val="left"/>
+            </w:pPr>
+            <w:r>
+              <w:rPr>
+                <w:bCs/>
+                <w:b/>
+                <w:sz w:val="19"/>
+              </w:rPr>
+              <w:t xml:space="preserve">Forbidden lore.</w:t>
+            </w:r>
+            <w:r>
+              <w:rPr>
+                <w:sz w:val="19"/>
+              </w:rPr>
+              <w:t xml:space="preserve"> </w:t>
+            </w:r>
+            <w:r>
+              <w:rPr>
+                <w:sz w:val="19"/>
+              </w:rPr>
+              <w:t xml:space="preserve">Once per job, ask the GM one question about a supernatural thing you’ve seen, and get a true answer.</w:t>
             </w:r>
           </w:p>
         </w:tc>
@@ -686,7 +821,36 @@
               <w:rPr>
                 <w:sz w:val="19"/>
               </w:rPr>
-              <w:t xml:space="preserve">Law, Persuasion, Read People, Investigation</w:t>
+              <w:t xml:space="preserve">Brawling, Athletics, Deception, Law</w:t>
+            </w:r>
+          </w:p>
+        </w:tc>
+        <w:tc>
+          <w:tcPr/>
+          <w:p>
+            <w:pPr>
+              <w:pStyle w:val="Compact"/>
+              <w:jc w:val="left"/>
+            </w:pPr>
+            <w:r>
+              <w:rPr>
+                <w:bCs/>
+                <w:b/>
+                <w:sz w:val="19"/>
+              </w:rPr>
+              <w:t xml:space="preserve">Due process.</w:t>
+            </w:r>
+            <w:r>
+              <w:rPr>
+                <w:sz w:val="19"/>
+              </w:rPr>
+              <w:t xml:space="preserve"> </w:t>
+            </w:r>
+            <w:r>
+              <w:rPr>
+                <w:sz w:val="19"/>
+              </w:rPr>
+              <w:t xml:space="preserve">Once per job, get someone out of jail, a warrant issued or quashed, or a deed or contract into your hands, wherever there’s law to work.</w:t>
             </w:r>
           </w:p>
         </w:tc>
@@ -749,7 +913,36 @@
               <w:rPr>
                 <w:sz w:val="19"/>
               </w:rPr>
-              <w:t xml:space="preserve">Investigation, Persuasion, Read People, Stealth</w:t>
+              <w:t xml:space="preserve">Brawling, Stealth, Read People, Investigation</w:t>
+            </w:r>
+          </w:p>
+        </w:tc>
+        <w:tc>
+          <w:tcPr/>
+          <w:p>
+            <w:pPr>
+              <w:pStyle w:val="Compact"/>
+              <w:jc w:val="left"/>
+            </w:pPr>
+            <w:r>
+              <w:rPr>
+                <w:bCs/>
+                <w:b/>
+                <w:sz w:val="19"/>
+              </w:rPr>
+              <w:t xml:space="preserve">The press.</w:t>
+            </w:r>
+            <w:r>
+              <w:rPr>
+                <w:sz w:val="19"/>
+              </w:rPr>
+              <w:t xml:space="preserve"> </w:t>
+            </w:r>
+            <w:r>
+              <w:rPr>
+                <w:sz w:val="19"/>
+              </w:rPr>
+              <w:t xml:space="preserve">Once per job, print a story; the town believes it until someone proves it false.</w:t>
             </w:r>
           </w:p>
         </w:tc>
@@ -812,7 +1005,36 @@
               <w:rPr>
                 <w:sz w:val="19"/>
               </w:rPr>
-              <w:t xml:space="preserve">Persuasion, Leadership, Occult, Shooting</w:t>
+              <w:t xml:space="preserve">Shooting, Riding, Leadership, Occult</w:t>
+            </w:r>
+          </w:p>
+        </w:tc>
+        <w:tc>
+          <w:tcPr/>
+          <w:p>
+            <w:pPr>
+              <w:pStyle w:val="Compact"/>
+              <w:jc w:val="left"/>
+            </w:pPr>
+            <w:r>
+              <w:rPr>
+                <w:bCs/>
+                <w:b/>
+                <w:sz w:val="19"/>
+              </w:rPr>
+              <w:t xml:space="preserve">Hold fast.</w:t>
+            </w:r>
+            <w:r>
+              <w:rPr>
+                <w:sz w:val="19"/>
+              </w:rPr>
+              <w:t xml:space="preserve"> </w:t>
+            </w:r>
+            <w:r>
+              <w:rPr>
+                <w:sz w:val="19"/>
+              </w:rPr>
+              <w:t xml:space="preserve">+2 to Will against fear, possession and temptation, and to Leadership to steady others against them.</w:t>
             </w:r>
           </w:p>
         </w:tc>
@@ -875,7 +1097,36 @@
               <w:rPr>
                 <w:sz w:val="19"/>
               </w:rPr>
-              <w:t xml:space="preserve">Occult, Tracking, Shooting, Melee</w:t>
+              <w:t xml:space="preserve">Melee, Tracking, Read People, Occult</w:t>
+            </w:r>
+          </w:p>
+        </w:tc>
+        <w:tc>
+          <w:tcPr/>
+          <w:p>
+            <w:pPr>
+              <w:pStyle w:val="Compact"/>
+              <w:jc w:val="left"/>
+            </w:pPr>
+            <w:r>
+              <w:rPr>
+                <w:bCs/>
+                <w:b/>
+                <w:sz w:val="19"/>
+              </w:rPr>
+              <w:t xml:space="preserve">Know its weakness.</w:t>
+            </w:r>
+            <w:r>
+              <w:rPr>
+                <w:sz w:val="19"/>
+              </w:rPr>
+              <w:t xml:space="preserve"> </w:t>
+            </w:r>
+            <w:r>
+              <w:rPr>
+                <w:sz w:val="19"/>
+              </w:rPr>
+              <w:t xml:space="preserve">Once you’ve identified a creature with an Occult roll, your called shots against it take no penalty.</w:t>
             </w:r>
           </w:p>
         </w:tc>
@@ -938,7 +1189,36 @@
               <w:rPr>
                 <w:sz w:val="19"/>
               </w:rPr>
-              <w:t xml:space="preserve">Shooting, Athletics, Read People, Riding</w:t>
+              <w:t xml:space="preserve">Shooting, Riding, Read People, Athletics</w:t>
+            </w:r>
+          </w:p>
+        </w:tc>
+        <w:tc>
+          <w:tcPr/>
+          <w:p>
+            <w:pPr>
+              <w:pStyle w:val="Compact"/>
+              <w:jc w:val="left"/>
+            </w:pPr>
+            <w:r>
+              <w:rPr>
+                <w:bCs/>
+                <w:b/>
+                <w:sz w:val="19"/>
+              </w:rPr>
+              <w:t xml:space="preserve">Quick draw.</w:t>
+            </w:r>
+            <w:r>
+              <w:rPr>
+                <w:sz w:val="19"/>
+              </w:rPr>
+              <w:t xml:space="preserve"> </w:t>
+            </w:r>
+            <w:r>
+              <w:rPr>
+                <w:sz w:val="19"/>
+              </w:rPr>
+              <w:t xml:space="preserve">In the first round of a gunfight, you act first, whatever your Agility.</w:t>
             </w:r>
           </w:p>
         </w:tc>
@@ -1001,7 +1281,36 @@
               <w:rPr>
                 <w:sz w:val="19"/>
               </w:rPr>
-              <w:t xml:space="preserve">Tracking, Survival, Riding, Stealth</w:t>
+              <w:t xml:space="preserve">Melee, Tracking, Persuasion, Survival</w:t>
+            </w:r>
+          </w:p>
+        </w:tc>
+        <w:tc>
+          <w:tcPr/>
+          <w:p>
+            <w:pPr>
+              <w:pStyle w:val="Compact"/>
+              <w:jc w:val="left"/>
+            </w:pPr>
+            <w:r>
+              <w:rPr>
+                <w:bCs/>
+                <w:b/>
+                <w:sz w:val="19"/>
+              </w:rPr>
+              <w:t xml:space="preserve">Lay of the land.</w:t>
+            </w:r>
+            <w:r>
+              <w:rPr>
+                <w:sz w:val="19"/>
+              </w:rPr>
+              <w:t xml:space="preserve"> </w:t>
+            </w:r>
+            <w:r>
+              <w:rPr>
+                <w:sz w:val="19"/>
+              </w:rPr>
+              <w:t xml:space="preserve">Once per job, you know a way: a hidden pass, a water hole, a shortcut that saves a day, or a place to make a stand.</w:t>
             </w:r>
           </w:p>
         </w:tc>
@@ -1064,7 +1373,36 @@
               <w:rPr>
                 <w:sz w:val="19"/>
               </w:rPr>
-              <w:t xml:space="preserve">Gambling, Read People, Deception, Shooting</w:t>
+              <w:t xml:space="preserve">Shooting, Stealth, Deception, Gambling</w:t>
+            </w:r>
+          </w:p>
+        </w:tc>
+        <w:tc>
+          <w:tcPr/>
+          <w:p>
+            <w:pPr>
+              <w:pStyle w:val="Compact"/>
+              <w:jc w:val="left"/>
+            </w:pPr>
+            <w:r>
+              <w:rPr>
+                <w:bCs/>
+                <w:b/>
+                <w:sz w:val="19"/>
+              </w:rPr>
+              <w:t xml:space="preserve">Markers.</w:t>
+            </w:r>
+            <w:r>
+              <w:rPr>
+                <w:sz w:val="19"/>
+              </w:rPr>
+              <w:t xml:space="preserve"> </w:t>
+            </w:r>
+            <w:r>
+              <w:rPr>
+                <w:sz w:val="19"/>
+              </w:rPr>
+              <w:t xml:space="preserve">Once per job, call in a debt: someone owes you a favor, a horse, a room or the truth.</w:t>
             </w:r>
           </w:p>
         </w:tc>
@@ -1127,7 +1465,36 @@
               <w:rPr>
                 <w:sz w:val="19"/>
               </w:rPr>
-              <w:t xml:space="preserve">Animal Handling, Riding, Survival, Brawling</w:t>
+              <w:t xml:space="preserve">Brawling, Animal Handling, Leadership, Tinkering</w:t>
+            </w:r>
+          </w:p>
+        </w:tc>
+        <w:tc>
+          <w:tcPr/>
+          <w:p>
+            <w:pPr>
+              <w:pStyle w:val="Compact"/>
+              <w:jc w:val="left"/>
+            </w:pPr>
+            <w:r>
+              <w:rPr>
+                <w:bCs/>
+                <w:b/>
+                <w:sz w:val="19"/>
+              </w:rPr>
+              <w:t xml:space="preserve">Horse sense.</w:t>
+            </w:r>
+            <w:r>
+              <w:rPr>
+                <w:sz w:val="19"/>
+              </w:rPr>
+              <w:t xml:space="preserve"> </w:t>
+            </w:r>
+            <w:r>
+              <w:rPr>
+                <w:sz w:val="19"/>
+              </w:rPr>
+              <w:t xml:space="preserve">+2 to Animal Handling, and to Riding to stay in the saddle in a stampede, a chase or a fall.</w:t>
             </w:r>
           </w:p>
         </w:tc>
@@ -1190,7 +1557,36 @@
               <w:rPr>
                 <w:sz w:val="19"/>
               </w:rPr>
-              <w:t xml:space="preserve">Occult, Medicine, Investigation, Melee</w:t>
+              <w:t xml:space="preserve">Melee, Stealth, Persuasion, Medicine</w:t>
+            </w:r>
+          </w:p>
+        </w:tc>
+        <w:tc>
+          <w:tcPr/>
+          <w:p>
+            <w:pPr>
+              <w:pStyle w:val="Compact"/>
+              <w:jc w:val="left"/>
+            </w:pPr>
+            <w:r>
+              <w:rPr>
+                <w:bCs/>
+                <w:b/>
+                <w:sz w:val="19"/>
+              </w:rPr>
+              <w:t xml:space="preserve">Ask the body.</w:t>
+            </w:r>
+            <w:r>
+              <w:rPr>
+                <w:sz w:val="19"/>
+              </w:rPr>
+              <w:t xml:space="preserve"> </w:t>
+            </w:r>
+            <w:r>
+              <w:rPr>
+                <w:sz w:val="19"/>
+              </w:rPr>
+              <w:t xml:space="preserve">Once per job, examine a corpse and learn how and when it died, and one thing about who did it.</w:t>
             </w:r>
           </w:p>
         </w:tc>

</xml_diff>

<commit_message>
Rebuild the website with the new Trails callings
Co-Authored-By: Claude Opus 5.5 <noreply@anthropic.com>
Claude-Session: https://claude.ai/code/session_015SADCFzhKijkC2foUmXrpC
</commit_message>
<xml_diff>
--- a/legend-dynamics/site/trails-of-blood-and-dust/Trails_of_Blood_Dust_Players_Guide.docx
+++ b/legend-dynamics/site/trails-of-blood-and-dust/Trails_of_Blood_Dust_Players_Guide.docx
@@ -592,6 +592,190 @@
                 <w:b/>
                 <w:sz w:val="19"/>
               </w:rPr>
+              <w:t xml:space="preserve">Lawyer</w:t>
+            </w:r>
+          </w:p>
+        </w:tc>
+        <w:tc>
+          <w:tcPr/>
+          <w:p>
+            <w:pPr>
+              <w:pStyle w:val="Compact"/>
+              <w:jc w:val="left"/>
+            </w:pPr>
+            <w:r>
+              <w:rPr>
+                <w:sz w:val="19"/>
+              </w:rPr>
+              <w:t xml:space="preserve">The Law</w:t>
+            </w:r>
+          </w:p>
+        </w:tc>
+        <w:tc>
+          <w:tcPr/>
+          <w:p>
+            <w:pPr>
+              <w:pStyle w:val="Compact"/>
+              <w:jc w:val="left"/>
+            </w:pPr>
+            <w:r>
+              <w:rPr>
+                <w:sz w:val="19"/>
+              </w:rPr>
+              <w:t xml:space="preserve">knows the law better than the men who wear the badges, and isn’t afraid to say so.</w:t>
+            </w:r>
+          </w:p>
+        </w:tc>
+        <w:tc>
+          <w:tcPr/>
+          <w:p>
+            <w:pPr>
+              <w:pStyle w:val="Compact"/>
+              <w:jc w:val="left"/>
+            </w:pPr>
+            <w:r>
+              <w:rPr>
+                <w:sz w:val="19"/>
+              </w:rPr>
+              <w:t xml:space="preserve">Brawling, Athletics, Deception, Law</w:t>
+            </w:r>
+          </w:p>
+        </w:tc>
+        <w:tc>
+          <w:tcPr/>
+          <w:p>
+            <w:pPr>
+              <w:pStyle w:val="Compact"/>
+              <w:jc w:val="left"/>
+            </w:pPr>
+            <w:r>
+              <w:rPr>
+                <w:bCs/>
+                <w:b/>
+                <w:sz w:val="19"/>
+              </w:rPr>
+              <w:t xml:space="preserve">Due process.</w:t>
+            </w:r>
+            <w:r>
+              <w:rPr>
+                <w:sz w:val="19"/>
+              </w:rPr>
+              <w:t xml:space="preserve"> </w:t>
+            </w:r>
+            <w:r>
+              <w:rPr>
+                <w:sz w:val="19"/>
+              </w:rPr>
+              <w:t xml:space="preserve">Once per job, get someone out of jail, a warrant issued or quashed, or a deed or contract into your hands, wherever there’s law to work.</w:t>
+            </w:r>
+          </w:p>
+        </w:tc>
+      </w:tr>
+      <w:tr>
+        <w:tc>
+          <w:tcPr/>
+          <w:p>
+            <w:pPr>
+              <w:pStyle w:val="Compact"/>
+              <w:jc w:val="left"/>
+            </w:pPr>
+            <w:r>
+              <w:rPr>
+                <w:b/>
+                <w:sz w:val="19"/>
+              </w:rPr>
+              <w:t xml:space="preserve">Circuit Judge</w:t>
+            </w:r>
+          </w:p>
+        </w:tc>
+        <w:tc>
+          <w:tcPr/>
+          <w:p>
+            <w:pPr>
+              <w:pStyle w:val="Compact"/>
+              <w:jc w:val="left"/>
+            </w:pPr>
+            <w:r>
+              <w:rPr>
+                <w:sz w:val="19"/>
+              </w:rPr>
+              <w:t xml:space="preserve">The Law</w:t>
+            </w:r>
+          </w:p>
+        </w:tc>
+        <w:tc>
+          <w:tcPr/>
+          <w:p>
+            <w:pPr>
+              <w:pStyle w:val="Compact"/>
+              <w:jc w:val="left"/>
+            </w:pPr>
+            <w:r>
+              <w:rPr>
+                <w:sz w:val="19"/>
+              </w:rPr>
+              <w:t xml:space="preserve">rides from town to town holding court, and not every town wants one.</w:t>
+            </w:r>
+          </w:p>
+        </w:tc>
+        <w:tc>
+          <w:tcPr/>
+          <w:p>
+            <w:pPr>
+              <w:pStyle w:val="Compact"/>
+              <w:jc w:val="left"/>
+            </w:pPr>
+            <w:r>
+              <w:rPr>
+                <w:sz w:val="19"/>
+              </w:rPr>
+              <w:t xml:space="preserve">Brawling, Survival, Leadership, Law</w:t>
+            </w:r>
+          </w:p>
+        </w:tc>
+        <w:tc>
+          <w:tcPr/>
+          <w:p>
+            <w:pPr>
+              <w:pStyle w:val="Compact"/>
+              <w:jc w:val="left"/>
+            </w:pPr>
+            <w:r>
+              <w:rPr>
+                <w:bCs/>
+                <w:b/>
+                <w:sz w:val="19"/>
+              </w:rPr>
+              <w:t xml:space="preserve">Heard it all before.</w:t>
+            </w:r>
+            <w:r>
+              <w:rPr>
+                <w:sz w:val="19"/>
+              </w:rPr>
+              <w:t xml:space="preserve"> </w:t>
+            </w:r>
+            <w:r>
+              <w:rPr>
+                <w:sz w:val="19"/>
+              </w:rPr>
+              <w:t xml:space="preserve">+2 to Read People to catch a lie told to your face.</w:t>
+            </w:r>
+          </w:p>
+        </w:tc>
+      </w:tr>
+      <w:tr>
+        <w:tc>
+          <w:tcPr/>
+          <w:p>
+            <w:pPr>
+              <w:pStyle w:val="Compact"/>
+              <w:jc w:val="left"/>
+            </w:pPr>
+            <w:r>
+              <w:rPr>
+                <w:b/>
+                <w:sz w:val="19"/>
+              </w:rPr>
               <w:t xml:space="preserve">Doctor</w:t>
             </w:r>
           </w:p>
@@ -776,7 +960,7 @@
                 <w:b/>
                 <w:sz w:val="19"/>
               </w:rPr>
-              <w:t xml:space="preserve">Lawyer</w:t>
+              <w:t xml:space="preserve">Journalist</w:t>
             </w:r>
           </w:p>
         </w:tc>
@@ -806,22 +990,22 @@
               <w:rPr>
                 <w:sz w:val="19"/>
               </w:rPr>
-              <w:t xml:space="preserve">knows the law better than the men who wear the badges, and isn’t afraid to say so.</w:t>
-            </w:r>
-          </w:p>
-        </w:tc>
-        <w:tc>
-          <w:tcPr/>
-          <w:p>
-            <w:pPr>
-              <w:pStyle w:val="Compact"/>
-              <w:jc w:val="left"/>
-            </w:pPr>
-            <w:r>
-              <w:rPr>
-                <w:sz w:val="19"/>
-              </w:rPr>
-              <w:t xml:space="preserve">Brawling, Athletics, Deception, Law</w:t>
+              <w:t xml:space="preserve">asks the questions no one wants asked, and prints the answers.</w:t>
+            </w:r>
+          </w:p>
+        </w:tc>
+        <w:tc>
+          <w:tcPr/>
+          <w:p>
+            <w:pPr>
+              <w:pStyle w:val="Compact"/>
+              <w:jc w:val="left"/>
+            </w:pPr>
+            <w:r>
+              <w:rPr>
+                <w:sz w:val="19"/>
+              </w:rPr>
+              <w:t xml:space="preserve">Brawling, Stealth, Read People, Investigation</w:t>
             </w:r>
           </w:p>
         </w:tc>
@@ -838,7 +1022,7 @@
                 <w:b/>
                 <w:sz w:val="19"/>
               </w:rPr>
-              <w:t xml:space="preserve">Due process.</w:t>
+              <w:t xml:space="preserve">The press.</w:t>
             </w:r>
             <w:r>
               <w:rPr>
@@ -850,25 +1034,25 @@
               <w:rPr>
                 <w:sz w:val="19"/>
               </w:rPr>
-              <w:t xml:space="preserve">Once per job, get someone out of jail, a warrant issued or quashed, or a deed or contract into your hands, wherever there’s law to work.</w:t>
-            </w:r>
-          </w:p>
-        </w:tc>
-      </w:tr>
-      <w:tr>
-        <w:tc>
-          <w:tcPr/>
-          <w:p>
-            <w:pPr>
-              <w:pStyle w:val="Compact"/>
-              <w:jc w:val="left"/>
-            </w:pPr>
-            <w:r>
-              <w:rPr>
-                <w:b/>
-                <w:sz w:val="19"/>
-              </w:rPr>
-              <w:t xml:space="preserve">Journalist</w:t>
+              <w:t xml:space="preserve">Once per job, print a story; the town believes it until someone proves it false.</w:t>
+            </w:r>
+          </w:p>
+        </w:tc>
+      </w:tr>
+      <w:tr>
+        <w:tc>
+          <w:tcPr/>
+          <w:p>
+            <w:pPr>
+              <w:pStyle w:val="Compact"/>
+              <w:jc w:val="left"/>
+            </w:pPr>
+            <w:r>
+              <w:rPr>
+                <w:b/>
+                <w:sz w:val="19"/>
+              </w:rPr>
+              <w:t xml:space="preserve">Preacher</w:t>
             </w:r>
           </w:p>
         </w:tc>
@@ -898,22 +1082,22 @@
               <w:rPr>
                 <w:sz w:val="19"/>
               </w:rPr>
-              <w:t xml:space="preserve">asks the questions no one wants asked, and prints the answers.</w:t>
-            </w:r>
-          </w:p>
-        </w:tc>
-        <w:tc>
-          <w:tcPr/>
-          <w:p>
-            <w:pPr>
-              <w:pStyle w:val="Compact"/>
-              <w:jc w:val="left"/>
-            </w:pPr>
-            <w:r>
-              <w:rPr>
-                <w:sz w:val="19"/>
-              </w:rPr>
-              <w:t xml:space="preserve">Brawling, Stealth, Read People, Investigation</w:t>
+              <w:t xml:space="preserve">comforts the frightened, counsels the troubled, and stands up to bad men with faith and a shotgun.</w:t>
+            </w:r>
+          </w:p>
+        </w:tc>
+        <w:tc>
+          <w:tcPr/>
+          <w:p>
+            <w:pPr>
+              <w:pStyle w:val="Compact"/>
+              <w:jc w:val="left"/>
+            </w:pPr>
+            <w:r>
+              <w:rPr>
+                <w:sz w:val="19"/>
+              </w:rPr>
+              <w:t xml:space="preserve">Shooting, Riding, Leadership, Occult</w:t>
             </w:r>
           </w:p>
         </w:tc>
@@ -930,7 +1114,7 @@
                 <w:b/>
                 <w:sz w:val="19"/>
               </w:rPr>
-              <w:t xml:space="preserve">The press.</w:t>
+              <w:t xml:space="preserve">Hold fast.</w:t>
             </w:r>
             <w:r>
               <w:rPr>
@@ -942,70 +1126,70 @@
               <w:rPr>
                 <w:sz w:val="19"/>
               </w:rPr>
-              <w:t xml:space="preserve">Once per job, print a story; the town believes it until someone proves it false.</w:t>
-            </w:r>
-          </w:p>
-        </w:tc>
-      </w:tr>
-      <w:tr>
-        <w:tc>
-          <w:tcPr/>
-          <w:p>
-            <w:pPr>
-              <w:pStyle w:val="Compact"/>
-              <w:jc w:val="left"/>
-            </w:pPr>
-            <w:r>
-              <w:rPr>
-                <w:b/>
-                <w:sz w:val="19"/>
-              </w:rPr>
-              <w:t xml:space="preserve">Preacher</w:t>
-            </w:r>
-          </w:p>
-        </w:tc>
-        <w:tc>
-          <w:tcPr/>
-          <w:p>
-            <w:pPr>
-              <w:pStyle w:val="Compact"/>
-              <w:jc w:val="left"/>
-            </w:pPr>
-            <w:r>
-              <w:rPr>
-                <w:sz w:val="19"/>
-              </w:rPr>
-              <w:t xml:space="preserve">The Learned</w:t>
-            </w:r>
-          </w:p>
-        </w:tc>
-        <w:tc>
-          <w:tcPr/>
-          <w:p>
-            <w:pPr>
-              <w:pStyle w:val="Compact"/>
-              <w:jc w:val="left"/>
-            </w:pPr>
-            <w:r>
-              <w:rPr>
-                <w:sz w:val="19"/>
-              </w:rPr>
-              <w:t xml:space="preserve">comforts the frightened, counsels the troubled, and stands up to bad men with faith and a shotgun.</w:t>
-            </w:r>
-          </w:p>
-        </w:tc>
-        <w:tc>
-          <w:tcPr/>
-          <w:p>
-            <w:pPr>
-              <w:pStyle w:val="Compact"/>
-              <w:jc w:val="left"/>
-            </w:pPr>
-            <w:r>
-              <w:rPr>
-                <w:sz w:val="19"/>
-              </w:rPr>
-              <w:t xml:space="preserve">Shooting, Riding, Leadership, Occult</w:t>
+              <w:t xml:space="preserve">+2 to Will against fear, possession and temptation, and to Leadership to steady others against them.</w:t>
+            </w:r>
+          </w:p>
+        </w:tc>
+      </w:tr>
+      <w:tr>
+        <w:tc>
+          <w:tcPr/>
+          <w:p>
+            <w:pPr>
+              <w:pStyle w:val="Compact"/>
+              <w:jc w:val="left"/>
+            </w:pPr>
+            <w:r>
+              <w:rPr>
+                <w:b/>
+                <w:sz w:val="19"/>
+              </w:rPr>
+              <w:t xml:space="preserve">Monster Hunter</w:t>
+            </w:r>
+          </w:p>
+        </w:tc>
+        <w:tc>
+          <w:tcPr/>
+          <w:p>
+            <w:pPr>
+              <w:pStyle w:val="Compact"/>
+              <w:jc w:val="left"/>
+            </w:pPr>
+            <w:r>
+              <w:rPr>
+                <w:sz w:val="19"/>
+              </w:rPr>
+              <w:t xml:space="preserve">The Frontier</w:t>
+            </w:r>
+          </w:p>
+        </w:tc>
+        <w:tc>
+          <w:tcPr/>
+          <w:p>
+            <w:pPr>
+              <w:pStyle w:val="Compact"/>
+              <w:jc w:val="left"/>
+            </w:pPr>
+            <w:r>
+              <w:rPr>
+                <w:sz w:val="19"/>
+              </w:rPr>
+              <w:t xml:space="preserve">hunts what the law can’t hang, and knows which things fear silver, salt or fire (take the Monster Hunter advantage).</w:t>
+            </w:r>
+          </w:p>
+        </w:tc>
+        <w:tc>
+          <w:tcPr/>
+          <w:p>
+            <w:pPr>
+              <w:pStyle w:val="Compact"/>
+              <w:jc w:val="left"/>
+            </w:pPr>
+            <w:r>
+              <w:rPr>
+                <w:sz w:val="19"/>
+              </w:rPr>
+              <w:t xml:space="preserve">Melee, Tracking, Read People, Occult</w:t>
             </w:r>
           </w:p>
         </w:tc>
@@ -1022,7 +1206,7 @@
                 <w:b/>
                 <w:sz w:val="19"/>
               </w:rPr>
-              <w:t xml:space="preserve">Hold fast.</w:t>
+              <w:t xml:space="preserve">Know its weakness.</w:t>
             </w:r>
             <w:r>
               <w:rPr>
@@ -1034,25 +1218,25 @@
               <w:rPr>
                 <w:sz w:val="19"/>
               </w:rPr>
-              <w:t xml:space="preserve">+2 to Will against fear, possession and temptation, and to Leadership to steady others against them.</w:t>
-            </w:r>
-          </w:p>
-        </w:tc>
-      </w:tr>
-      <w:tr>
-        <w:tc>
-          <w:tcPr/>
-          <w:p>
-            <w:pPr>
-              <w:pStyle w:val="Compact"/>
-              <w:jc w:val="left"/>
-            </w:pPr>
-            <w:r>
-              <w:rPr>
-                <w:b/>
-                <w:sz w:val="19"/>
-              </w:rPr>
-              <w:t xml:space="preserve">Monster Hunter</w:t>
+              <w:t xml:space="preserve">Once you’ve identified a creature with an Occult roll, your called shots against it take no penalty.</w:t>
+            </w:r>
+          </w:p>
+        </w:tc>
+      </w:tr>
+      <w:tr>
+        <w:tc>
+          <w:tcPr/>
+          <w:p>
+            <w:pPr>
+              <w:pStyle w:val="Compact"/>
+              <w:jc w:val="left"/>
+            </w:pPr>
+            <w:r>
+              <w:rPr>
+                <w:b/>
+                <w:sz w:val="19"/>
+              </w:rPr>
+              <w:t xml:space="preserve">Gunslinger</w:t>
             </w:r>
           </w:p>
         </w:tc>
@@ -1082,22 +1266,22 @@
               <w:rPr>
                 <w:sz w:val="19"/>
               </w:rPr>
-              <w:t xml:space="preserve">hunts what the law can’t hang, and knows which things fear silver, salt or fire (take the Monster Hunter advantage).</w:t>
-            </w:r>
-          </w:p>
-        </w:tc>
-        <w:tc>
-          <w:tcPr/>
-          <w:p>
-            <w:pPr>
-              <w:pStyle w:val="Compact"/>
-              <w:jc w:val="left"/>
-            </w:pPr>
-            <w:r>
-              <w:rPr>
-                <w:sz w:val="19"/>
-              </w:rPr>
-              <w:t xml:space="preserve">Melee, Tracking, Read People, Occult</w:t>
+              <w:t xml:space="preserve">the fastest and steadiest gun in the room, and the one who decides when it’s time to draw.</w:t>
+            </w:r>
+          </w:p>
+        </w:tc>
+        <w:tc>
+          <w:tcPr/>
+          <w:p>
+            <w:pPr>
+              <w:pStyle w:val="Compact"/>
+              <w:jc w:val="left"/>
+            </w:pPr>
+            <w:r>
+              <w:rPr>
+                <w:sz w:val="19"/>
+              </w:rPr>
+              <w:t xml:space="preserve">Shooting, Riding, Read People, Athletics</w:t>
             </w:r>
           </w:p>
         </w:tc>
@@ -1114,7 +1298,7 @@
                 <w:b/>
                 <w:sz w:val="19"/>
               </w:rPr>
-              <w:t xml:space="preserve">Know its weakness.</w:t>
+              <w:t xml:space="preserve">Quick draw.</w:t>
             </w:r>
             <w:r>
               <w:rPr>
@@ -1126,25 +1310,25 @@
               <w:rPr>
                 <w:sz w:val="19"/>
               </w:rPr>
-              <w:t xml:space="preserve">Once you’ve identified a creature with an Occult roll, your called shots against it take no penalty.</w:t>
-            </w:r>
-          </w:p>
-        </w:tc>
-      </w:tr>
-      <w:tr>
-        <w:tc>
-          <w:tcPr/>
-          <w:p>
-            <w:pPr>
-              <w:pStyle w:val="Compact"/>
-              <w:jc w:val="left"/>
-            </w:pPr>
-            <w:r>
-              <w:rPr>
-                <w:b/>
-                <w:sz w:val="19"/>
-              </w:rPr>
-              <w:t xml:space="preserve">Gunslinger</w:t>
+              <w:t xml:space="preserve">In the first round of a gunfight, you act first, whatever your Agility.</w:t>
+            </w:r>
+          </w:p>
+        </w:tc>
+      </w:tr>
+      <w:tr>
+        <w:tc>
+          <w:tcPr/>
+          <w:p>
+            <w:pPr>
+              <w:pStyle w:val="Compact"/>
+              <w:jc w:val="left"/>
+            </w:pPr>
+            <w:r>
+              <w:rPr>
+                <w:b/>
+                <w:sz w:val="19"/>
+              </w:rPr>
+              <w:t xml:space="preserve">Scout</w:t>
             </w:r>
           </w:p>
         </w:tc>
@@ -1174,22 +1358,22 @@
               <w:rPr>
                 <w:sz w:val="19"/>
               </w:rPr>
-              <w:t xml:space="preserve">the fastest and steadiest gun in the room, and the one who decides when it’s time to draw.</w:t>
-            </w:r>
-          </w:p>
-        </w:tc>
-        <w:tc>
-          <w:tcPr/>
-          <w:p>
-            <w:pPr>
-              <w:pStyle w:val="Compact"/>
-              <w:jc w:val="left"/>
-            </w:pPr>
-            <w:r>
-              <w:rPr>
-                <w:sz w:val="19"/>
-              </w:rPr>
-              <w:t xml:space="preserve">Shooting, Riding, Read People, Athletics</w:t>
+              <w:t xml:space="preserve">finds the trail, reads the land, and keeps everyone alive out in it.</w:t>
+            </w:r>
+          </w:p>
+        </w:tc>
+        <w:tc>
+          <w:tcPr/>
+          <w:p>
+            <w:pPr>
+              <w:pStyle w:val="Compact"/>
+              <w:jc w:val="left"/>
+            </w:pPr>
+            <w:r>
+              <w:rPr>
+                <w:sz w:val="19"/>
+              </w:rPr>
+              <w:t xml:space="preserve">Melee, Tracking, Persuasion, Survival</w:t>
             </w:r>
           </w:p>
         </w:tc>
@@ -1206,7 +1390,7 @@
                 <w:b/>
                 <w:sz w:val="19"/>
               </w:rPr>
-              <w:t xml:space="preserve">Quick draw.</w:t>
+              <w:t xml:space="preserve">Lay of the land.</w:t>
             </w:r>
             <w:r>
               <w:rPr>
@@ -1218,25 +1402,25 @@
               <w:rPr>
                 <w:sz w:val="19"/>
               </w:rPr>
-              <w:t xml:space="preserve">In the first round of a gunfight, you act first, whatever your Agility.</w:t>
-            </w:r>
-          </w:p>
-        </w:tc>
-      </w:tr>
-      <w:tr>
-        <w:tc>
-          <w:tcPr/>
-          <w:p>
-            <w:pPr>
-              <w:pStyle w:val="Compact"/>
-              <w:jc w:val="left"/>
-            </w:pPr>
-            <w:r>
-              <w:rPr>
-                <w:b/>
-                <w:sz w:val="19"/>
-              </w:rPr>
-              <w:t xml:space="preserve">Scout</w:t>
+              <w:t xml:space="preserve">Once per job, you know a way: a hidden pass, a water hole, a shortcut that saves a day, or a place to make a stand.</w:t>
+            </w:r>
+          </w:p>
+        </w:tc>
+      </w:tr>
+      <w:tr>
+        <w:tc>
+          <w:tcPr/>
+          <w:p>
+            <w:pPr>
+              <w:pStyle w:val="Compact"/>
+              <w:jc w:val="left"/>
+            </w:pPr>
+            <w:r>
+              <w:rPr>
+                <w:b/>
+                <w:sz w:val="19"/>
+              </w:rPr>
+              <w:t xml:space="preserve">Gambler</w:t>
             </w:r>
           </w:p>
         </w:tc>
@@ -1266,22 +1450,22 @@
               <w:rPr>
                 <w:sz w:val="19"/>
               </w:rPr>
-              <w:t xml:space="preserve">finds the trail, reads the land, and keeps everyone alive out in it.</w:t>
-            </w:r>
-          </w:p>
-        </w:tc>
-        <w:tc>
-          <w:tcPr/>
-          <w:p>
-            <w:pPr>
-              <w:pStyle w:val="Compact"/>
-              <w:jc w:val="left"/>
-            </w:pPr>
-            <w:r>
-              <w:rPr>
-                <w:sz w:val="19"/>
-              </w:rPr>
-              <w:t xml:space="preserve">Melee, Tracking, Persuasion, Survival</w:t>
+              <w:t xml:space="preserve">reads people, bluffs, and hears everything the saloon hears.</w:t>
+            </w:r>
+          </w:p>
+        </w:tc>
+        <w:tc>
+          <w:tcPr/>
+          <w:p>
+            <w:pPr>
+              <w:pStyle w:val="Compact"/>
+              <w:jc w:val="left"/>
+            </w:pPr>
+            <w:r>
+              <w:rPr>
+                <w:sz w:val="19"/>
+              </w:rPr>
+              <w:t xml:space="preserve">Shooting, Stealth, Deception, Gambling</w:t>
             </w:r>
           </w:p>
         </w:tc>
@@ -1298,7 +1482,7 @@
                 <w:b/>
                 <w:sz w:val="19"/>
               </w:rPr>
-              <w:t xml:space="preserve">Lay of the land.</w:t>
+              <w:t xml:space="preserve">Markers.</w:t>
             </w:r>
             <w:r>
               <w:rPr>
@@ -1310,25 +1494,25 @@
               <w:rPr>
                 <w:sz w:val="19"/>
               </w:rPr>
-              <w:t xml:space="preserve">Once per job, you know a way: a hidden pass, a water hole, a shortcut that saves a day, or a place to make a stand.</w:t>
-            </w:r>
-          </w:p>
-        </w:tc>
-      </w:tr>
-      <w:tr>
-        <w:tc>
-          <w:tcPr/>
-          <w:p>
-            <w:pPr>
-              <w:pStyle w:val="Compact"/>
-              <w:jc w:val="left"/>
-            </w:pPr>
-            <w:r>
-              <w:rPr>
-                <w:b/>
-                <w:sz w:val="19"/>
-              </w:rPr>
-              <w:t xml:space="preserve">Gambler</w:t>
+              <w:t xml:space="preserve">Once per job, call in a debt: someone owes you a favor, a horse, a room or the truth.</w:t>
+            </w:r>
+          </w:p>
+        </w:tc>
+      </w:tr>
+      <w:tr>
+        <w:tc>
+          <w:tcPr/>
+          <w:p>
+            <w:pPr>
+              <w:pStyle w:val="Compact"/>
+              <w:jc w:val="left"/>
+            </w:pPr>
+            <w:r>
+              <w:rPr>
+                <w:b/>
+                <w:sz w:val="19"/>
+              </w:rPr>
+              <w:t xml:space="preserve">Wrangler</w:t>
             </w:r>
           </w:p>
         </w:tc>
@@ -1358,22 +1542,22 @@
               <w:rPr>
                 <w:sz w:val="19"/>
               </w:rPr>
-              <w:t xml:space="preserve">reads people, bluffs, and hears everything the saloon hears.</w:t>
-            </w:r>
-          </w:p>
-        </w:tc>
-        <w:tc>
-          <w:tcPr/>
-          <w:p>
-            <w:pPr>
-              <w:pStyle w:val="Compact"/>
-              <w:jc w:val="left"/>
-            </w:pPr>
-            <w:r>
-              <w:rPr>
-                <w:sz w:val="19"/>
-              </w:rPr>
-              <w:t xml:space="preserve">Shooting, Stealth, Deception, Gambling</w:t>
+              <w:t xml:space="preserve">breaks horses, drives cattle, and can ride anything with four legs.</w:t>
+            </w:r>
+          </w:p>
+        </w:tc>
+        <w:tc>
+          <w:tcPr/>
+          <w:p>
+            <w:pPr>
+              <w:pStyle w:val="Compact"/>
+              <w:jc w:val="left"/>
+            </w:pPr>
+            <w:r>
+              <w:rPr>
+                <w:sz w:val="19"/>
+              </w:rPr>
+              <w:t xml:space="preserve">Brawling, Animal Handling, Leadership, Tinkering</w:t>
             </w:r>
           </w:p>
         </w:tc>
@@ -1390,7 +1574,7 @@
                 <w:b/>
                 <w:sz w:val="19"/>
               </w:rPr>
-              <w:t xml:space="preserve">Markers.</w:t>
+              <w:t xml:space="preserve">Horse sense.</w:t>
             </w:r>
             <w:r>
               <w:rPr>
@@ -1402,25 +1586,25 @@
               <w:rPr>
                 <w:sz w:val="19"/>
               </w:rPr>
-              <w:t xml:space="preserve">Once per job, call in a debt: someone owes you a favor, a horse, a room or the truth.</w:t>
-            </w:r>
-          </w:p>
-        </w:tc>
-      </w:tr>
-      <w:tr>
-        <w:tc>
-          <w:tcPr/>
-          <w:p>
-            <w:pPr>
-              <w:pStyle w:val="Compact"/>
-              <w:jc w:val="left"/>
-            </w:pPr>
-            <w:r>
-              <w:rPr>
-                <w:b/>
-                <w:sz w:val="19"/>
-              </w:rPr>
-              <w:t xml:space="preserve">Wrangler</w:t>
+              <w:t xml:space="preserve">+2 to Animal Handling, and to Riding to stay in the saddle in a stampede, a chase or a fall.</w:t>
+            </w:r>
+          </w:p>
+        </w:tc>
+      </w:tr>
+      <w:tr>
+        <w:tc>
+          <w:tcPr/>
+          <w:p>
+            <w:pPr>
+              <w:pStyle w:val="Compact"/>
+              <w:jc w:val="left"/>
+            </w:pPr>
+            <w:r>
+              <w:rPr>
+                <w:b/>
+                <w:sz w:val="19"/>
+              </w:rPr>
+              <w:t xml:space="preserve">Undertaker</w:t>
             </w:r>
           </w:p>
         </w:tc>
@@ -1450,22 +1634,22 @@
               <w:rPr>
                 <w:sz w:val="19"/>
               </w:rPr>
-              <w:t xml:space="preserve">breaks horses, drives cattle, and can ride anything with four legs.</w:t>
-            </w:r>
-          </w:p>
-        </w:tc>
-        <w:tc>
-          <w:tcPr/>
-          <w:p>
-            <w:pPr>
-              <w:pStyle w:val="Compact"/>
-              <w:jc w:val="left"/>
-            </w:pPr>
-            <w:r>
-              <w:rPr>
-                <w:sz w:val="19"/>
-              </w:rPr>
-              <w:t xml:space="preserve">Brawling, Animal Handling, Leadership, Tinkering</w:t>
+              <w:t xml:space="preserve">buries the dead, and makes sure they stay buried.</w:t>
+            </w:r>
+          </w:p>
+        </w:tc>
+        <w:tc>
+          <w:tcPr/>
+          <w:p>
+            <w:pPr>
+              <w:pStyle w:val="Compact"/>
+              <w:jc w:val="left"/>
+            </w:pPr>
+            <w:r>
+              <w:rPr>
+                <w:sz w:val="19"/>
+              </w:rPr>
+              <w:t xml:space="preserve">Melee, Stealth, Persuasion, Medicine</w:t>
             </w:r>
           </w:p>
         </w:tc>
@@ -1482,7 +1666,7 @@
                 <w:b/>
                 <w:sz w:val="19"/>
               </w:rPr>
-              <w:t xml:space="preserve">Horse sense.</w:t>
+              <w:t xml:space="preserve">Ask the body.</w:t>
             </w:r>
             <w:r>
               <w:rPr>
@@ -1494,25 +1678,25 @@
               <w:rPr>
                 <w:sz w:val="19"/>
               </w:rPr>
-              <w:t xml:space="preserve">+2 to Animal Handling, and to Riding to stay in the saddle in a stampede, a chase or a fall.</w:t>
-            </w:r>
-          </w:p>
-        </w:tc>
-      </w:tr>
-      <w:tr>
-        <w:tc>
-          <w:tcPr/>
-          <w:p>
-            <w:pPr>
-              <w:pStyle w:val="Compact"/>
-              <w:jc w:val="left"/>
-            </w:pPr>
-            <w:r>
-              <w:rPr>
-                <w:b/>
-                <w:sz w:val="19"/>
-              </w:rPr>
-              <w:t xml:space="preserve">Undertaker</w:t>
+              <w:t xml:space="preserve">Once per job, examine a corpse and learn how and when it died, and one thing about who did it.</w:t>
+            </w:r>
+          </w:p>
+        </w:tc>
+      </w:tr>
+      <w:tr>
+        <w:tc>
+          <w:tcPr/>
+          <w:p>
+            <w:pPr>
+              <w:pStyle w:val="Compact"/>
+              <w:jc w:val="left"/>
+            </w:pPr>
+            <w:r>
+              <w:rPr>
+                <w:b/>
+                <w:sz w:val="19"/>
+              </w:rPr>
+              <w:t xml:space="preserve">Shotgun Messenger</w:t>
             </w:r>
           </w:p>
         </w:tc>
@@ -1542,22 +1726,22 @@
               <w:rPr>
                 <w:sz w:val="19"/>
               </w:rPr>
-              <w:t xml:space="preserve">buries the dead, and makes sure they stay buried.</w:t>
-            </w:r>
-          </w:p>
-        </w:tc>
-        <w:tc>
-          <w:tcPr/>
-          <w:p>
-            <w:pPr>
-              <w:pStyle w:val="Compact"/>
-              <w:jc w:val="left"/>
-            </w:pPr>
-            <w:r>
-              <w:rPr>
-                <w:sz w:val="19"/>
-              </w:rPr>
-              <w:t xml:space="preserve">Melee, Stealth, Persuasion, Medicine</w:t>
+              <w:t xml:space="preserve">rides beside the driver guarding the mail, the strongbox and the passengers.</w:t>
+            </w:r>
+          </w:p>
+        </w:tc>
+        <w:tc>
+          <w:tcPr/>
+          <w:p>
+            <w:pPr>
+              <w:pStyle w:val="Compact"/>
+              <w:jc w:val="left"/>
+            </w:pPr>
+            <w:r>
+              <w:rPr>
+                <w:sz w:val="19"/>
+              </w:rPr>
+              <w:t xml:space="preserve">Shooting, Animal Handling, Persuasion, Survival</w:t>
             </w:r>
           </w:p>
         </w:tc>
@@ -1574,7 +1758,7 @@
                 <w:b/>
                 <w:sz w:val="19"/>
               </w:rPr>
-              <w:t xml:space="preserve">Ask the body.</w:t>
+              <w:t xml:space="preserve">Riding shotgun.</w:t>
             </w:r>
             <w:r>
               <w:rPr>
@@ -1586,7 +1770,7 @@
               <w:rPr>
                 <w:sz w:val="19"/>
               </w:rPr>
-              <w:t xml:space="preserve">Once per job, examine a corpse and learn how and when it died, and one thing about who did it.</w:t>
+              <w:t xml:space="preserve">Once per fight, when someone next to you is hit, you take the hit instead.</w:t>
             </w:r>
           </w:p>
         </w:tc>

</xml_diff>

<commit_message>
Rebuild the website with the Politician
Co-Authored-By: Claude Opus 5.5 <noreply@anthropic.com>
Claude-Session: https://claude.ai/code/session_015SADCFzhKijkC2foUmXrpC
</commit_message>
<xml_diff>
--- a/legend-dynamics/site/trails-of-blood-and-dust/Trails_of_Blood_Dust_Players_Guide.docx
+++ b/legend-dynamics/site/trails-of-blood-and-dust/Trails_of_Blood_Dust_Players_Guide.docx
@@ -759,6 +759,98 @@
                 <w:sz w:val="19"/>
               </w:rPr>
               <w:t xml:space="preserve">+2 to Read People to catch a lie told to your face.</w:t>
+            </w:r>
+          </w:p>
+        </w:tc>
+      </w:tr>
+      <w:tr>
+        <w:tc>
+          <w:tcPr/>
+          <w:p>
+            <w:pPr>
+              <w:pStyle w:val="Compact"/>
+              <w:jc w:val="left"/>
+            </w:pPr>
+            <w:r>
+              <w:rPr>
+                <w:b/>
+                <w:sz w:val="19"/>
+              </w:rPr>
+              <w:t xml:space="preserve">Politician</w:t>
+            </w:r>
+          </w:p>
+        </w:tc>
+        <w:tc>
+          <w:tcPr/>
+          <w:p>
+            <w:pPr>
+              <w:pStyle w:val="Compact"/>
+              <w:jc w:val="left"/>
+            </w:pPr>
+            <w:r>
+              <w:rPr>
+                <w:sz w:val="19"/>
+              </w:rPr>
+              <w:t xml:space="preserve">The Law</w:t>
+            </w:r>
+          </w:p>
+        </w:tc>
+        <w:tc>
+          <w:tcPr/>
+          <w:p>
+            <w:pPr>
+              <w:pStyle w:val="Compact"/>
+              <w:jc w:val="left"/>
+            </w:pPr>
+            <w:r>
+              <w:rPr>
+                <w:sz w:val="19"/>
+              </w:rPr>
+              <w:t xml:space="preserve">holds office or wants it: a mayor, an alderman, a territorial delegate, a governor’s man, or a party boss with friends in the capital.</w:t>
+            </w:r>
+          </w:p>
+        </w:tc>
+        <w:tc>
+          <w:tcPr/>
+          <w:p>
+            <w:pPr>
+              <w:pStyle w:val="Compact"/>
+              <w:jc w:val="left"/>
+            </w:pPr>
+            <w:r>
+              <w:rPr>
+                <w:sz w:val="19"/>
+              </w:rPr>
+              <w:t xml:space="preserve">Investigation, Riding, Leadership, Law</w:t>
+            </w:r>
+          </w:p>
+        </w:tc>
+        <w:tc>
+          <w:tcPr/>
+          <w:p>
+            <w:pPr>
+              <w:pStyle w:val="Compact"/>
+              <w:jc w:val="left"/>
+            </w:pPr>
+            <w:r>
+              <w:rPr>
+                <w:bCs/>
+                <w:b/>
+                <w:sz w:val="19"/>
+              </w:rPr>
+              <w:t xml:space="preserve">Friends in office.</w:t>
+            </w:r>
+            <w:r>
+              <w:rPr>
+                <w:sz w:val="19"/>
+              </w:rPr>
+              <w:t xml:space="preserve"> </w:t>
+            </w:r>
+            <w:r>
+              <w:rPr>
+                <w:sz w:val="19"/>
+              </w:rPr>
+              <w:t xml:space="preserve">Once per job, the town or territory gives you what it can: rooms at the hotel, horses for a posse, the jail cells, the telegraph office, or the doctor’s time.</w:t>
             </w:r>
           </w:p>
         </w:tc>

</xml_diff>

<commit_message>
Battle map: a stagecoach chase for Trails of Blood & Dust
A setting can now have several range tracks, each with its own tokens and
picture. Trails adds a Stagecoach chase beside the plain range track: the
coach has the first lane and its own Coach boxes with what each one does,
and the riders close or fall back a band at a time. The rules are a new
Stagecoach chases section in the Players' Guide.

Co-Authored-By: Claude Opus 5.5 <noreply@anthropic.com>
Claude-Session: https://claude.ai/code/session_015SADCFzhKijkC2foUmXrpC
</commit_message>
<xml_diff>
--- a/legend-dynamics/site/trails-of-blood-and-dust/Trails_of_Blood_Dust_Players_Guide.docx
+++ b/legend-dynamics/site/trails-of-blood-and-dust/Trails_of_Blood_Dust_Players_Guide.docx
@@ -7804,7 +7804,7 @@
     </w:p>
     <w:bookmarkEnd w:id="48"/>
     <w:bookmarkEnd w:id="49"/>
-    <w:bookmarkStart w:id="61" w:name="personal-combat"/>
+    <w:bookmarkStart w:id="62" w:name="personal-combat"/>
     <w:p>
       <w:pPr>
         <w:pStyle w:val="Heading1"/>
@@ -8034,7 +8034,7 @@
       </w:r>
     </w:p>
     <w:bookmarkEnd w:id="51"/>
-    <w:bookmarkStart w:id="53" w:name="telling-hits"/>
+    <w:bookmarkStart w:id="54" w:name="telling-hits"/>
     <w:p>
       <w:pPr>
         <w:pStyle w:val="Heading2"/>
@@ -8614,8 +8614,378 @@
       </w:r>
     </w:p>
     <w:bookmarkEnd w:id="52"/>
+    <w:bookmarkStart w:id="53" w:name="stagecoach-chases"/>
+    <w:p>
+      <w:pPr>
+        <w:pStyle w:val="Heading3"/>
+      </w:pPr>
+      <w:r>
+        <w:t xml:space="preserve">Stagecoach chases</w:t>
+      </w:r>
+    </w:p>
+    <w:p>
+      <w:pPr>
+        <w:pStyle w:val="FirstParagraph"/>
+      </w:pPr>
+      <w:r>
+        <w:t xml:space="preserve">A coach on the road with riders closing in is a chase where distance is everything. Run it on the battle map’s</w:t>
+      </w:r>
+      <w:r>
+        <w:t xml:space="preserve"> </w:t>
+      </w:r>
+      <w:r>
+        <w:rPr>
+          <w:bCs/>
+          <w:b/>
+        </w:rPr>
+        <w:t xml:space="preserve">Stagecoach chase</w:t>
+      </w:r>
+      <w:r>
+        <w:t xml:space="preserve"> </w:t>
+      </w:r>
+      <w:r>
+        <w:t xml:space="preserve">track, in the GM view, instead of the chase clocks.</w:t>
+      </w:r>
+    </w:p>
+    <w:p>
+      <w:pPr>
+        <w:numPr>
+          <w:ilvl w:val="0"/>
+          <w:numId w:val="1011"/>
+        </w:numPr>
+        <w:pStyle w:val="Compact"/>
+      </w:pPr>
+      <w:r>
+        <w:rPr>
+          <w:bCs/>
+          <w:b/>
+        </w:rPr>
+        <w:t xml:space="preserve">The lanes.</w:t>
+      </w:r>
+      <w:r>
+        <w:t xml:space="preserve"> </w:t>
+      </w:r>
+      <w:r>
+        <w:t xml:space="preserve">The stagecoach has its own lane, and each rider stands in a range band from it: Close (alongside), Short, Medium, Long or Extreme. Riders usually start at Medium or Long.</w:t>
+      </w:r>
+    </w:p>
+    <w:p>
+      <w:pPr>
+        <w:numPr>
+          <w:ilvl w:val="0"/>
+          <w:numId w:val="1011"/>
+        </w:numPr>
+        <w:pStyle w:val="Compact"/>
+      </w:pPr>
+      <w:r>
+        <w:rPr>
+          <w:bCs/>
+          <w:b/>
+        </w:rPr>
+        <w:t xml:space="preserve">Each exchange.</w:t>
+      </w:r>
+      <w:r>
+        <w:t xml:space="preserve"> </w:t>
+      </w:r>
+      <w:r>
+        <w:t xml:space="preserve">The driver rolls Riding against each rider’s Riding (11 for a threat without it). The winner moves that rider one band: closer if the rider won, farther if the driver did. A tie leaves it where it is, and a rider pushed past Extreme drops out of the chase. A fresh horse or a good road gives +2; rough ground or a tired team gives −2.</w:t>
+      </w:r>
+    </w:p>
+    <w:p>
+      <w:pPr>
+        <w:numPr>
+          <w:ilvl w:val="0"/>
+          <w:numId w:val="1011"/>
+        </w:numPr>
+        <w:pStyle w:val="Compact"/>
+      </w:pPr>
+      <w:r>
+        <w:rPr>
+          <w:bCs/>
+          <w:b/>
+        </w:rPr>
+        <w:t xml:space="preserve">Fighting on the move.</w:t>
+      </w:r>
+      <w:r>
+        <w:t xml:space="preserve"> </w:t>
+      </w:r>
+      <w:r>
+        <w:t xml:space="preserve">Everyone else acts as usual. Shooting from the box, the roof or the saddle is at −2, on top of the range penalty. At Close, a rider can board with an Athletics roll, and then it is fists, knives and shotguns at arm’s length. A passenger can climb out to the box or onto the roof as their move.</w:t>
+      </w:r>
+    </w:p>
+    <w:p>
+      <w:pPr>
+        <w:numPr>
+          <w:ilvl w:val="0"/>
+          <w:numId w:val="1011"/>
+        </w:numPr>
+        <w:pStyle w:val="Compact"/>
+      </w:pPr>
+      <w:r>
+        <w:rPr>
+          <w:bCs/>
+          <w:b/>
+        </w:rPr>
+        <w:t xml:space="preserve">Hurting the coach.</w:t>
+      </w:r>
+      <w:r>
+        <w:t xml:space="preserve"> </w:t>
+      </w:r>
+      <w:r>
+        <w:t xml:space="preserve">A hit aimed at the team or a wheel (a called shot, −2) marks one box on the coach’s track. Dynamite, a crash, or a driver who fails by 5 or more on rough ground marks one more.</w:t>
+      </w:r>
+    </w:p>
+    <w:p>
+      <w:pPr>
+        <w:numPr>
+          <w:ilvl w:val="0"/>
+          <w:numId w:val="1011"/>
+        </w:numPr>
+        <w:pStyle w:val="Compact"/>
+      </w:pPr>
+      <w:r>
+        <w:rPr>
+          <w:bCs/>
+          <w:b/>
+        </w:rPr>
+        <w:t xml:space="preserve">The driver goes down.</w:t>
+      </w:r>
+      <w:r>
+        <w:t xml:space="preserve"> </w:t>
+      </w:r>
+      <w:r>
+        <w:t xml:space="preserve">If the driver is Incapacitated or knocked from the box, the team bolts. Someone must reach the box and take the reins (Riding −2) before the next exchange, or the coach marks a box.</w:t>
+      </w:r>
+    </w:p>
+    <w:tbl>
+      <w:tblPr>
+        <w:tblStyle w:val="Table"/>
+        <w:tblW w:type="pct" w:w="5000"/>
+        <w:tblLook w:firstRow="1" w:lastRow="0" w:firstColumn="0" w:lastColumn="0" w:noHBand="0" w:noVBand="0" w:val="0020"/>
+        <w:jc w:val="start"/>
+        <w:tblBorders>
+          <w:top w:val="single" w:sz="4" w:color="B8C2D3"/>
+          <w:left w:val="single" w:sz="4" w:color="B8C2D3"/>
+          <w:bottom w:val="single" w:sz="4" w:color="B8C2D3"/>
+          <w:right w:val="single" w:sz="4" w:color="B8C2D3"/>
+          <w:insideH w:val="single" w:sz="4" w:color="B8C2D3"/>
+          <w:insideV w:val="single" w:sz="4" w:color="B8C2D3"/>
+        </w:tblBorders>
+      </w:tblPr>
+      <w:tblGrid>
+        <w:gridCol w:w="3960"/>
+        <w:gridCol w:w="3960"/>
+      </w:tblGrid>
+      <w:tr>
+        <w:trPr>
+          <w:tblHeader w:val="true"/>
+        </w:trPr>
+        <w:tc>
+          <w:tcPr>
+            <w:shd w:val="clear" w:fill="E6E8E6"/>
+          </w:tcPr>
+          <w:p>
+            <w:pPr>
+              <w:pStyle w:val="Compact"/>
+              <w:jc w:val="left"/>
+            </w:pPr>
+            <w:r>
+              <w:rPr>
+                <w:b/>
+                <w:sz w:val="19"/>
+              </w:rPr>
+              <w:t xml:space="preserve">Boxes</w:t>
+            </w:r>
+          </w:p>
+        </w:tc>
+        <w:tc>
+          <w:tcPr>
+            <w:shd w:val="clear" w:fill="E6E8E6"/>
+          </w:tcPr>
+          <w:p>
+            <w:pPr>
+              <w:pStyle w:val="Compact"/>
+              <w:jc w:val="left"/>
+            </w:pPr>
+            <w:r>
+              <w:rPr>
+                <w:b/>
+                <w:sz w:val="19"/>
+              </w:rPr>
+              <w:t xml:space="preserve">The coach</w:t>
+            </w:r>
+          </w:p>
+        </w:tc>
+      </w:tr>
+      <w:tr>
+        <w:tc>
+          <w:tcPr/>
+          <w:p>
+            <w:pPr>
+              <w:pStyle w:val="Compact"/>
+              <w:jc w:val="left"/>
+            </w:pPr>
+            <w:r>
+              <w:rPr>
+                <w:b/>
+                <w:sz w:val="19"/>
+              </w:rPr>
+              <w:t xml:space="preserve">0</w:t>
+            </w:r>
+          </w:p>
+        </w:tc>
+        <w:tc>
+          <w:tcPr/>
+          <w:p>
+            <w:pPr>
+              <w:pStyle w:val="Compact"/>
+              <w:jc w:val="left"/>
+            </w:pPr>
+            <w:r>
+              <w:rPr>
+                <w:sz w:val="19"/>
+              </w:rPr>
+              <w:t xml:space="preserve">Rolling: no damage</w:t>
+            </w:r>
+          </w:p>
+        </w:tc>
+      </w:tr>
+      <w:tr>
+        <w:tc>
+          <w:tcPr/>
+          <w:p>
+            <w:pPr>
+              <w:pStyle w:val="Compact"/>
+              <w:jc w:val="left"/>
+            </w:pPr>
+            <w:r>
+              <w:rPr>
+                <w:b/>
+                <w:sz w:val="19"/>
+              </w:rPr>
+              <w:t xml:space="preserve">1</w:t>
+            </w:r>
+          </w:p>
+        </w:tc>
+        <w:tc>
+          <w:tcPr/>
+          <w:p>
+            <w:pPr>
+              <w:pStyle w:val="Compact"/>
+              <w:jc w:val="left"/>
+            </w:pPr>
+            <w:r>
+              <w:rPr>
+                <w:sz w:val="19"/>
+              </w:rPr>
+              <w:t xml:space="preserve">Holed: splinters and bullet holes; no penalty yet</w:t>
+            </w:r>
+          </w:p>
+        </w:tc>
+      </w:tr>
+      <w:tr>
+        <w:tc>
+          <w:tcPr/>
+          <w:p>
+            <w:pPr>
+              <w:pStyle w:val="Compact"/>
+              <w:jc w:val="left"/>
+            </w:pPr>
+            <w:r>
+              <w:rPr>
+                <w:b/>
+                <w:sz w:val="19"/>
+              </w:rPr>
+              <w:t xml:space="preserve">2</w:t>
+            </w:r>
+          </w:p>
+        </w:tc>
+        <w:tc>
+          <w:tcPr/>
+          <w:p>
+            <w:pPr>
+              <w:pStyle w:val="Compact"/>
+              <w:jc w:val="left"/>
+            </w:pPr>
+            <w:r>
+              <w:rPr>
+                <w:sz w:val="19"/>
+              </w:rPr>
+              <w:t xml:space="preserve">A horse hit or a wheel cracked: −2 to the driver’s Riding</w:t>
+            </w:r>
+          </w:p>
+        </w:tc>
+      </w:tr>
+      <w:tr>
+        <w:tc>
+          <w:tcPr/>
+          <w:p>
+            <w:pPr>
+              <w:pStyle w:val="Compact"/>
+              <w:jc w:val="left"/>
+            </w:pPr>
+            <w:r>
+              <w:rPr>
+                <w:b/>
+                <w:sz w:val="19"/>
+              </w:rPr>
+              <w:t xml:space="preserve">3</w:t>
+            </w:r>
+          </w:p>
+        </w:tc>
+        <w:tc>
+          <w:tcPr/>
+          <w:p>
+            <w:pPr>
+              <w:pStyle w:val="Compact"/>
+              <w:jc w:val="left"/>
+            </w:pPr>
+            <w:r>
+              <w:rPr>
+                <w:sz w:val="19"/>
+              </w:rPr>
+              <w:t xml:space="preserve">Lamed: −4 to the driver’s Riding, and riders close on a tie</w:t>
+            </w:r>
+          </w:p>
+        </w:tc>
+      </w:tr>
+      <w:tr>
+        <w:tc>
+          <w:tcPr/>
+          <w:p>
+            <w:pPr>
+              <w:pStyle w:val="Compact"/>
+              <w:jc w:val="left"/>
+            </w:pPr>
+            <w:r>
+              <w:rPr>
+                <w:b/>
+                <w:sz w:val="19"/>
+              </w:rPr>
+              <w:t xml:space="preserve">4</w:t>
+            </w:r>
+          </w:p>
+        </w:tc>
+        <w:tc>
+          <w:tcPr/>
+          <w:p>
+            <w:pPr>
+              <w:pStyle w:val="Compact"/>
+              <w:jc w:val="left"/>
+            </w:pPr>
+            <w:r>
+              <w:rPr>
+                <w:sz w:val="19"/>
+              </w:rPr>
+              <w:t xml:space="preserve">Wrecked: the coach overturns or stops dead; everyone aboard rolls Athletics or marks a box of Injury</w:t>
+            </w:r>
+          </w:p>
+        </w:tc>
+      </w:tr>
+    </w:tbl>
     <w:bookmarkEnd w:id="53"/>
-    <w:bookmarkStart w:id="54" w:name="range"/>
+    <w:bookmarkEnd w:id="54"/>
+    <w:bookmarkStart w:id="55" w:name="range"/>
     <w:p>
       <w:pPr>
         <w:pStyle w:val="Heading2"/>
@@ -8981,8 +9351,8 @@
         <w:t xml:space="preserve">Moving: your move each turn covers the Close band. Give up your action to run and you cover Short instead.</w:t>
       </w:r>
     </w:p>
-    <w:bookmarkEnd w:id="54"/>
-    <w:bookmarkStart w:id="57" w:name="injury"/>
+    <w:bookmarkEnd w:id="55"/>
+    <w:bookmarkStart w:id="58" w:name="injury"/>
     <w:p>
       <w:pPr>
         <w:pStyle w:val="Heading2"/>
@@ -9271,239 +9641,13 @@
         <w:t xml:space="preserve">Injury penalties replace each other rather than stacking. They apply to movement, attacks, Dodge, and other tasks the injury physically hinders.</w:t>
       </w:r>
     </w:p>
-    <w:bookmarkStart w:id="55" w:name="dying-and-death"/>
+    <w:bookmarkStart w:id="56" w:name="dying-and-death"/>
     <w:p>
       <w:pPr>
         <w:pStyle w:val="Heading3"/>
       </w:pPr>
       <w:r>
         <w:t xml:space="preserve">Dying and death</w:t>
-      </w:r>
-    </w:p>
-    <w:p>
-      <w:pPr>
-        <w:numPr>
-          <w:ilvl w:val="0"/>
-          <w:numId w:val="1011"/>
-        </w:numPr>
-        <w:pStyle w:val="Compact"/>
-      </w:pPr>
-      <w:r>
-        <w:rPr>
-          <w:bCs/>
-          <w:b/>
-        </w:rPr>
-        <w:t xml:space="preserve">Dying.</w:t>
-      </w:r>
-      <w:r>
-        <w:t xml:space="preserve"> </w:t>
-      </w:r>
-      <w:r>
-        <w:t xml:space="preserve">A hit from a weapon that marks</w:t>
-      </w:r>
-      <w:r>
-        <w:t xml:space="preserve"> </w:t>
-      </w:r>
-      <w:r>
-        <w:rPr>
-          <w:bCs/>
-          <w:b/>
-        </w:rPr>
-        <w:t xml:space="preserve">2 or more boxes</w:t>
-      </w:r>
-      <w:r>
-        <w:t xml:space="preserve"> </w:t>
-      </w:r>
-      <w:r>
-        <w:t xml:space="preserve">and brings you to three boxes leaves you Incapacitated and</w:t>
-      </w:r>
-      <w:r>
-        <w:t xml:space="preserve"> </w:t>
-      </w:r>
-      <w:r>
-        <w:rPr>
-          <w:bCs/>
-          <w:b/>
-        </w:rPr>
-        <w:t xml:space="preserve">Dying</w:t>
-      </w:r>
-      <w:r>
-        <w:t xml:space="preserve">. A Dying character dies at the end of the scene unless someone stabilizes them: one action and a successful Medicine roll with a doctor’s bag.</w:t>
-      </w:r>
-    </w:p>
-    <w:p>
-      <w:pPr>
-        <w:numPr>
-          <w:ilvl w:val="0"/>
-          <w:numId w:val="1011"/>
-        </w:numPr>
-        <w:pStyle w:val="Compact"/>
-      </w:pPr>
-      <w:r>
-        <w:rPr>
-          <w:bCs/>
-          <w:b/>
-        </w:rPr>
-        <w:t xml:space="preserve">A further hit.</w:t>
-      </w:r>
-      <w:r>
-        <w:t xml:space="preserve"> </w:t>
-      </w:r>
-      <w:r>
-        <w:t xml:space="preserve">While you are at three boxes, any hit from a weapon that marks 2 or more boxes kills you. Fists, clubs and knives just keep you down.</w:t>
-      </w:r>
-    </w:p>
-    <w:p>
-      <w:pPr>
-        <w:numPr>
-          <w:ilvl w:val="0"/>
-          <w:numId w:val="1011"/>
-        </w:numPr>
-        <w:pStyle w:val="Compact"/>
-      </w:pPr>
-      <w:r>
-        <w:rPr>
-          <w:bCs/>
-          <w:b/>
-        </w:rPr>
-        <w:t xml:space="preserve">Certain death.</w:t>
-      </w:r>
-      <w:r>
-        <w:t xml:space="preserve"> </w:t>
-      </w:r>
-      <w:r>
-        <w:t xml:space="preserve">Some fates (a fall into a furnace, a beheading, disintegration) bypass the track entirely.</w:t>
-      </w:r>
-    </w:p>
-    <w:p>
-      <w:pPr>
-        <w:pStyle w:val="FirstParagraph"/>
-      </w:pPr>
-      <w:r>
-        <w:t xml:space="preserve">Your protection is avoiding the hit: a defense (Dodge, Parry or Block), cover, and a Grit point, which reduces a hit by one box.</w:t>
-      </w:r>
-    </w:p>
-    <w:bookmarkEnd w:id="55"/>
-    <w:bookmarkStart w:id="56" w:name="optional-rule-gritty-combat"/>
-    <w:p>
-      <w:pPr>
-        <w:pStyle w:val="Heading3"/>
-      </w:pPr>
-      <w:r>
-        <w:t xml:space="preserve">Optional rule: gritty combat</w:t>
-      </w:r>
-    </w:p>
-    <w:p>
-      <w:pPr>
-        <w:pStyle w:val="FirstParagraph"/>
-      </w:pPr>
-      <w:r>
-        <w:t xml:space="preserve">For a harder, bloodier game, the GM can turn on</w:t>
-      </w:r>
-      <w:r>
-        <w:t xml:space="preserve"> </w:t>
-      </w:r>
-      <w:r>
-        <w:rPr>
-          <w:bCs/>
-          <w:b/>
-        </w:rPr>
-        <w:t xml:space="preserve">gritty combat</w:t>
-      </w:r>
-      <w:r>
-        <w:t xml:space="preserve"> </w:t>
-      </w:r>
-      <w:r>
-        <w:t xml:space="preserve">for the campaign (the creator has a switch on the Condition card and in the GM view). The rest of the rules stay the same.</w:t>
-      </w:r>
-    </w:p>
-    <w:p>
-      <w:pPr>
-        <w:pStyle w:val="BodyText"/>
-      </w:pPr>
-      <w:r>
-        <w:rPr>
-          <w:bCs/>
-          <w:b/>
-        </w:rPr>
-        <w:t xml:space="preserve">Grievous hits.</w:t>
-      </w:r>
-      <w:r>
-        <w:t xml:space="preserve"> </w:t>
-      </w:r>
-      <w:r>
-        <w:t xml:space="preserve">A hit that marks</w:t>
-      </w:r>
-      <w:r>
-        <w:t xml:space="preserve"> </w:t>
-      </w:r>
-      <w:r>
-        <w:rPr>
-          <w:bCs/>
-          <w:b/>
-        </w:rPr>
-        <w:t xml:space="preserve">2 or more boxes</w:t>
-      </w:r>
-      <w:r>
-        <w:t xml:space="preserve"> </w:t>
-      </w:r>
-      <w:r>
-        <w:t xml:space="preserve">is</w:t>
-      </w:r>
-      <w:r>
-        <w:t xml:space="preserve"> </w:t>
-      </w:r>
-      <w:r>
-        <w:rPr>
-          <w:bCs/>
-          <w:b/>
-        </w:rPr>
-        <w:t xml:space="preserve">grievous</w:t>
-      </w:r>
-      <w:r>
-        <w:t xml:space="preserve"> </w:t>
-      </w:r>
-      <w:r>
-        <w:t xml:space="preserve">when the attack succeeded by</w:t>
-      </w:r>
-      <w:r>
-        <w:t xml:space="preserve"> </w:t>
-      </w:r>
-      <w:r>
-        <w:rPr>
-          <w:bCs/>
-          <w:b/>
-        </w:rPr>
-        <w:t xml:space="preserve">7 or more</w:t>
-      </w:r>
-      <w:r>
-        <w:t xml:space="preserve">, rolled a</w:t>
-      </w:r>
-      <w:r>
-        <w:t xml:space="preserve"> </w:t>
-      </w:r>
-      <w:r>
-        <w:rPr>
-          <w:bCs/>
-          <w:b/>
-        </w:rPr>
-        <w:t xml:space="preserve">natural 3 or 4</w:t>
-      </w:r>
-      <w:r>
-        <w:t xml:space="preserve">, or left the target</w:t>
-      </w:r>
-      <w:r>
-        <w:t xml:space="preserve"> </w:t>
-      </w:r>
-      <w:r>
-        <w:rPr>
-          <w:bCs/>
-          <w:b/>
-        </w:rPr>
-        <w:t xml:space="preserve">Dying</w:t>
-      </w:r>
-      <w:r>
-        <w:t xml:space="preserve">.</w:t>
       </w:r>
     </w:p>
     <w:p>
@@ -9519,13 +9663,42 @@
           <w:bCs/>
           <w:b/>
         </w:rPr>
-        <w:t xml:space="preserve">A character</w:t>
-      </w:r>
-      <w:r>
-        <w:t xml:space="preserve"> </w:t>
-      </w:r>
-      <w:r>
-        <w:t xml:space="preserve">rolls 3d6 on the table below and suffers the result on top of the boxes.</w:t>
+        <w:t xml:space="preserve">Dying.</w:t>
+      </w:r>
+      <w:r>
+        <w:t xml:space="preserve"> </w:t>
+      </w:r>
+      <w:r>
+        <w:t xml:space="preserve">A hit from a weapon that marks</w:t>
+      </w:r>
+      <w:r>
+        <w:t xml:space="preserve"> </w:t>
+      </w:r>
+      <w:r>
+        <w:rPr>
+          <w:bCs/>
+          <w:b/>
+        </w:rPr>
+        <w:t xml:space="preserve">2 or more boxes</w:t>
+      </w:r>
+      <w:r>
+        <w:t xml:space="preserve"> </w:t>
+      </w:r>
+      <w:r>
+        <w:t xml:space="preserve">and brings you to three boxes leaves you Incapacitated and</w:t>
+      </w:r>
+      <w:r>
+        <w:t xml:space="preserve"> </w:t>
+      </w:r>
+      <w:r>
+        <w:rPr>
+          <w:bCs/>
+          <w:b/>
+        </w:rPr>
+        <w:t xml:space="preserve">Dying</w:t>
+      </w:r>
+      <w:r>
+        <w:t xml:space="preserve">. A Dying character dies at the end of the scene unless someone stabilizes them: one action and a successful Medicine roll with a doctor’s bag.</w:t>
       </w:r>
     </w:p>
     <w:p>
@@ -9541,13 +9714,13 @@
           <w:bCs/>
           <w:b/>
         </w:rPr>
-        <w:t xml:space="preserve">An opponent</w:t>
-      </w:r>
-      <w:r>
-        <w:t xml:space="preserve"> </w:t>
-      </w:r>
-      <w:r>
-        <w:t xml:space="preserve">is simply taken out: no roll, no boxes to count. Describe how, or let the GM view roll a description.</w:t>
+        <w:t xml:space="preserve">A further hit.</w:t>
+      </w:r>
+      <w:r>
+        <w:t xml:space="preserve"> </w:t>
+      </w:r>
+      <w:r>
+        <w:t xml:space="preserve">While you are at three boxes, any hit from a weapon that marks 2 or more boxes kills you. Fists, clubs and knives just keep you down.</w:t>
       </w:r>
     </w:p>
     <w:p>
@@ -9555,6 +9728,203 @@
         <w:numPr>
           <w:ilvl w:val="0"/>
           <w:numId w:val="1012"/>
+        </w:numPr>
+        <w:pStyle w:val="Compact"/>
+      </w:pPr>
+      <w:r>
+        <w:rPr>
+          <w:bCs/>
+          <w:b/>
+        </w:rPr>
+        <w:t xml:space="preserve">Certain death.</w:t>
+      </w:r>
+      <w:r>
+        <w:t xml:space="preserve"> </w:t>
+      </w:r>
+      <w:r>
+        <w:t xml:space="preserve">Some fates (a fall into a furnace, a beheading, disintegration) bypass the track entirely.</w:t>
+      </w:r>
+    </w:p>
+    <w:p>
+      <w:pPr>
+        <w:pStyle w:val="FirstParagraph"/>
+      </w:pPr>
+      <w:r>
+        <w:t xml:space="preserve">Your protection is avoiding the hit: a defense (Dodge, Parry or Block), cover, and a Grit point, which reduces a hit by one box.</w:t>
+      </w:r>
+    </w:p>
+    <w:bookmarkEnd w:id="56"/>
+    <w:bookmarkStart w:id="57" w:name="optional-rule-gritty-combat"/>
+    <w:p>
+      <w:pPr>
+        <w:pStyle w:val="Heading3"/>
+      </w:pPr>
+      <w:r>
+        <w:t xml:space="preserve">Optional rule: gritty combat</w:t>
+      </w:r>
+    </w:p>
+    <w:p>
+      <w:pPr>
+        <w:pStyle w:val="FirstParagraph"/>
+      </w:pPr>
+      <w:r>
+        <w:t xml:space="preserve">For a harder, bloodier game, the GM can turn on</w:t>
+      </w:r>
+      <w:r>
+        <w:t xml:space="preserve"> </w:t>
+      </w:r>
+      <w:r>
+        <w:rPr>
+          <w:bCs/>
+          <w:b/>
+        </w:rPr>
+        <w:t xml:space="preserve">gritty combat</w:t>
+      </w:r>
+      <w:r>
+        <w:t xml:space="preserve"> </w:t>
+      </w:r>
+      <w:r>
+        <w:t xml:space="preserve">for the campaign (the creator has a switch on the Condition card and in the GM view). The rest of the rules stay the same.</w:t>
+      </w:r>
+    </w:p>
+    <w:p>
+      <w:pPr>
+        <w:pStyle w:val="BodyText"/>
+      </w:pPr>
+      <w:r>
+        <w:rPr>
+          <w:bCs/>
+          <w:b/>
+        </w:rPr>
+        <w:t xml:space="preserve">Grievous hits.</w:t>
+      </w:r>
+      <w:r>
+        <w:t xml:space="preserve"> </w:t>
+      </w:r>
+      <w:r>
+        <w:t xml:space="preserve">A hit that marks</w:t>
+      </w:r>
+      <w:r>
+        <w:t xml:space="preserve"> </w:t>
+      </w:r>
+      <w:r>
+        <w:rPr>
+          <w:bCs/>
+          <w:b/>
+        </w:rPr>
+        <w:t xml:space="preserve">2 or more boxes</w:t>
+      </w:r>
+      <w:r>
+        <w:t xml:space="preserve"> </w:t>
+      </w:r>
+      <w:r>
+        <w:t xml:space="preserve">is</w:t>
+      </w:r>
+      <w:r>
+        <w:t xml:space="preserve"> </w:t>
+      </w:r>
+      <w:r>
+        <w:rPr>
+          <w:bCs/>
+          <w:b/>
+        </w:rPr>
+        <w:t xml:space="preserve">grievous</w:t>
+      </w:r>
+      <w:r>
+        <w:t xml:space="preserve"> </w:t>
+      </w:r>
+      <w:r>
+        <w:t xml:space="preserve">when the attack succeeded by</w:t>
+      </w:r>
+      <w:r>
+        <w:t xml:space="preserve"> </w:t>
+      </w:r>
+      <w:r>
+        <w:rPr>
+          <w:bCs/>
+          <w:b/>
+        </w:rPr>
+        <w:t xml:space="preserve">7 or more</w:t>
+      </w:r>
+      <w:r>
+        <w:t xml:space="preserve">, rolled a</w:t>
+      </w:r>
+      <w:r>
+        <w:t xml:space="preserve"> </w:t>
+      </w:r>
+      <w:r>
+        <w:rPr>
+          <w:bCs/>
+          <w:b/>
+        </w:rPr>
+        <w:t xml:space="preserve">natural 3 or 4</w:t>
+      </w:r>
+      <w:r>
+        <w:t xml:space="preserve">, or left the target</w:t>
+      </w:r>
+      <w:r>
+        <w:t xml:space="preserve"> </w:t>
+      </w:r>
+      <w:r>
+        <w:rPr>
+          <w:bCs/>
+          <w:b/>
+        </w:rPr>
+        <w:t xml:space="preserve">Dying</w:t>
+      </w:r>
+      <w:r>
+        <w:t xml:space="preserve">.</w:t>
+      </w:r>
+    </w:p>
+    <w:p>
+      <w:pPr>
+        <w:numPr>
+          <w:ilvl w:val="0"/>
+          <w:numId w:val="1013"/>
+        </w:numPr>
+        <w:pStyle w:val="Compact"/>
+      </w:pPr>
+      <w:r>
+        <w:rPr>
+          <w:bCs/>
+          <w:b/>
+        </w:rPr>
+        <w:t xml:space="preserve">A character</w:t>
+      </w:r>
+      <w:r>
+        <w:t xml:space="preserve"> </w:t>
+      </w:r>
+      <w:r>
+        <w:t xml:space="preserve">rolls 3d6 on the table below and suffers the result on top of the boxes.</w:t>
+      </w:r>
+    </w:p>
+    <w:p>
+      <w:pPr>
+        <w:numPr>
+          <w:ilvl w:val="0"/>
+          <w:numId w:val="1013"/>
+        </w:numPr>
+        <w:pStyle w:val="Compact"/>
+      </w:pPr>
+      <w:r>
+        <w:rPr>
+          <w:bCs/>
+          <w:b/>
+        </w:rPr>
+        <w:t xml:space="preserve">An opponent</w:t>
+      </w:r>
+      <w:r>
+        <w:t xml:space="preserve"> </w:t>
+      </w:r>
+      <w:r>
+        <w:t xml:space="preserve">is simply taken out: no roll, no boxes to count. Describe how, or let the GM view roll a description.</w:t>
+      </w:r>
+    </w:p>
+    <w:p>
+      <w:pPr>
+        <w:numPr>
+          <w:ilvl w:val="0"/>
+          <w:numId w:val="1013"/>
         </w:numPr>
         <w:pStyle w:val="Compact"/>
       </w:pPr>
@@ -10053,7 +10423,7 @@
       <w:pPr>
         <w:numPr>
           <w:ilvl w:val="0"/>
-          <w:numId w:val="1013"/>
+          <w:numId w:val="1014"/>
         </w:numPr>
         <w:pStyle w:val="Compact"/>
       </w:pPr>
@@ -10091,7 +10461,7 @@
       <w:pPr>
         <w:numPr>
           <w:ilvl w:val="0"/>
-          <w:numId w:val="1013"/>
+          <w:numId w:val="1014"/>
         </w:numPr>
         <w:pStyle w:val="Compact"/>
       </w:pPr>
@@ -10126,7 +10496,7 @@
       <w:pPr>
         <w:numPr>
           <w:ilvl w:val="0"/>
-          <w:numId w:val="1013"/>
+          <w:numId w:val="1014"/>
         </w:numPr>
         <w:pStyle w:val="Compact"/>
       </w:pPr>
@@ -10144,9 +10514,9 @@
         <w:t xml:space="preserve">Grievous wounds heal on their own clock, whatever the boxes say. A lost limb, a lost eye or a disfigurement never heals.</w:t>
       </w:r>
     </w:p>
-    <w:bookmarkEnd w:id="56"/>
     <w:bookmarkEnd w:id="57"/>
-    <w:bookmarkStart w:id="58" w:name="weapons-and-damage"/>
+    <w:bookmarkEnd w:id="58"/>
+    <w:bookmarkStart w:id="59" w:name="weapons-and-damage"/>
     <w:p>
       <w:pPr>
         <w:pStyle w:val="Heading2"/>
@@ -11264,8 +11634,8 @@
         <w:t xml:space="preserve">To take someone down without killing them, use fists, a club, a grapple, or a lasso.</w:t>
       </w:r>
     </w:p>
-    <w:bookmarkEnd w:id="58"/>
-    <w:bookmarkStart w:id="59" w:name="gun-and-rounds"/>
+    <w:bookmarkEnd w:id="59"/>
+    <w:bookmarkStart w:id="60" w:name="gun-and-rounds"/>
     <w:p>
       <w:pPr>
         <w:pStyle w:val="Heading2"/>
@@ -11744,7 +12114,7 @@
       <w:pPr>
         <w:numPr>
           <w:ilvl w:val="0"/>
-          <w:numId w:val="1014"/>
+          <w:numId w:val="1015"/>
         </w:numPr>
         <w:pStyle w:val="Compact"/>
       </w:pPr>
@@ -11760,112 +12130,6 @@
       </w:r>
       <w:r>
         <w:t xml:space="preserve">A Grit reroll repeats the same shot and costs nothing extra.</w:t>
-      </w:r>
-    </w:p>
-    <w:p>
-      <w:pPr>
-        <w:numPr>
-          <w:ilvl w:val="0"/>
-          <w:numId w:val="1014"/>
-        </w:numPr>
-        <w:pStyle w:val="Compact"/>
-      </w:pPr>
-      <w:r>
-        <w:rPr>
-          <w:bCs/>
-          <w:b/>
-        </w:rPr>
-        <w:t xml:space="preserve">Empty means it won’t work.</w:t>
-      </w:r>
-      <w:r>
-        <w:t xml:space="preserve"> </w:t>
-      </w:r>
-      <w:r>
-        <w:t xml:space="preserve">Reload (one action): refills it from a spare. Restock in town: refills it fully between jobs. Packing a spare is a good use of a Grit point’s small preparation.</w:t>
-      </w:r>
-    </w:p>
-    <w:p>
-      <w:pPr>
-        <w:numPr>
-          <w:ilvl w:val="0"/>
-          <w:numId w:val="1014"/>
-        </w:numPr>
-        <w:pStyle w:val="Compact"/>
-      </w:pPr>
-      <w:r>
-        <w:rPr>
-          <w:bCs/>
-          <w:b/>
-        </w:rPr>
-        <w:t xml:space="preserve">Jams.</w:t>
-      </w:r>
-      <w:r>
-        <w:t xml:space="preserve"> </w:t>
-      </w:r>
-      <w:r>
-        <w:t xml:space="preserve">A natural 18 with this weapon also jams it: clearing it takes an action.</w:t>
-      </w:r>
-    </w:p>
-    <w:bookmarkEnd w:id="59"/>
-    <w:bookmarkStart w:id="60" w:name="the-battle-map"/>
-    <w:p>
-      <w:pPr>
-        <w:pStyle w:val="Heading2"/>
-      </w:pPr>
-      <w:r>
-        <w:t xml:space="preserve">The battle map</w:t>
-      </w:r>
-    </w:p>
-    <w:p>
-      <w:pPr>
-        <w:pStyle w:val="FirstParagraph"/>
-      </w:pPr>
-      <w:r>
-        <w:t xml:space="preserve">The GM view of the character creator has a</w:t>
-      </w:r>
-      <w:r>
-        <w:t xml:space="preserve"> </w:t>
-      </w:r>
-      <w:r>
-        <w:rPr>
-          <w:bCs/>
-          <w:b/>
-        </w:rPr>
-        <w:t xml:space="preserve">battle map</w:t>
-      </w:r>
-      <w:r>
-        <w:t xml:space="preserve"> </w:t>
-      </w:r>
-      <w:r>
-        <w:t xml:space="preserve">for fights where it helps to see who is where. It is a tool, not a rule: everything on it follows the rules in this chapter, and a fight without it works the same way. Open</w:t>
-      </w:r>
-      <w:r>
-        <w:t xml:space="preserve"> </w:t>
-      </w:r>
-      <w:r>
-        <w:rPr>
-          <w:bCs/>
-          <w:b/>
-        </w:rPr>
-        <w:t xml:space="preserve">How to use the map</w:t>
-      </w:r>
-      <w:r>
-        <w:t xml:space="preserve"> </w:t>
-      </w:r>
-      <w:r>
-        <w:t xml:space="preserve">on the map itself for the buttons, step by step.</w:t>
-      </w:r>
-    </w:p>
-    <w:p>
-      <w:pPr>
-        <w:pStyle w:val="BodyText"/>
-      </w:pPr>
-      <w:r>
-        <w:rPr>
-          <w:bCs/>
-          <w:b/>
-        </w:rPr>
-        <w:t xml:space="preserve">Two kinds of map.</w:t>
       </w:r>
     </w:p>
     <w:p>
@@ -11881,26 +12145,13 @@
           <w:bCs/>
           <w:b/>
         </w:rPr>
-        <w:t xml:space="preserve">A hex map</w:t>
-      </w:r>
-      <w:r>
-        <w:t xml:space="preserve"> </w:t>
-      </w:r>
-      <w:r>
-        <w:t xml:space="preserve">for fights where position matters: cover, doorways, who can reach whom. The GM chooses what one hex is: 1 yard for a brawl in a room, 5 or 10 yards for a street, 50 for open ground. Dragging a token or measuring shows the distance and its</w:t>
-      </w:r>
-      <w:r>
-        <w:t xml:space="preserve"> </w:t>
-      </w:r>
-      <w:r>
-        <w:rPr>
-          <w:bCs/>
-          <w:b/>
-        </w:rPr>
-        <w:t xml:space="preserve">range band</w:t>
-      </w:r>
-      <w:r>
-        <w:t xml:space="preserve">, so the GM can read the penalty from the Range table above.</w:t>
+        <w:t xml:space="preserve">Empty means it won’t work.</w:t>
+      </w:r>
+      <w:r>
+        <w:t xml:space="preserve"> </w:t>
+      </w:r>
+      <w:r>
+        <w:t xml:space="preserve">Reload (one action): refills it from a spare. Restock in town: refills it fully between jobs. Packing a spare is a good use of a Grit point’s small preparation.</w:t>
       </w:r>
     </w:p>
     <w:p>
@@ -11916,58 +12167,177 @@
           <w:bCs/>
           <w:b/>
         </w:rPr>
-        <w:t xml:space="preserve">A range track</w:t>
-      </w:r>
-      <w:r>
-        <w:t xml:space="preserve"> </w:t>
-      </w:r>
-      <w:r>
-        <w:t xml:space="preserve">for fights where only distance matters: a chase, a running fight across open country. It has a lane for the posse and one for each range band. Moving a token into the next lane moves it one band in or out.</w:t>
+        <w:t xml:space="preserve">Jams.</w:t>
+      </w:r>
+      <w:r>
+        <w:t xml:space="preserve"> </w:t>
+      </w:r>
+      <w:r>
+        <w:t xml:space="preserve">A natural 18 with this weapon also jams it: clearing it takes an action.</w:t>
+      </w:r>
+    </w:p>
+    <w:bookmarkEnd w:id="60"/>
+    <w:bookmarkStart w:id="61" w:name="the-battle-map"/>
+    <w:p>
+      <w:pPr>
+        <w:pStyle w:val="Heading2"/>
+      </w:pPr>
+      <w:r>
+        <w:t xml:space="preserve">The battle map</w:t>
       </w:r>
     </w:p>
     <w:p>
       <w:pPr>
         <w:pStyle w:val="FirstParagraph"/>
       </w:pPr>
+      <w:r>
+        <w:t xml:space="preserve">The GM view of the character creator has a</w:t>
+      </w:r>
+      <w:r>
+        <w:t xml:space="preserve"> </w:t>
+      </w:r>
       <w:r>
         <w:rPr>
           <w:bCs/>
           <w:b/>
         </w:rPr>
-        <w:t xml:space="preserve">Tokens.</w:t>
-      </w:r>
-      <w:r>
-        <w:t xml:space="preserve"> </w:t>
-      </w:r>
-      <w:r>
-        <w:t xml:space="preserve">The GM places the posse with one button. Their tokens stay linked to the characters in the GM view: marking Injury, Dying, the stunned condition or a Grit point on a token marks it on the character, and the other way round. Opponents come from the setting’s threats with their boxes filled in. Their pips fill as they are hurt, and a token whose boxes are all marked is taken out.</w:t>
-      </w:r>
-    </w:p>
-    <w:p>
-      <w:pPr>
-        <w:pStyle w:val="BodyText"/>
-      </w:pPr>
+        <w:t xml:space="preserve">battle map</w:t>
+      </w:r>
+      <w:r>
+        <w:t xml:space="preserve"> </w:t>
+      </w:r>
+      <w:r>
+        <w:t xml:space="preserve">for fights where it helps to see who is where. It is a tool, not a rule: everything on it follows the rules in this chapter, and a fight without it works the same way. Open</w:t>
+      </w:r>
+      <w:r>
+        <w:t xml:space="preserve"> </w:t>
+      </w:r>
       <w:r>
         <w:rPr>
           <w:bCs/>
           <w:b/>
         </w:rPr>
-        <w:t xml:space="preserve">Keeping a map.</w:t>
-      </w:r>
-      <w:r>
-        <w:t xml:space="preserve"> </w:t>
-      </w:r>
-      <w:r>
-        <w:t xml:space="preserve">The map stays in the GM’s browser.</w:t>
-      </w:r>
-      <w:r>
-        <w:t xml:space="preserve"> </w:t>
-      </w:r>
+        <w:t xml:space="preserve">How to use the map</w:t>
+      </w:r>
+      <w:r>
+        <w:t xml:space="preserve"> </w:t>
+      </w:r>
+      <w:r>
+        <w:t xml:space="preserve">on the map itself for the buttons, step by step.</w:t>
+      </w:r>
+    </w:p>
+    <w:p>
+      <w:pPr>
+        <w:pStyle w:val="BodyText"/>
+      </w:pPr>
       <w:r>
         <w:rPr>
           <w:bCs/>
           <w:b/>
         </w:rPr>
+        <w:t xml:space="preserve">Two kinds of map.</w:t>
+      </w:r>
+    </w:p>
+    <w:p>
+      <w:pPr>
+        <w:numPr>
+          <w:ilvl w:val="0"/>
+          <w:numId w:val="1016"/>
+        </w:numPr>
+        <w:pStyle w:val="Compact"/>
+      </w:pPr>
+      <w:r>
+        <w:rPr>
+          <w:bCs/>
+          <w:b/>
+        </w:rPr>
+        <w:t xml:space="preserve">A hex map</w:t>
+      </w:r>
+      <w:r>
+        <w:t xml:space="preserve"> </w:t>
+      </w:r>
+      <w:r>
+        <w:t xml:space="preserve">for fights where position matters: cover, doorways, who can reach whom. The GM chooses what one hex is: 1 yard for a brawl in a room, 5 or 10 yards for a street, 50 for open ground. Dragging a token or measuring shows the distance and its</w:t>
+      </w:r>
+      <w:r>
+        <w:t xml:space="preserve"> </w:t>
+      </w:r>
+      <w:r>
+        <w:rPr>
+          <w:bCs/>
+          <w:b/>
+        </w:rPr>
+        <w:t xml:space="preserve">range band</w:t>
+      </w:r>
+      <w:r>
+        <w:t xml:space="preserve">, so the GM can read the penalty from the Range table above.</w:t>
+      </w:r>
+    </w:p>
+    <w:p>
+      <w:pPr>
+        <w:numPr>
+          <w:ilvl w:val="0"/>
+          <w:numId w:val="1016"/>
+        </w:numPr>
+        <w:pStyle w:val="Compact"/>
+      </w:pPr>
+      <w:r>
+        <w:rPr>
+          <w:bCs/>
+          <w:b/>
+        </w:rPr>
+        <w:t xml:space="preserve">A range track</w:t>
+      </w:r>
+      <w:r>
+        <w:t xml:space="preserve"> </w:t>
+      </w:r>
+      <w:r>
+        <w:t xml:space="preserve">for fights where only distance matters: a chase, a running fight across open country. It has a lane for the posse and one for each range band. Moving a token into the next lane moves it one band in or out.</w:t>
+      </w:r>
+    </w:p>
+    <w:p>
+      <w:pPr>
+        <w:pStyle w:val="FirstParagraph"/>
+      </w:pPr>
+      <w:r>
+        <w:rPr>
+          <w:bCs/>
+          <w:b/>
+        </w:rPr>
+        <w:t xml:space="preserve">Tokens.</w:t>
+      </w:r>
+      <w:r>
+        <w:t xml:space="preserve"> </w:t>
+      </w:r>
+      <w:r>
+        <w:t xml:space="preserve">The GM places the posse with one button. Their tokens stay linked to the characters in the GM view: marking Injury, Dying, the stunned condition or a Grit point on a token marks it on the character, and the other way round. Opponents come from the setting’s threats with their boxes filled in. Their pips fill as they are hurt, and a token whose boxes are all marked is taken out.</w:t>
+      </w:r>
+    </w:p>
+    <w:p>
+      <w:pPr>
+        <w:pStyle w:val="BodyText"/>
+      </w:pPr>
+      <w:r>
+        <w:rPr>
+          <w:bCs/>
+          <w:b/>
+        </w:rPr>
+        <w:t xml:space="preserve">Keeping a map.</w:t>
+      </w:r>
+      <w:r>
+        <w:t xml:space="preserve"> </w:t>
+      </w:r>
+      <w:r>
+        <w:t xml:space="preserve">The map stays in the GM’s browser.</w:t>
+      </w:r>
+      <w:r>
+        <w:t xml:space="preserve"> </w:t>
+      </w:r>
+      <w:r>
+        <w:rPr>
+          <w:bCs/>
+          <w:b/>
+        </w:rPr>
         <w:t xml:space="preserve">Save map to file</w:t>
       </w:r>
       <w:r>
@@ -11977,23 +12347,54 @@
         <w:t xml:space="preserve">keeps both maps, their pictures and tokens in one file, to prepare a fight ahead of time or share it with another GM.</w:t>
       </w:r>
     </w:p>
-    <w:bookmarkEnd w:id="60"/>
-    <w:bookmarkEnd w:id="61"/>
-    <w:bookmarkStart w:id="66" w:name="medical-care"/>
-    <w:p>
-      <w:pPr>
-        <w:pStyle w:val="Heading1"/>
-      </w:pPr>
-      <w:r>
-        <w:t xml:space="preserve">Medical care</w:t>
-      </w:r>
-    </w:p>
-    <w:p>
-      <w:pPr>
-        <w:pStyle w:val="FirstParagraph"/>
-      </w:pPr>
-      <w:r>
-        <w:t xml:space="preserve">Frontier medicine has chloroform, carbolic acid, laudanum and steady hands, and not much else. Infection kills more men than bullets do, and no doctor’s bag holds a cure for a bite from something that should be dead. See</w:t>
+    <w:p>
+      <w:pPr>
+        <w:pStyle w:val="BodyText"/>
+      </w:pPr>
+      <w:r>
+        <w:rPr>
+          <w:bCs/>
+          <w:b/>
+        </w:rPr>
+        <w:t xml:space="preserve">Stagecoach chase.</w:t>
+      </w:r>
+      <w:r>
+        <w:t xml:space="preserve"> </w:t>
+      </w:r>
+      <w:r>
+        <w:t xml:space="preserve">Besides the plain range track, the map has a</w:t>
+      </w:r>
+      <w:r>
+        <w:t xml:space="preserve"> </w:t>
+      </w:r>
+      <w:r>
+        <w:rPr>
+          <w:bCs/>
+          <w:b/>
+        </w:rPr>
+        <w:t xml:space="preserve">Stagecoach chase</w:t>
+      </w:r>
+      <w:r>
+        <w:t xml:space="preserve"> </w:t>
+      </w:r>
+      <w:r>
+        <w:t xml:space="preserve">track.</w:t>
+      </w:r>
+      <w:r>
+        <w:t xml:space="preserve"> </w:t>
+      </w:r>
+      <w:r>
+        <w:rPr>
+          <w:bCs/>
+          <w:b/>
+        </w:rPr>
+        <w:t xml:space="preserve">Add the stagecoach</w:t>
+      </w:r>
+      <w:r>
+        <w:t xml:space="preserve"> </w:t>
+      </w:r>
+      <w:r>
+        <w:t xml:space="preserve">places the stagecoach in the first lane with its own Coach boxes; its panel shows what the damage does. The rules are under</w:t>
       </w:r>
       <w:r>
         <w:t xml:space="preserve"> </w:t>
@@ -12003,6 +12404,38 @@
           <w:iCs/>
           <w:i/>
         </w:rPr>
+        <w:t xml:space="preserve">Stagecoach chases</w:t>
+      </w:r>
+      <w:r>
+        <w:t xml:space="preserve">.</w:t>
+      </w:r>
+    </w:p>
+    <w:bookmarkEnd w:id="61"/>
+    <w:bookmarkEnd w:id="62"/>
+    <w:bookmarkStart w:id="67" w:name="medical-care"/>
+    <w:p>
+      <w:pPr>
+        <w:pStyle w:val="Heading1"/>
+      </w:pPr>
+      <w:r>
+        <w:t xml:space="preserve">Medical care</w:t>
+      </w:r>
+    </w:p>
+    <w:p>
+      <w:pPr>
+        <w:pStyle w:val="FirstParagraph"/>
+      </w:pPr>
+      <w:r>
+        <w:t xml:space="preserve">Frontier medicine has chloroform, carbolic acid, laudanum and steady hands, and not much else. Infection kills more men than bullets do, and no doctor’s bag holds a cure for a bite from something that should be dead. See</w:t>
+      </w:r>
+      <w:r>
+        <w:t xml:space="preserve"> </w:t>
+      </w:r>
+      <w:r>
+        <w:rPr>
+          <w:iCs/>
+          <w:i/>
+        </w:rPr>
         <w:t xml:space="preserve">Bites and curses</w:t>
       </w:r>
       <w:r>
@@ -12012,7 +12445,7 @@
         <w:t xml:space="preserve">below.</w:t>
       </w:r>
     </w:p>
-    <w:bookmarkStart w:id="62" w:name="diagnosis-and-stabilization"/>
+    <w:bookmarkStart w:id="63" w:name="diagnosis-and-stabilization"/>
     <w:p>
       <w:pPr>
         <w:pStyle w:val="Heading2"/>
@@ -12029,8 +12462,8 @@
         <w:t xml:space="preserve">Roll Medicine when the diagnosis is uncertain or an urgent treatment decision matters. Emergency stabilization takes one action and a successful Medicine roll with a doctor’s bag. It ends Dying and stops deterioration, but removes no boxes.</w:t>
       </w:r>
     </w:p>
-    <w:bookmarkEnd w:id="62"/>
-    <w:bookmarkStart w:id="63" w:name="field-treatment"/>
+    <w:bookmarkEnd w:id="63"/>
+    <w:bookmarkStart w:id="64" w:name="field-treatment"/>
     <w:p>
       <w:pPr>
         <w:pStyle w:val="Heading2"/>
@@ -12047,8 +12480,8 @@
         <w:t xml:space="preserve">With a doctor’s bag and several uninterrupted minutes, successful Medicine removes one injury box; success by 5 or more removes two. Each injury receives one field-treatment attempt; further attempts need changed circumstances.</w:t>
       </w:r>
     </w:p>
-    <w:bookmarkEnd w:id="63"/>
-    <w:bookmarkStart w:id="64" w:name="proper-care"/>
+    <w:bookmarkEnd w:id="64"/>
+    <w:bookmarkStart w:id="65" w:name="proper-care"/>
     <w:p>
       <w:pPr>
         <w:pStyle w:val="Heading2"/>
@@ -12065,8 +12498,8 @@
         <w:t xml:space="preserve">A doctor’s surgery with instruments, chloroform and a clean table grants +2 to Medicine. A successful treatment removes two boxes; success by 5 or more removes three. Allow the time the treatment requires.</w:t>
       </w:r>
     </w:p>
-    <w:bookmarkEnd w:id="64"/>
-    <w:bookmarkStart w:id="65" w:name="natural-recovery"/>
+    <w:bookmarkEnd w:id="65"/>
+    <w:bookmarkStart w:id="66" w:name="natural-recovery"/>
     <w:p>
       <w:pPr>
         <w:pStyle w:val="Heading2"/>
@@ -12251,9 +12684,9 @@
         <w:t xml:space="preserve">At three boxes, rest alone does nothing until someone has stabilized or treated you; after that, a week of rest in their care clears the first box. A successful treatment is faster. The times add up: from three boxes, rest alone takes about a week and a half to heal completely (a week, then three days, then a day).</w:t>
       </w:r>
     </w:p>
-    <w:bookmarkEnd w:id="65"/>
     <w:bookmarkEnd w:id="66"/>
-    <w:bookmarkStart w:id="72" w:name="magic"/>
+    <w:bookmarkEnd w:id="67"/>
+    <w:bookmarkStart w:id="73" w:name="magic"/>
     <w:p>
       <w:pPr>
         <w:pStyle w:val="Heading1"/>
@@ -12497,7 +12930,7 @@
         </w:tc>
       </w:tr>
     </w:tbl>
-    <w:bookmarkStart w:id="67" w:name="hexes"/>
+    <w:bookmarkStart w:id="68" w:name="hexes"/>
     <w:p>
       <w:pPr>
         <w:pStyle w:val="Heading2"/>
@@ -12878,8 +13311,8 @@
         <w:t xml:space="preserve">A failed hex marks a box of The Dark; a natural 18 marks two, or something answers that shouldn’t.</w:t>
       </w:r>
     </w:p>
-    <w:bookmarkEnd w:id="67"/>
-    <w:bookmarkStart w:id="68" w:name="rituals"/>
+    <w:bookmarkEnd w:id="68"/>
+    <w:bookmarkStart w:id="69" w:name="rituals"/>
     <w:p>
       <w:pPr>
         <w:pStyle w:val="Heading2"/>
@@ -12892,7 +13325,7 @@
       <w:pPr>
         <w:numPr>
           <w:ilvl w:val="0"/>
-          <w:numId w:val="1016"/>
+          <w:numId w:val="1017"/>
         </w:numPr>
         <w:pStyle w:val="Compact"/>
       </w:pPr>
@@ -12914,7 +13347,7 @@
       <w:pPr>
         <w:numPr>
           <w:ilvl w:val="0"/>
-          <w:numId w:val="1016"/>
+          <w:numId w:val="1017"/>
         </w:numPr>
         <w:pStyle w:val="Compact"/>
       </w:pPr>
@@ -12936,7 +13369,7 @@
       <w:pPr>
         <w:numPr>
           <w:ilvl w:val="0"/>
-          <w:numId w:val="1016"/>
+          <w:numId w:val="1017"/>
         </w:numPr>
         <w:pStyle w:val="Compact"/>
       </w:pPr>
@@ -13196,8 +13629,8 @@
         <w:t xml:space="preserve">The right materials, hour or place remove one segment.</w:t>
       </w:r>
     </w:p>
-    <w:bookmarkEnd w:id="68"/>
-    <w:bookmarkStart w:id="69" w:name="charms"/>
+    <w:bookmarkEnd w:id="69"/>
+    <w:bookmarkStart w:id="70" w:name="charms"/>
     <w:p>
       <w:pPr>
         <w:pStyle w:val="Heading2"/>
@@ -13227,8 +13660,8 @@
         <w:t xml:space="preserve">. Preparation is how slow magic wins a fast fight.</w:t>
       </w:r>
     </w:p>
-    <w:bookmarkEnd w:id="69"/>
-    <w:bookmarkStart w:id="70" w:name="magic-advancement"/>
+    <w:bookmarkEnd w:id="70"/>
+    <w:bookmarkStart w:id="71" w:name="magic-advancement"/>
     <w:p>
       <w:pPr>
         <w:pStyle w:val="Heading2"/>
@@ -13735,8 +14168,8 @@
         </w:tc>
       </w:tr>
     </w:tbl>
-    <w:bookmarkEnd w:id="70"/>
-    <w:bookmarkStart w:id="71" w:name="magic-in-trails-of-blood-dust"/>
+    <w:bookmarkEnd w:id="71"/>
+    <w:bookmarkStart w:id="72" w:name="magic-in-trails-of-blood-dust"/>
     <w:p>
       <w:pPr>
         <w:pStyle w:val="Heading2"/>
@@ -13968,9 +14401,9 @@
         </w:tc>
       </w:tr>
     </w:tbl>
-    <w:bookmarkEnd w:id="71"/>
     <w:bookmarkEnd w:id="72"/>
-    <w:bookmarkStart w:id="76" w:name="grit-points-and-tracks"/>
+    <w:bookmarkEnd w:id="73"/>
+    <w:bookmarkStart w:id="77" w:name="grit-points-and-tracks"/>
     <w:p>
       <w:pPr>
         <w:pStyle w:val="Heading1"/>
@@ -13979,7 +14412,7 @@
         <w:t xml:space="preserve">Grit points and tracks</w:t>
       </w:r>
     </w:p>
-    <w:bookmarkStart w:id="73" w:name="using-grit-points"/>
+    <w:bookmarkStart w:id="74" w:name="using-grit-points"/>
     <w:p>
       <w:pPr>
         <w:pStyle w:val="Heading2"/>
@@ -14197,8 +14630,8 @@
         <w:t xml:space="preserve">Gain one point when one of your complications creates a meaningful problem you accept, including a companion complication. You can decline the proposed complication without penalty.</w:t>
       </w:r>
     </w:p>
-    <w:bookmarkEnd w:id="73"/>
-    <w:bookmarkStart w:id="74" w:name="trouble"/>
+    <w:bookmarkEnd w:id="74"/>
+    <w:bookmarkStart w:id="75" w:name="trouble"/>
     <w:p>
       <w:pPr>
         <w:pStyle w:val="Heading2"/>
@@ -14487,8 +14920,8 @@
         </w:tc>
       </w:tr>
     </w:tbl>
-    <w:bookmarkEnd w:id="74"/>
-    <w:bookmarkStart w:id="75" w:name="advancement"/>
+    <w:bookmarkEnd w:id="75"/>
+    <w:bookmarkStart w:id="76" w:name="advancement"/>
     <w:p>
       <w:pPr>
         <w:pStyle w:val="Heading2"/>
@@ -14525,7 +14958,7 @@
       <w:pPr>
         <w:numPr>
           <w:ilvl w:val="0"/>
-          <w:numId w:val="1017"/>
+          <w:numId w:val="1018"/>
         </w:numPr>
         <w:pStyle w:val="Compact"/>
       </w:pPr>
@@ -14586,7 +15019,7 @@
       <w:pPr>
         <w:numPr>
           <w:ilvl w:val="0"/>
-          <w:numId w:val="1017"/>
+          <w:numId w:val="1018"/>
         </w:numPr>
         <w:pStyle w:val="Compact"/>
       </w:pPr>
@@ -14932,9 +15365,9 @@
         <w:t xml:space="preserve">Magic and powers grow the same way, at the costs their chapters give.</w:t>
       </w:r>
     </w:p>
-    <w:bookmarkEnd w:id="75"/>
     <w:bookmarkEnd w:id="76"/>
-    <w:bookmarkStart w:id="79" w:name="running-jobs"/>
+    <w:bookmarkEnd w:id="77"/>
+    <w:bookmarkStart w:id="80" w:name="running-jobs"/>
     <w:p>
       <w:pPr>
         <w:pStyle w:val="Heading1"/>
@@ -14943,7 +15376,7 @@
         <w:t xml:space="preserve">Running jobs</w:t>
       </w:r>
     </w:p>
-    <w:bookmarkStart w:id="77" w:name="job-seeds"/>
+    <w:bookmarkStart w:id="78" w:name="job-seeds"/>
     <w:p>
       <w:pPr>
         <w:pStyle w:val="Heading2"/>
@@ -17175,8 +17608,8 @@
         </w:tc>
       </w:tr>
     </w:tbl>
-    <w:bookmarkEnd w:id="77"/>
-    <w:bookmarkStart w:id="78" w:name="the-trail-journal"/>
+    <w:bookmarkEnd w:id="78"/>
+    <w:bookmarkStart w:id="79" w:name="the-trail-journal"/>
     <w:p>
       <w:pPr>
         <w:pStyle w:val="Heading2"/>
@@ -17197,7 +17630,7 @@
       <w:pPr>
         <w:numPr>
           <w:ilvl w:val="0"/>
-          <w:numId w:val="1018"/>
+          <w:numId w:val="1019"/>
         </w:numPr>
         <w:pStyle w:val="Compact"/>
       </w:pPr>
@@ -17219,7 +17652,7 @@
       <w:pPr>
         <w:numPr>
           <w:ilvl w:val="0"/>
-          <w:numId w:val="1018"/>
+          <w:numId w:val="1019"/>
         </w:numPr>
         <w:pStyle w:val="Compact"/>
       </w:pPr>
@@ -17241,7 +17674,7 @@
       <w:pPr>
         <w:numPr>
           <w:ilvl w:val="0"/>
-          <w:numId w:val="1018"/>
+          <w:numId w:val="1019"/>
         </w:numPr>
         <w:pStyle w:val="Compact"/>
       </w:pPr>
@@ -17263,7 +17696,7 @@
       <w:pPr>
         <w:numPr>
           <w:ilvl w:val="0"/>
-          <w:numId w:val="1018"/>
+          <w:numId w:val="1019"/>
         </w:numPr>
         <w:pStyle w:val="Compact"/>
       </w:pPr>
@@ -17285,7 +17718,7 @@
       <w:pPr>
         <w:numPr>
           <w:ilvl w:val="0"/>
-          <w:numId w:val="1018"/>
+          <w:numId w:val="1019"/>
         </w:numPr>
         <w:pStyle w:val="Compact"/>
       </w:pPr>
@@ -17303,9 +17736,9 @@
         <w:t xml:space="preserve">After a significant job, each character earns 1 advancement point; at a milestone, 2 more.</w:t>
       </w:r>
     </w:p>
-    <w:bookmarkEnd w:id="78"/>
     <w:bookmarkEnd w:id="79"/>
-    <w:bookmarkStart w:id="86" w:name="monsters-and-magic"/>
+    <w:bookmarkEnd w:id="80"/>
+    <w:bookmarkStart w:id="87" w:name="monsters-and-magic"/>
     <w:p>
       <w:pPr>
         <w:pStyle w:val="Heading1"/>
@@ -17314,7 +17747,7 @@
         <w:t xml:space="preserve">Monsters and magic</w:t>
       </w:r>
     </w:p>
-    <w:bookmarkStart w:id="80" w:name="the-sight"/>
+    <w:bookmarkStart w:id="81" w:name="the-sight"/>
     <w:p>
       <w:pPr>
         <w:pStyle w:val="Heading2"/>
@@ -17344,8 +17777,8 @@
         <w:t xml:space="preserve">. They see ghosts, the true faces of monsters wearing human ones, and magic at work. To everyone else the darkness is a rumor, until it isn’t.</w:t>
       </w:r>
     </w:p>
-    <w:bookmarkEnd w:id="80"/>
-    <w:bookmarkStart w:id="81" w:name="monstrous-forms"/>
+    <w:bookmarkEnd w:id="81"/>
+    <w:bookmarkStart w:id="82" w:name="monstrous-forms"/>
     <w:p>
       <w:pPr>
         <w:pStyle w:val="Heading2"/>
@@ -17404,8 +17837,8 @@
         <w:t xml:space="preserve">.</w:t>
       </w:r>
     </w:p>
-    <w:bookmarkEnd w:id="81"/>
-    <w:bookmarkStart w:id="83" w:name="magic-1"/>
+    <w:bookmarkEnd w:id="82"/>
+    <w:bookmarkStart w:id="84" w:name="magic-1"/>
     <w:p>
       <w:pPr>
         <w:pStyle w:val="Heading2"/>
@@ -17721,7 +18154,7 @@
       <w:pPr>
         <w:numPr>
           <w:ilvl w:val="0"/>
-          <w:numId w:val="1019"/>
+          <w:numId w:val="1020"/>
         </w:numPr>
         <w:pStyle w:val="Compact"/>
       </w:pPr>
@@ -17743,7 +18176,7 @@
       <w:pPr>
         <w:numPr>
           <w:ilvl w:val="0"/>
-          <w:numId w:val="1019"/>
+          <w:numId w:val="1020"/>
         </w:numPr>
         <w:pStyle w:val="Compact"/>
       </w:pPr>
@@ -17765,7 +18198,7 @@
       <w:pPr>
         <w:numPr>
           <w:ilvl w:val="0"/>
-          <w:numId w:val="1019"/>
+          <w:numId w:val="1020"/>
         </w:numPr>
         <w:pStyle w:val="Compact"/>
       </w:pPr>
@@ -17803,7 +18236,7 @@
       <w:pPr>
         <w:numPr>
           <w:ilvl w:val="0"/>
-          <w:numId w:val="1019"/>
+          <w:numId w:val="1020"/>
         </w:numPr>
         <w:pStyle w:val="Compact"/>
       </w:pPr>
@@ -17926,7 +18359,7 @@
         <w:t xml:space="preserve">who will curse for money.</w:t>
       </w:r>
     </w:p>
-    <w:bookmarkStart w:id="82" w:name="hexes-1"/>
+    <w:bookmarkStart w:id="83" w:name="hexes-1"/>
     <w:p>
       <w:pPr>
         <w:pStyle w:val="Heading3"/>
@@ -18382,9 +18815,9 @@
         </w:tc>
       </w:tr>
     </w:tbl>
-    <w:bookmarkEnd w:id="82"/>
     <w:bookmarkEnd w:id="83"/>
-    <w:bookmarkStart w:id="84" w:name="weaknesses"/>
+    <w:bookmarkEnd w:id="84"/>
+    <w:bookmarkStart w:id="85" w:name="weaknesses"/>
     <w:p>
       <w:pPr>
         <w:pStyle w:val="Heading2"/>
@@ -18676,8 +19109,8 @@
         </w:tc>
       </w:tr>
     </w:tbl>
-    <w:bookmarkEnd w:id="84"/>
-    <w:bookmarkStart w:id="85" w:name="bites-and-curses"/>
+    <w:bookmarkEnd w:id="85"/>
+    <w:bookmarkStart w:id="86" w:name="bites-and-curses"/>
     <w:p>
       <w:pPr>
         <w:pStyle w:val="Heading2"/>
@@ -18690,7 +19123,7 @@
       <w:pPr>
         <w:numPr>
           <w:ilvl w:val="0"/>
-          <w:numId w:val="1020"/>
+          <w:numId w:val="1021"/>
         </w:numPr>
         <w:pStyle w:val="Compact"/>
       </w:pPr>
@@ -18728,7 +19161,7 @@
       <w:pPr>
         <w:numPr>
           <w:ilvl w:val="0"/>
-          <w:numId w:val="1020"/>
+          <w:numId w:val="1021"/>
         </w:numPr>
         <w:pStyle w:val="Compact"/>
       </w:pPr>
@@ -18750,7 +19183,7 @@
       <w:pPr>
         <w:numPr>
           <w:ilvl w:val="0"/>
-          <w:numId w:val="1020"/>
+          <w:numId w:val="1021"/>
         </w:numPr>
         <w:pStyle w:val="Compact"/>
       </w:pPr>
@@ -18768,9 +19201,9 @@
         <w:t xml:space="preserve">A vampire who drains a victim to Dying can choose to turn them.</w:t>
       </w:r>
     </w:p>
-    <w:bookmarkEnd w:id="85"/>
     <w:bookmarkEnd w:id="86"/>
-    <w:bookmarkStart w:id="87" w:name="threats"/>
+    <w:bookmarkEnd w:id="87"/>
+    <w:bookmarkStart w:id="88" w:name="threats"/>
     <w:p>
       <w:pPr>
         <w:pStyle w:val="Heading1"/>
@@ -20041,8 +20474,8 @@
         <w:t xml:space="preserve">For a tougher version, add +1 to its targets and one box; for a weaker one, subtract.</w:t>
       </w:r>
     </w:p>
-    <w:bookmarkEnd w:id="87"/>
-    <w:bookmarkStart w:id="94" w:name="ready-made-characters"/>
+    <w:bookmarkEnd w:id="88"/>
+    <w:bookmarkStart w:id="95" w:name="ready-made-characters"/>
     <w:p>
       <w:pPr>
         <w:pStyle w:val="Heading1"/>
@@ -20059,7 +20492,7 @@
         <w:t xml:space="preserve">Characters ready to play, for one-shots, new players, or a group in a hurry. Each follows the creation rules exactly, and their connections tie them together. In the creator, choose one from the ready-made list to open it and make it your own.</w:t>
       </w:r>
     </w:p>
-    <w:bookmarkStart w:id="88" w:name="ruth-calloway"/>
+    <w:bookmarkStart w:id="89" w:name="ruth-calloway"/>
     <w:p>
       <w:pPr>
         <w:pStyle w:val="Heading2"/>
@@ -20084,192 +20517,6 @@
       </w:r>
       <w:r>
         <w:t xml:space="preserve">Wears the badge in three counties, and sees what’s under the faces of the men she arrests.</w:t>
-      </w:r>
-    </w:p>
-    <w:p>
-      <w:pPr>
-        <w:numPr>
-          <w:ilvl w:val="0"/>
-          <w:numId w:val="1021"/>
-        </w:numPr>
-        <w:pStyle w:val="Compact"/>
-      </w:pPr>
-      <w:r>
-        <w:rPr>
-          <w:bCs/>
-          <w:b/>
-        </w:rPr>
-        <w:t xml:space="preserve">Attributes:</w:t>
-      </w:r>
-      <w:r>
-        <w:t xml:space="preserve"> </w:t>
-      </w:r>
-      <w:r>
-        <w:t xml:space="preserve">Body 12, Agility 13, Intellect 10, Presence 9, Will 11.</w:t>
-      </w:r>
-      <w:r>
-        <w:t xml:space="preserve"> </w:t>
-      </w:r>
-      <w:r>
-        <w:rPr>
-          <w:bCs/>
-          <w:b/>
-        </w:rPr>
-        <w:t xml:space="preserve">Dodge</w:t>
-      </w:r>
-      <w:r>
-        <w:t xml:space="preserve"> </w:t>
-      </w:r>
-      <w:r>
-        <w:t xml:space="preserve">12.</w:t>
-      </w:r>
-    </w:p>
-    <w:p>
-      <w:pPr>
-        <w:numPr>
-          <w:ilvl w:val="0"/>
-          <w:numId w:val="1021"/>
-        </w:numPr>
-        <w:pStyle w:val="Compact"/>
-      </w:pPr>
-      <w:r>
-        <w:rPr>
-          <w:bCs/>
-          <w:b/>
-        </w:rPr>
-        <w:t xml:space="preserve">Skills:</w:t>
-      </w:r>
-      <w:r>
-        <w:t xml:space="preserve"> </w:t>
-      </w:r>
-      <w:r>
-        <w:t xml:space="preserve">Shooting 16 (Specialty). Trained: Brawling 14, Riding 14, Athletics 13, Law 11, Occult 11, Read People 11, Survival 11, Tracking 11, Leadership 10.</w:t>
-      </w:r>
-    </w:p>
-    <w:p>
-      <w:pPr>
-        <w:numPr>
-          <w:ilvl w:val="0"/>
-          <w:numId w:val="1021"/>
-        </w:numPr>
-        <w:pStyle w:val="Compact"/>
-      </w:pPr>
-      <w:r>
-        <w:rPr>
-          <w:bCs/>
-          <w:b/>
-        </w:rPr>
-        <w:t xml:space="preserve">Edges:</w:t>
-      </w:r>
-      <w:r>
-        <w:t xml:space="preserve"> </w:t>
-      </w:r>
-      <w:r>
-        <w:t xml:space="preserve">Second advantage, Extra Grit; second advantage: Badge: Deputy U.S. Marshal.</w:t>
-      </w:r>
-    </w:p>
-    <w:p>
-      <w:pPr>
-        <w:numPr>
-          <w:ilvl w:val="0"/>
-          <w:numId w:val="1021"/>
-        </w:numPr>
-        <w:pStyle w:val="Compact"/>
-      </w:pPr>
-      <w:r>
-        <w:rPr>
-          <w:bCs/>
-          <w:b/>
-        </w:rPr>
-        <w:t xml:space="preserve">Advantage:</w:t>
-      </w:r>
-      <w:r>
-        <w:t xml:space="preserve"> </w:t>
-      </w:r>
-      <w:r>
-        <w:t xml:space="preserve">Monster’s Eye (origin; companion: Haunted).</w:t>
-      </w:r>
-      <w:r>
-        <w:t xml:space="preserve"> </w:t>
-      </w:r>
-      <w:r>
-        <w:rPr>
-          <w:bCs/>
-          <w:b/>
-        </w:rPr>
-        <w:t xml:space="preserve">Complication:</w:t>
-      </w:r>
-      <w:r>
-        <w:t xml:space="preserve"> </w:t>
-      </w:r>
-      <w:r>
-        <w:t xml:space="preserve">Law and Order; trigger: the town wants a hanging without a trial.</w:t>
-      </w:r>
-    </w:p>
-    <w:p>
-      <w:pPr>
-        <w:numPr>
-          <w:ilvl w:val="0"/>
-          <w:numId w:val="1021"/>
-        </w:numPr>
-        <w:pStyle w:val="Compact"/>
-      </w:pPr>
-      <w:r>
-        <w:rPr>
-          <w:bCs/>
-          <w:b/>
-        </w:rPr>
-        <w:t xml:space="preserve">Why I face the dark:</w:t>
-      </w:r>
-      <w:r>
-        <w:t xml:space="preserve"> </w:t>
-      </w:r>
-      <w:r>
-        <w:t xml:space="preserve">I took an oath, and I keep my word.</w:t>
-      </w:r>
-      <w:r>
-        <w:t xml:space="preserve"> </w:t>
-      </w:r>
-      <w:r>
-        <w:rPr>
-          <w:bCs/>
-          <w:b/>
-        </w:rPr>
-        <w:t xml:space="preserve">Connection:</w:t>
-      </w:r>
-      <w:r>
-        <w:t xml:space="preserve"> </w:t>
-      </w:r>
-      <w:r>
-        <w:t xml:space="preserve">Isaiah Booker brought in the man who killed her father, alive, when he could have collected either way.</w:t>
-      </w:r>
-    </w:p>
-    <w:bookmarkEnd w:id="88"/>
-    <w:bookmarkStart w:id="89" w:name="dr.-elias-webb"/>
-    <w:p>
-      <w:pPr>
-        <w:pStyle w:val="Heading2"/>
-      </w:pPr>
-      <w:r>
-        <w:t xml:space="preserve">Dr. Elias Webb</w:t>
-      </w:r>
-    </w:p>
-    <w:p>
-      <w:pPr>
-        <w:pStyle w:val="FirstParagraph"/>
-      </w:pPr>
-      <w:r>
-        <w:rPr>
-          <w:iCs/>
-          <w:i/>
-        </w:rPr>
-        <w:t xml:space="preserve">Town physician, Doctor. City-bred (tier 0).</w:t>
-      </w:r>
-      <w:r>
-        <w:t xml:space="preserve"> </w:t>
-      </w:r>
-      <w:r>
-        <w:t xml:space="preserve">Left a Philadelphia practice for reasons he won’t discuss, and patches up whoever comes through the door.</w:t>
       </w:r>
     </w:p>
     <w:p>
@@ -20291,7 +20538,7 @@
         <w:t xml:space="preserve"> </w:t>
       </w:r>
       <w:r>
-        <w:t xml:space="preserve">Body 9, Agility 10, Intellect 13, Presence 12, Will 11.</w:t>
+        <w:t xml:space="preserve">Body 12, Agility 13, Intellect 10, Presence 9, Will 11.</w:t>
       </w:r>
       <w:r>
         <w:t xml:space="preserve"> </w:t>
@@ -20307,7 +20554,7 @@
         <w:t xml:space="preserve"> </w:t>
       </w:r>
       <w:r>
-        <w:t xml:space="preserve">8.</w:t>
+        <w:t xml:space="preserve">12.</w:t>
       </w:r>
     </w:p>
     <w:p>
@@ -20329,7 +20576,7 @@
         <w:t xml:space="preserve"> </w:t>
       </w:r>
       <w:r>
-        <w:t xml:space="preserve">Medicine 16 (Specialty). Trained: Gambling 14, Investigation 14, Law 14, Read People 14, Survival 14, Tinkering 14, Leadership 13, Persuasion 13, Riding 11.</w:t>
+        <w:t xml:space="preserve">Shooting 16 (Specialty). Trained: Brawling 14, Riding 14, Athletics 13, Law 11, Occult 11, Read People 11, Survival 11, Tracking 11, Leadership 10.</w:t>
       </w:r>
     </w:p>
     <w:p>
@@ -20351,7 +20598,7 @@
         <w:t xml:space="preserve"> </w:t>
       </w:r>
       <w:r>
-        <w:t xml:space="preserve">Second advantage, A fine weapon or tool, A friend; second advantage: Battlefield Surgeon; a friend: the editor of the territorial newspaper, who owes him a life; a fine tool: his surgeon’s instruments (+2 Medicine).</w:t>
+        <w:t xml:space="preserve">Second advantage, Extra Grit; second advantage: Badge: Deputy U.S. Marshal.</w:t>
       </w:r>
     </w:p>
     <w:p>
@@ -20373,7 +20620,7 @@
         <w:t xml:space="preserve"> </w:t>
       </w:r>
       <w:r>
-        <w:t xml:space="preserve">Steady Hands.</w:t>
+        <w:t xml:space="preserve">Monster’s Eye (origin; companion: Haunted).</w:t>
       </w:r>
       <w:r>
         <w:t xml:space="preserve"> </w:t>
@@ -20389,7 +20636,7 @@
         <w:t xml:space="preserve"> </w:t>
       </w:r>
       <w:r>
-        <w:t xml:space="preserve">The Bottle; trigger: pain that won’t quit.</w:t>
+        <w:t xml:space="preserve">Law and Order; trigger: the town wants a hanging without a trial.</w:t>
       </w:r>
     </w:p>
     <w:p>
@@ -20411,7 +20658,7 @@
         <w:t xml:space="preserve"> </w:t>
       </w:r>
       <w:r>
-        <w:t xml:space="preserve">Nobody out here knows what I did back east.</w:t>
+        <w:t xml:space="preserve">I took an oath, and I keep my word.</w:t>
       </w:r>
       <w:r>
         <w:t xml:space="preserve"> </w:t>
@@ -20427,17 +20674,17 @@
         <w:t xml:space="preserve"> </w:t>
       </w:r>
       <w:r>
-        <w:t xml:space="preserve">Reverend Stone is the only one who knows why he left Philadelphia.</w:t>
+        <w:t xml:space="preserve">Isaiah Booker brought in the man who killed her father, alive, when he could have collected either way.</w:t>
       </w:r>
     </w:p>
     <w:bookmarkEnd w:id="89"/>
-    <w:bookmarkStart w:id="90" w:name="tom-feeney"/>
+    <w:bookmarkStart w:id="90" w:name="dr.-elias-webb"/>
     <w:p>
       <w:pPr>
         <w:pStyle w:val="Heading2"/>
       </w:pPr>
       <w:r>
-        <w:t xml:space="preserve">Tom Feeney</w:t>
+        <w:t xml:space="preserve">Dr. Elias Webb</w:t>
       </w:r>
     </w:p>
     <w:p>
@@ -20449,13 +20696,13 @@
           <w:iCs/>
           <w:i/>
         </w:rPr>
-        <w:t xml:space="preserve">Horse breaker, Wrangler. Werewolf (tier 2).</w:t>
-      </w:r>
-      <w:r>
-        <w:t xml:space="preserve"> </w:t>
-      </w:r>
-      <w:r>
-        <w:t xml:space="preserve">Came from County Clare with nothing but a curse, and chains himself in the root cellar every full moon.</w:t>
+        <w:t xml:space="preserve">Town physician, Doctor. City-bred (tier 0).</w:t>
+      </w:r>
+      <w:r>
+        <w:t xml:space="preserve"> </w:t>
+      </w:r>
+      <w:r>
+        <w:t xml:space="preserve">Left a Philadelphia practice for reasons he won’t discuss, and patches up whoever comes through the door.</w:t>
       </w:r>
     </w:p>
     <w:p>
@@ -20477,7 +20724,7 @@
         <w:t xml:space="preserve"> </w:t>
       </w:r>
       <w:r>
-        <w:t xml:space="preserve">Body 13, Agility 13, Intellect 9, Presence 11, Will 9.</w:t>
+        <w:t xml:space="preserve">Body 9, Agility 10, Intellect 13, Presence 12, Will 11.</w:t>
       </w:r>
       <w:r>
         <w:t xml:space="preserve"> </w:t>
@@ -20493,23 +20740,7 @@
         <w:t xml:space="preserve"> </w:t>
       </w:r>
       <w:r>
-        <w:t xml:space="preserve">12.</w:t>
-      </w:r>
-      <w:r>
-        <w:t xml:space="preserve"> </w:t>
-      </w:r>
-      <w:r>
-        <w:rPr>
-          <w:bCs/>
-          <w:b/>
-        </w:rPr>
-        <w:t xml:space="preserve">In monstrous form:</w:t>
-      </w:r>
-      <w:r>
-        <w:t xml:space="preserve"> </w:t>
-      </w:r>
-      <w:r>
-        <w:t xml:space="preserve">Body 15, Agility 14, Dodge 13.</w:t>
+        <w:t xml:space="preserve">8.</w:t>
       </w:r>
     </w:p>
     <w:p>
@@ -20531,7 +20762,7 @@
         <w:t xml:space="preserve"> </w:t>
       </w:r>
       <w:r>
-        <w:t xml:space="preserve">Riding 16 (Specialty). Trained: Athletics 14, Brawling 14, Melee 14, Shooting 14, Stealth 14, Animal Handling 12, Gambling 10, Survival 10, Tinkering 10, Tracking 10.</w:t>
+        <w:t xml:space="preserve">Medicine 16 (Specialty). Trained: Gambling 14, Investigation 14, Law 14, Read People 14, Survival 14, Tinkering 14, Leadership 13, Persuasion 13, Riding 11.</w:t>
       </w:r>
     </w:p>
     <w:p>
@@ -20553,7 +20784,7 @@
         <w:t xml:space="preserve"> </w:t>
       </w:r>
       <w:r>
-        <w:t xml:space="preserve">Extra Trained skill.</w:t>
+        <w:t xml:space="preserve">Second advantage, A fine weapon or tool, A friend; second advantage: Battlefield Surgeon; a friend: the editor of the territorial newspaper, who owes him a life; a fine tool: his surgeon’s instruments (+2 Medicine).</w:t>
       </w:r>
     </w:p>
     <w:p>
@@ -20575,7 +20806,7 @@
         <w:t xml:space="preserve"> </w:t>
       </w:r>
       <w:r>
-        <w:t xml:space="preserve">Wolf’s Nose (origin; companion: The Hunger).</w:t>
+        <w:t xml:space="preserve">Steady Hands.</w:t>
       </w:r>
       <w:r>
         <w:t xml:space="preserve"> </w:t>
@@ -20591,7 +20822,7 @@
         <w:t xml:space="preserve"> </w:t>
       </w:r>
       <w:r>
-        <w:t xml:space="preserve">Short Fuse; trigger: someone insults you or yours.</w:t>
+        <w:t xml:space="preserve">The Bottle; trigger: pain that won’t quit.</w:t>
       </w:r>
     </w:p>
     <w:p>
@@ -20613,7 +20844,7 @@
         <w:t xml:space="preserve"> </w:t>
       </w:r>
       <w:r>
-        <w:t xml:space="preserve">Everything I do is for my family.</w:t>
+        <w:t xml:space="preserve">Nobody out here knows what I did back east.</w:t>
       </w:r>
       <w:r>
         <w:t xml:space="preserve"> </w:t>
@@ -20629,17 +20860,17 @@
         <w:t xml:space="preserve"> </w:t>
       </w:r>
       <w:r>
-        <w:t xml:space="preserve">Plays cards with Lucinda Marsh every Saturday, and loses.</w:t>
+        <w:t xml:space="preserve">Reverend Stone is the only one who knows why he left Philadelphia.</w:t>
       </w:r>
     </w:p>
     <w:bookmarkEnd w:id="90"/>
-    <w:bookmarkStart w:id="91" w:name="lucinda-marsh"/>
+    <w:bookmarkStart w:id="91" w:name="tom-feeney"/>
     <w:p>
       <w:pPr>
         <w:pStyle w:val="Heading2"/>
       </w:pPr>
       <w:r>
-        <w:t xml:space="preserve">Lucinda Marsh</w:t>
+        <w:t xml:space="preserve">Tom Feeney</w:t>
       </w:r>
     </w:p>
     <w:p>
@@ -20651,13 +20882,13 @@
           <w:iCs/>
           <w:i/>
         </w:rPr>
-        <w:t xml:space="preserve">Professional gambler, Gambler. Practitioner (tier 2); Old hand.</w:t>
-      </w:r>
-      <w:r>
-        <w:t xml:space="preserve"> </w:t>
-      </w:r>
-      <w:r>
-        <w:t xml:space="preserve">Deals faro by night and reads the cards for anyone who’ll pay, and the cards are never wrong.</w:t>
+        <w:t xml:space="preserve">Horse breaker, Wrangler. Werewolf (tier 2).</w:t>
+      </w:r>
+      <w:r>
+        <w:t xml:space="preserve"> </w:t>
+      </w:r>
+      <w:r>
+        <w:t xml:space="preserve">Came from County Clare with nothing but a curse, and chains himself in the root cellar every full moon.</w:t>
       </w:r>
     </w:p>
     <w:p>
@@ -20679,7 +20910,7 @@
         <w:t xml:space="preserve"> </w:t>
       </w:r>
       <w:r>
-        <w:t xml:space="preserve">Body 9, Agility 10, Intellect 13, Presence 12, Will 11.</w:t>
+        <w:t xml:space="preserve">Body 13, Agility 13, Intellect 9, Presence 11, Will 9.</w:t>
       </w:r>
       <w:r>
         <w:t xml:space="preserve"> </w:t>
@@ -20695,7 +20926,23 @@
         <w:t xml:space="preserve"> </w:t>
       </w:r>
       <w:r>
-        <w:t xml:space="preserve">8.</w:t>
+        <w:t xml:space="preserve">12.</w:t>
+      </w:r>
+      <w:r>
+        <w:t xml:space="preserve"> </w:t>
+      </w:r>
+      <w:r>
+        <w:rPr>
+          <w:bCs/>
+          <w:b/>
+        </w:rPr>
+        <w:t xml:space="preserve">In monstrous form:</w:t>
+      </w:r>
+      <w:r>
+        <w:t xml:space="preserve"> </w:t>
+      </w:r>
+      <w:r>
+        <w:t xml:space="preserve">Body 15, Agility 14, Dodge 13.</w:t>
       </w:r>
     </w:p>
     <w:p>
@@ -20717,7 +20964,7 @@
         <w:t xml:space="preserve"> </w:t>
       </w:r>
       <w:r>
-        <w:t xml:space="preserve">Gambling 18 (Expert). Trained: Investigation 14, Occult 14, Read People 14, Deception 13, Persuasion 13, Riding 11, Stealth 11.</w:t>
+        <w:t xml:space="preserve">Riding 16 (Specialty). Trained: Athletics 14, Brawling 14, Melee 14, Shooting 14, Stealth 14, Animal Handling 12, Gambling 10, Survival 10, Tinkering 10, Tracking 10.</w:t>
       </w:r>
     </w:p>
     <w:p>
@@ -20739,7 +20986,7 @@
         <w:t xml:space="preserve"> </w:t>
       </w:r>
       <w:r>
-        <w:t xml:space="preserve">A friend; a friend: Mae Lin, a faro dealer who hears everything said at her table.</w:t>
+        <w:t xml:space="preserve">Extra Trained skill.</w:t>
       </w:r>
     </w:p>
     <w:p>
@@ -20761,7 +21008,7 @@
         <w:t xml:space="preserve"> </w:t>
       </w:r>
       <w:r>
-        <w:t xml:space="preserve">Cunning Folk (origin; companion: Old Superstitions).</w:t>
+        <w:t xml:space="preserve">Wolf’s Nose (origin; companion: The Hunger).</w:t>
       </w:r>
       <w:r>
         <w:t xml:space="preserve"> </w:t>
@@ -20777,7 +21024,7 @@
         <w:t xml:space="preserve"> </w:t>
       </w:r>
       <w:r>
-        <w:t xml:space="preserve">Owes the Wrong People; trigger: a collector arrives.</w:t>
+        <w:t xml:space="preserve">Short Fuse; trigger: someone insults you or yours.</w:t>
       </w:r>
     </w:p>
     <w:p>
@@ -20799,7 +21046,7 @@
         <w:t xml:space="preserve"> </w:t>
       </w:r>
       <w:r>
-        <w:t xml:space="preserve">There’s money out here for anyone with nerve enough to take it.</w:t>
+        <w:t xml:space="preserve">Everything I do is for my family.</w:t>
       </w:r>
       <w:r>
         <w:t xml:space="preserve"> </w:t>
@@ -20815,17 +21062,17 @@
         <w:t xml:space="preserve"> </w:t>
       </w:r>
       <w:r>
-        <w:t xml:space="preserve">Owes Ruth Calloway a favor for a warrant that went missing.</w:t>
+        <w:t xml:space="preserve">Plays cards with Lucinda Marsh every Saturday, and loses.</w:t>
       </w:r>
     </w:p>
     <w:bookmarkEnd w:id="91"/>
-    <w:bookmarkStart w:id="92" w:name="isaiah-booker"/>
+    <w:bookmarkStart w:id="92" w:name="lucinda-marsh"/>
     <w:p>
       <w:pPr>
         <w:pStyle w:val="Heading2"/>
       </w:pPr>
       <w:r>
-        <w:t xml:space="preserve">Isaiah Booker</w:t>
+        <w:t xml:space="preserve">Lucinda Marsh</w:t>
       </w:r>
     </w:p>
     <w:p>
@@ -20837,13 +21084,13 @@
           <w:iCs/>
           <w:i/>
         </w:rPr>
-        <w:t xml:space="preserve">Bounty hunter, Bounty Hunter. Revenant (tier 2).</w:t>
-      </w:r>
-      <w:r>
-        <w:t xml:space="preserve"> </w:t>
-      </w:r>
-      <w:r>
-        <w:t xml:space="preserve">Shot in the back in ’69 by the gang he was hunting. He got up again, and he’s still hunting them.</w:t>
+        <w:t xml:space="preserve">Professional gambler, Gambler. Practitioner (tier 2); Old hand.</w:t>
+      </w:r>
+      <w:r>
+        <w:t xml:space="preserve"> </w:t>
+      </w:r>
+      <w:r>
+        <w:t xml:space="preserve">Deals faro by night and reads the cards for anyone who’ll pay, and the cards are never wrong.</w:t>
       </w:r>
     </w:p>
     <w:p>
@@ -20865,7 +21112,7 @@
         <w:t xml:space="preserve"> </w:t>
       </w:r>
       <w:r>
-        <w:t xml:space="preserve">Body 12, Agility 13, Intellect 11, Presence 8, Will 11.</w:t>
+        <w:t xml:space="preserve">Body 9, Agility 10, Intellect 13, Presence 12, Will 11.</w:t>
       </w:r>
       <w:r>
         <w:t xml:space="preserve"> </w:t>
@@ -20881,7 +21128,7 @@
         <w:t xml:space="preserve"> </w:t>
       </w:r>
       <w:r>
-        <w:t xml:space="preserve">12.</w:t>
+        <w:t xml:space="preserve">8.</w:t>
       </w:r>
     </w:p>
     <w:p>
@@ -20903,7 +21150,7 @@
         <w:t xml:space="preserve"> </w:t>
       </w:r>
       <w:r>
-        <w:t xml:space="preserve">Shooting 16 (Specialty). Trained: Brawling 14, Melee 14, Riding 14, Stealth 14, Athletics 13, Investigation 12, Read People 12, Survival 12, Tracking 12.</w:t>
+        <w:t xml:space="preserve">Gambling 18 (Expert). Trained: Investigation 14, Occult 14, Read People 14, Deception 13, Persuasion 13, Riding 11, Stealth 11.</w:t>
       </w:r>
     </w:p>
     <w:p>
@@ -20925,7 +21172,7 @@
         <w:t xml:space="preserve"> </w:t>
       </w:r>
       <w:r>
-        <w:t xml:space="preserve">A fine weapon or tool; a fine tool: a Sharps rifle with a telescopic sight (+2 Shooting).</w:t>
+        <w:t xml:space="preserve">A friend; a friend: Mae Lin, a faro dealer who hears everything said at her table.</w:t>
       </w:r>
     </w:p>
     <w:p>
@@ -20947,7 +21194,7 @@
         <w:t xml:space="preserve"> </w:t>
       </w:r>
       <w:r>
-        <w:t xml:space="preserve">Unfeeling (origin; companion: Unfinished Business).</w:t>
+        <w:t xml:space="preserve">Cunning Folk (origin; companion: Old Superstitions).</w:t>
       </w:r>
       <w:r>
         <w:t xml:space="preserve"> </w:t>
@@ -20963,7 +21210,7 @@
         <w:t xml:space="preserve"> </w:t>
       </w:r>
       <w:r>
-        <w:t xml:space="preserve">Code of the West; trigger: the easy shot is in someone’s back.</w:t>
+        <w:t xml:space="preserve">Owes the Wrong People; trigger: a collector arrives.</w:t>
       </w:r>
     </w:p>
     <w:p>
@@ -20985,7 +21232,7 @@
         <w:t xml:space="preserve"> </w:t>
       </w:r>
       <w:r>
-        <w:t xml:space="preserve">Someone did me wrong, and I mean to settle it.</w:t>
+        <w:t xml:space="preserve">There’s money out here for anyone with nerve enough to take it.</w:t>
       </w:r>
       <w:r>
         <w:t xml:space="preserve"> </w:t>
@@ -21001,17 +21248,17 @@
         <w:t xml:space="preserve"> </w:t>
       </w:r>
       <w:r>
-        <w:t xml:space="preserve">Taught Tom Feeney to shoot straight, and still reminds him of it.</w:t>
+        <w:t xml:space="preserve">Owes Ruth Calloway a favor for a warrant that went missing.</w:t>
       </w:r>
     </w:p>
     <w:bookmarkEnd w:id="92"/>
-    <w:bookmarkStart w:id="93" w:name="rev.-abigail-stone"/>
+    <w:bookmarkStart w:id="93" w:name="isaiah-booker"/>
     <w:p>
       <w:pPr>
         <w:pStyle w:val="Heading2"/>
       </w:pPr>
       <w:r>
-        <w:t xml:space="preserve">Rev. Abigail Stone</w:t>
+        <w:t xml:space="preserve">Isaiah Booker</w:t>
       </w:r>
     </w:p>
     <w:p>
@@ -21023,13 +21270,13 @@
           <w:iCs/>
           <w:i/>
         </w:rPr>
-        <w:t xml:space="preserve">Circuit preacher, Preacher. Old Money (tier 0).</w:t>
-      </w:r>
-      <w:r>
-        <w:t xml:space="preserve"> </w:t>
-      </w:r>
-      <w:r>
-        <w:t xml:space="preserve">Gave up a Boston fortune for a circuit of mining camps, and preaches with a shotgun across her knees.</w:t>
+        <w:t xml:space="preserve">Bounty hunter, Bounty Hunter. Revenant (tier 2).</w:t>
+      </w:r>
+      <w:r>
+        <w:t xml:space="preserve"> </w:t>
+      </w:r>
+      <w:r>
+        <w:t xml:space="preserve">Shot in the back in ’69 by the gang he was hunting. He got up again, and he’s still hunting them.</w:t>
       </w:r>
     </w:p>
     <w:p>
@@ -21051,7 +21298,7 @@
         <w:t xml:space="preserve"> </w:t>
       </w:r>
       <w:r>
-        <w:t xml:space="preserve">Body 9, Agility 10, Intellect 11, Presence 14, Will 12.</w:t>
+        <w:t xml:space="preserve">Body 12, Agility 13, Intellect 11, Presence 8, Will 11.</w:t>
       </w:r>
       <w:r>
         <w:t xml:space="preserve"> </w:t>
@@ -21067,7 +21314,7 @@
         <w:t xml:space="preserve"> </w:t>
       </w:r>
       <w:r>
-        <w:t xml:space="preserve">9.</w:t>
+        <w:t xml:space="preserve">12.</w:t>
       </w:r>
     </w:p>
     <w:p>
@@ -21089,7 +21336,7 @@
         <w:t xml:space="preserve"> </w:t>
       </w:r>
       <w:r>
-        <w:t xml:space="preserve">Persuasion 17 (Specialty). Trained: Leadership 15, Investigation 12, Law 12, Medicine 12, Read People 12, Survival 12, Riding 11, Shooting 11, Athletics 10.</w:t>
+        <w:t xml:space="preserve">Shooting 16 (Specialty). Trained: Brawling 14, Melee 14, Riding 14, Stealth 14, Athletics 13, Investigation 12, Read People 12, Survival 12, Tracking 12.</w:t>
       </w:r>
     </w:p>
     <w:p>
@@ -21111,7 +21358,7 @@
         <w:t xml:space="preserve"> </w:t>
       </w:r>
       <w:r>
-        <w:t xml:space="preserve">+1 attribute point, Second advantage, A friend; second advantage: Unshakable Courage; a friend: Bishop Harrow, who answers her letters and asks no questions.</w:t>
+        <w:t xml:space="preserve">A fine weapon or tool; a fine tool: a Sharps rifle with a telescopic sight (+2 Shooting).</w:t>
       </w:r>
     </w:p>
     <w:p>
@@ -21133,7 +21380,7 @@
         <w:t xml:space="preserve"> </w:t>
       </w:r>
       <w:r>
-        <w:t xml:space="preserve">Hellfire Preacher.</w:t>
+        <w:t xml:space="preserve">Unfeeling (origin; companion: Unfinished Business).</w:t>
       </w:r>
       <w:r>
         <w:t xml:space="preserve"> </w:t>
@@ -21149,7 +21396,7 @@
         <w:t xml:space="preserve"> </w:t>
       </w:r>
       <w:r>
-        <w:t xml:space="preserve">Protects Others at Personal Risk; trigger: townsfolk are caught in the crossfire.</w:t>
+        <w:t xml:space="preserve">Code of the West; trigger: the easy shot is in someone’s back.</w:t>
       </w:r>
     </w:p>
     <w:p>
@@ -21171,7 +21418,7 @@
         <w:t xml:space="preserve"> </w:t>
       </w:r>
       <w:r>
-        <w:t xml:space="preserve">The Lord sent me here for a reason, and I believe this is it.</w:t>
+        <w:t xml:space="preserve">Someone did me wrong, and I mean to settle it.</w:t>
       </w:r>
       <w:r>
         <w:t xml:space="preserve"> </w:t>
@@ -21187,12 +21434,198 @@
         <w:t xml:space="preserve"> </w:t>
       </w:r>
       <w:r>
+        <w:t xml:space="preserve">Taught Tom Feeney to shoot straight, and still reminds him of it.</w:t>
+      </w:r>
+    </w:p>
+    <w:bookmarkEnd w:id="93"/>
+    <w:bookmarkStart w:id="94" w:name="rev.-abigail-stone"/>
+    <w:p>
+      <w:pPr>
+        <w:pStyle w:val="Heading2"/>
+      </w:pPr>
+      <w:r>
+        <w:t xml:space="preserve">Rev. Abigail Stone</w:t>
+      </w:r>
+    </w:p>
+    <w:p>
+      <w:pPr>
+        <w:pStyle w:val="FirstParagraph"/>
+      </w:pPr>
+      <w:r>
+        <w:rPr>
+          <w:iCs/>
+          <w:i/>
+        </w:rPr>
+        <w:t xml:space="preserve">Circuit preacher, Preacher. Old Money (tier 0).</w:t>
+      </w:r>
+      <w:r>
+        <w:t xml:space="preserve"> </w:t>
+      </w:r>
+      <w:r>
+        <w:t xml:space="preserve">Gave up a Boston fortune for a circuit of mining camps, and preaches with a shotgun across her knees.</w:t>
+      </w:r>
+    </w:p>
+    <w:p>
+      <w:pPr>
+        <w:numPr>
+          <w:ilvl w:val="0"/>
+          <w:numId w:val="1027"/>
+        </w:numPr>
+        <w:pStyle w:val="Compact"/>
+      </w:pPr>
+      <w:r>
+        <w:rPr>
+          <w:bCs/>
+          <w:b/>
+        </w:rPr>
+        <w:t xml:space="preserve">Attributes:</w:t>
+      </w:r>
+      <w:r>
+        <w:t xml:space="preserve"> </w:t>
+      </w:r>
+      <w:r>
+        <w:t xml:space="preserve">Body 9, Agility 10, Intellect 11, Presence 14, Will 12.</w:t>
+      </w:r>
+      <w:r>
+        <w:t xml:space="preserve"> </w:t>
+      </w:r>
+      <w:r>
+        <w:rPr>
+          <w:bCs/>
+          <w:b/>
+        </w:rPr>
+        <w:t xml:space="preserve">Dodge</w:t>
+      </w:r>
+      <w:r>
+        <w:t xml:space="preserve"> </w:t>
+      </w:r>
+      <w:r>
+        <w:t xml:space="preserve">9.</w:t>
+      </w:r>
+    </w:p>
+    <w:p>
+      <w:pPr>
+        <w:numPr>
+          <w:ilvl w:val="0"/>
+          <w:numId w:val="1027"/>
+        </w:numPr>
+        <w:pStyle w:val="Compact"/>
+      </w:pPr>
+      <w:r>
+        <w:rPr>
+          <w:bCs/>
+          <w:b/>
+        </w:rPr>
+        <w:t xml:space="preserve">Skills:</w:t>
+      </w:r>
+      <w:r>
+        <w:t xml:space="preserve"> </w:t>
+      </w:r>
+      <w:r>
+        <w:t xml:space="preserve">Persuasion 17 (Specialty). Trained: Leadership 15, Investigation 12, Law 12, Medicine 12, Read People 12, Survival 12, Riding 11, Shooting 11, Athletics 10.</w:t>
+      </w:r>
+    </w:p>
+    <w:p>
+      <w:pPr>
+        <w:numPr>
+          <w:ilvl w:val="0"/>
+          <w:numId w:val="1027"/>
+        </w:numPr>
+        <w:pStyle w:val="Compact"/>
+      </w:pPr>
+      <w:r>
+        <w:rPr>
+          <w:bCs/>
+          <w:b/>
+        </w:rPr>
+        <w:t xml:space="preserve">Edges:</w:t>
+      </w:r>
+      <w:r>
+        <w:t xml:space="preserve"> </w:t>
+      </w:r>
+      <w:r>
+        <w:t xml:space="preserve">+1 attribute point, Second advantage, A friend; second advantage: Unshakable Courage; a friend: Bishop Harrow, who answers her letters and asks no questions.</w:t>
+      </w:r>
+    </w:p>
+    <w:p>
+      <w:pPr>
+        <w:numPr>
+          <w:ilvl w:val="0"/>
+          <w:numId w:val="1027"/>
+        </w:numPr>
+        <w:pStyle w:val="Compact"/>
+      </w:pPr>
+      <w:r>
+        <w:rPr>
+          <w:bCs/>
+          <w:b/>
+        </w:rPr>
+        <w:t xml:space="preserve">Advantage:</w:t>
+      </w:r>
+      <w:r>
+        <w:t xml:space="preserve"> </w:t>
+      </w:r>
+      <w:r>
+        <w:t xml:space="preserve">Hellfire Preacher.</w:t>
+      </w:r>
+      <w:r>
+        <w:t xml:space="preserve"> </w:t>
+      </w:r>
+      <w:r>
+        <w:rPr>
+          <w:bCs/>
+          <w:b/>
+        </w:rPr>
+        <w:t xml:space="preserve">Complication:</w:t>
+      </w:r>
+      <w:r>
+        <w:t xml:space="preserve"> </w:t>
+      </w:r>
+      <w:r>
+        <w:t xml:space="preserve">Protects Others at Personal Risk; trigger: townsfolk are caught in the crossfire.</w:t>
+      </w:r>
+    </w:p>
+    <w:p>
+      <w:pPr>
+        <w:numPr>
+          <w:ilvl w:val="0"/>
+          <w:numId w:val="1027"/>
+        </w:numPr>
+        <w:pStyle w:val="Compact"/>
+      </w:pPr>
+      <w:r>
+        <w:rPr>
+          <w:bCs/>
+          <w:b/>
+        </w:rPr>
+        <w:t xml:space="preserve">Why I face the dark:</w:t>
+      </w:r>
+      <w:r>
+        <w:t xml:space="preserve"> </w:t>
+      </w:r>
+      <w:r>
+        <w:t xml:space="preserve">The Lord sent me here for a reason, and I believe this is it.</w:t>
+      </w:r>
+      <w:r>
+        <w:t xml:space="preserve"> </w:t>
+      </w:r>
+      <w:r>
+        <w:rPr>
+          <w:bCs/>
+          <w:b/>
+        </w:rPr>
+        <w:t xml:space="preserve">Connection:</w:t>
+      </w:r>
+      <w:r>
+        <w:t xml:space="preserve"> </w:t>
+      </w:r>
+      <w:r>
         <w:t xml:space="preserve">Keeps Dr. Webb’s secret, and his whiskey hidden.</w:t>
       </w:r>
     </w:p>
-    <w:bookmarkEnd w:id="93"/>
     <w:bookmarkEnd w:id="94"/>
-    <w:bookmarkStart w:id="95" w:name="advantages"/>
+    <w:bookmarkEnd w:id="95"/>
+    <w:bookmarkStart w:id="96" w:name="advantages"/>
     <w:p>
       <w:pPr>
         <w:pStyle w:val="Heading1"/>
@@ -22014,8 +22447,8 @@
         <w:t xml:space="preserve">A badge is legal authority, not a magic word: outlaws and the powerful don’t always care about it, and it carries a duty. Your superiors can give you orders, and abusing the badge or failing in your duty can cost you it. Law callings (Marshal, Deputy) usually take one, as their advantage or as a second advantage Edge. A Pinkerton detective takes Pinkerton Credentials instead: the agency’s reach and files, but no badge.</w:t>
       </w:r>
     </w:p>
-    <w:bookmarkEnd w:id="95"/>
-    <w:bookmarkStart w:id="111" w:name="origins"/>
+    <w:bookmarkEnd w:id="96"/>
+    <w:bookmarkStart w:id="112" w:name="origins"/>
     <w:p>
       <w:pPr>
         <w:pStyle w:val="Heading1"/>
@@ -23005,7 +23438,7 @@
         </w:tc>
       </w:tr>
     </w:tbl>
-    <w:bookmarkStart w:id="96" w:name="shared-rules"/>
+    <w:bookmarkStart w:id="97" w:name="shared-rules"/>
     <w:p>
       <w:pPr>
         <w:pStyle w:val="Heading2"/>
@@ -23207,8 +23640,8 @@
         </w:tc>
       </w:tr>
     </w:tbl>
-    <w:bookmarkEnd w:id="96"/>
-    <w:bookmarkStart w:id="97" w:name="city-bred"/>
+    <w:bookmarkEnd w:id="97"/>
+    <w:bookmarkStart w:id="98" w:name="city-bred"/>
     <w:p>
       <w:pPr>
         <w:pStyle w:val="Heading2"/>
@@ -23459,8 +23892,8 @@
         </w:tc>
       </w:tr>
     </w:tbl>
-    <w:bookmarkEnd w:id="97"/>
-    <w:bookmarkStart w:id="98" w:name="drifter"/>
+    <w:bookmarkEnd w:id="98"/>
+    <w:bookmarkStart w:id="99" w:name="drifter"/>
     <w:p>
       <w:pPr>
         <w:pStyle w:val="Heading2"/>
@@ -23711,8 +24144,8 @@
         </w:tc>
       </w:tr>
     </w:tbl>
-    <w:bookmarkEnd w:id="98"/>
-    <w:bookmarkStart w:id="99" w:name="frontier-born"/>
+    <w:bookmarkEnd w:id="99"/>
+    <w:bookmarkStart w:id="100" w:name="frontier-born"/>
     <w:p>
       <w:pPr>
         <w:pStyle w:val="Heading2"/>
@@ -23963,8 +24396,8 @@
         </w:tc>
       </w:tr>
     </w:tbl>
-    <w:bookmarkEnd w:id="99"/>
-    <w:bookmarkStart w:id="100" w:name="immigrant"/>
+    <w:bookmarkEnd w:id="100"/>
+    <w:bookmarkStart w:id="101" w:name="immigrant"/>
     <w:p>
       <w:pPr>
         <w:pStyle w:val="Heading2"/>
@@ -24215,8 +24648,8 @@
         </w:tc>
       </w:tr>
     </w:tbl>
-    <w:bookmarkEnd w:id="100"/>
-    <w:bookmarkStart w:id="101" w:name="old-money"/>
+    <w:bookmarkEnd w:id="101"/>
+    <w:bookmarkStart w:id="102" w:name="old-money"/>
     <w:p>
       <w:pPr>
         <w:pStyle w:val="Heading2"/>
@@ -24467,8 +24900,8 @@
         </w:tc>
       </w:tr>
     </w:tbl>
-    <w:bookmarkEnd w:id="101"/>
-    <w:bookmarkStart w:id="102" w:name="railroad-hand"/>
+    <w:bookmarkEnd w:id="102"/>
+    <w:bookmarkStart w:id="103" w:name="railroad-hand"/>
     <w:p>
       <w:pPr>
         <w:pStyle w:val="Heading2"/>
@@ -24719,8 +25152,8 @@
         </w:tc>
       </w:tr>
     </w:tbl>
-    <w:bookmarkEnd w:id="102"/>
-    <w:bookmarkStart w:id="103" w:name="war-veteran"/>
+    <w:bookmarkEnd w:id="103"/>
+    <w:bookmarkStart w:id="104" w:name="war-veteran"/>
     <w:p>
       <w:pPr>
         <w:pStyle w:val="Heading2"/>
@@ -24971,8 +25404,8 @@
         </w:tc>
       </w:tr>
     </w:tbl>
-    <w:bookmarkEnd w:id="103"/>
-    <w:bookmarkStart w:id="104" w:name="sighted"/>
+    <w:bookmarkEnd w:id="104"/>
+    <w:bookmarkStart w:id="105" w:name="sighted"/>
     <w:p>
       <w:pPr>
         <w:pStyle w:val="Heading2"/>
@@ -25017,7 +25450,7 @@
       <w:pPr>
         <w:numPr>
           <w:ilvl w:val="0"/>
-          <w:numId w:val="1027"/>
+          <w:numId w:val="1028"/>
         </w:numPr>
         <w:pStyle w:val="Compact"/>
       </w:pPr>
@@ -25247,8 +25680,8 @@
         </w:tc>
       </w:tr>
     </w:tbl>
-    <w:bookmarkEnd w:id="104"/>
-    <w:bookmarkStart w:id="105" w:name="dhampir"/>
+    <w:bookmarkEnd w:id="105"/>
+    <w:bookmarkStart w:id="106" w:name="dhampir"/>
     <w:p>
       <w:pPr>
         <w:pStyle w:val="Heading2"/>
@@ -25293,7 +25726,7 @@
       <w:pPr>
         <w:numPr>
           <w:ilvl w:val="0"/>
-          <w:numId w:val="1028"/>
+          <w:numId w:val="1029"/>
         </w:numPr>
         <w:pStyle w:val="Compact"/>
       </w:pPr>
@@ -25305,7 +25738,7 @@
       <w:pPr>
         <w:numPr>
           <w:ilvl w:val="0"/>
-          <w:numId w:val="1028"/>
+          <w:numId w:val="1029"/>
         </w:numPr>
         <w:pStyle w:val="Compact"/>
       </w:pPr>
@@ -25317,7 +25750,7 @@
       <w:pPr>
         <w:numPr>
           <w:ilvl w:val="0"/>
-          <w:numId w:val="1028"/>
+          <w:numId w:val="1029"/>
         </w:numPr>
         <w:pStyle w:val="Compact"/>
       </w:pPr>
@@ -25547,8 +25980,8 @@
         </w:tc>
       </w:tr>
     </w:tbl>
-    <w:bookmarkEnd w:id="105"/>
-    <w:bookmarkStart w:id="106" w:name="practitioner"/>
+    <w:bookmarkEnd w:id="106"/>
+    <w:bookmarkStart w:id="107" w:name="practitioner"/>
     <w:p>
       <w:pPr>
         <w:pStyle w:val="Heading2"/>
@@ -25593,7 +26026,7 @@
       <w:pPr>
         <w:numPr>
           <w:ilvl w:val="0"/>
-          <w:numId w:val="1029"/>
+          <w:numId w:val="1030"/>
         </w:numPr>
         <w:pStyle w:val="Compact"/>
       </w:pPr>
@@ -25605,7 +26038,7 @@
       <w:pPr>
         <w:numPr>
           <w:ilvl w:val="0"/>
-          <w:numId w:val="1029"/>
+          <w:numId w:val="1030"/>
         </w:numPr>
         <w:pStyle w:val="Compact"/>
       </w:pPr>
@@ -25617,7 +26050,7 @@
       <w:pPr>
         <w:numPr>
           <w:ilvl w:val="0"/>
-          <w:numId w:val="1029"/>
+          <w:numId w:val="1030"/>
         </w:numPr>
         <w:pStyle w:val="Compact"/>
       </w:pPr>
@@ -26219,8 +26652,8 @@
         </w:tc>
       </w:tr>
     </w:tbl>
-    <w:bookmarkEnd w:id="106"/>
-    <w:bookmarkStart w:id="107" w:name="revenant"/>
+    <w:bookmarkEnd w:id="107"/>
+    <w:bookmarkStart w:id="108" w:name="revenant"/>
     <w:p>
       <w:pPr>
         <w:pStyle w:val="Heading2"/>
@@ -26265,7 +26698,7 @@
       <w:pPr>
         <w:numPr>
           <w:ilvl w:val="0"/>
-          <w:numId w:val="1030"/>
+          <w:numId w:val="1031"/>
         </w:numPr>
         <w:pStyle w:val="Compact"/>
       </w:pPr>
@@ -26277,7 +26710,7 @@
       <w:pPr>
         <w:numPr>
           <w:ilvl w:val="0"/>
-          <w:numId w:val="1030"/>
+          <w:numId w:val="1031"/>
         </w:numPr>
         <w:pStyle w:val="Compact"/>
       </w:pPr>
@@ -26289,7 +26722,7 @@
       <w:pPr>
         <w:numPr>
           <w:ilvl w:val="0"/>
-          <w:numId w:val="1030"/>
+          <w:numId w:val="1031"/>
         </w:numPr>
         <w:pStyle w:val="Compact"/>
       </w:pPr>
@@ -26519,8 +26952,8 @@
         </w:tc>
       </w:tr>
     </w:tbl>
-    <w:bookmarkEnd w:id="107"/>
-    <w:bookmarkStart w:id="108" w:name="werewolf"/>
+    <w:bookmarkEnd w:id="108"/>
+    <w:bookmarkStart w:id="109" w:name="werewolf"/>
     <w:p>
       <w:pPr>
         <w:pStyle w:val="Heading2"/>
@@ -26565,7 +26998,7 @@
       <w:pPr>
         <w:numPr>
           <w:ilvl w:val="0"/>
-          <w:numId w:val="1031"/>
+          <w:numId w:val="1032"/>
         </w:numPr>
         <w:pStyle w:val="Compact"/>
       </w:pPr>
@@ -26577,7 +27010,7 @@
       <w:pPr>
         <w:numPr>
           <w:ilvl w:val="0"/>
-          <w:numId w:val="1031"/>
+          <w:numId w:val="1032"/>
         </w:numPr>
         <w:pStyle w:val="Compact"/>
       </w:pPr>
@@ -26589,7 +27022,7 @@
       <w:pPr>
         <w:numPr>
           <w:ilvl w:val="0"/>
-          <w:numId w:val="1031"/>
+          <w:numId w:val="1032"/>
         </w:numPr>
         <w:pStyle w:val="Compact"/>
       </w:pPr>
@@ -26853,8 +27286,8 @@
         </w:tc>
       </w:tr>
     </w:tbl>
-    <w:bookmarkEnd w:id="108"/>
-    <w:bookmarkStart w:id="109" w:name="pact-bound"/>
+    <w:bookmarkEnd w:id="109"/>
+    <w:bookmarkStart w:id="110" w:name="pact-bound"/>
     <w:p>
       <w:pPr>
         <w:pStyle w:val="Heading2"/>
@@ -26899,7 +27332,7 @@
       <w:pPr>
         <w:numPr>
           <w:ilvl w:val="0"/>
-          <w:numId w:val="1032"/>
+          <w:numId w:val="1033"/>
         </w:numPr>
         <w:pStyle w:val="Compact"/>
       </w:pPr>
@@ -26911,7 +27344,7 @@
       <w:pPr>
         <w:numPr>
           <w:ilvl w:val="0"/>
-          <w:numId w:val="1032"/>
+          <w:numId w:val="1033"/>
         </w:numPr>
         <w:pStyle w:val="Compact"/>
       </w:pPr>
@@ -26923,7 +27356,7 @@
       <w:pPr>
         <w:numPr>
           <w:ilvl w:val="0"/>
-          <w:numId w:val="1032"/>
+          <w:numId w:val="1033"/>
         </w:numPr>
         <w:pStyle w:val="Compact"/>
       </w:pPr>
@@ -27153,8 +27586,8 @@
         </w:tc>
       </w:tr>
     </w:tbl>
-    <w:bookmarkEnd w:id="109"/>
-    <w:bookmarkStart w:id="110" w:name="vampire"/>
+    <w:bookmarkEnd w:id="110"/>
+    <w:bookmarkStart w:id="111" w:name="vampire"/>
     <w:p>
       <w:pPr>
         <w:pStyle w:val="Heading2"/>
@@ -27199,7 +27632,7 @@
       <w:pPr>
         <w:numPr>
           <w:ilvl w:val="0"/>
-          <w:numId w:val="1033"/>
+          <w:numId w:val="1034"/>
         </w:numPr>
         <w:pStyle w:val="Compact"/>
       </w:pPr>
@@ -27211,7 +27644,7 @@
       <w:pPr>
         <w:numPr>
           <w:ilvl w:val="0"/>
-          <w:numId w:val="1033"/>
+          <w:numId w:val="1034"/>
         </w:numPr>
         <w:pStyle w:val="Compact"/>
       </w:pPr>
@@ -27223,7 +27656,7 @@
       <w:pPr>
         <w:numPr>
           <w:ilvl w:val="0"/>
-          <w:numId w:val="1033"/>
+          <w:numId w:val="1034"/>
         </w:numPr>
         <w:pStyle w:val="Compact"/>
       </w:pPr>
@@ -27235,7 +27668,7 @@
       <w:pPr>
         <w:numPr>
           <w:ilvl w:val="0"/>
-          <w:numId w:val="1033"/>
+          <w:numId w:val="1034"/>
         </w:numPr>
         <w:pStyle w:val="Compact"/>
       </w:pPr>
@@ -27499,9 +27932,9 @@
         </w:tc>
       </w:tr>
     </w:tbl>
-    <w:bookmarkEnd w:id="110"/>
     <w:bookmarkEnd w:id="111"/>
-    <w:bookmarkStart w:id="122" w:name="making-your-own"/>
+    <w:bookmarkEnd w:id="112"/>
+    <w:bookmarkStart w:id="123" w:name="making-your-own"/>
     <w:p>
       <w:pPr>
         <w:pStyle w:val="Heading1"/>
@@ -27534,7 +27967,7 @@
         <w:t xml:space="preserve">option at the end of each list, and its checklist holds a custom choice to the same rules as everything else.</w:t>
       </w:r>
     </w:p>
-    <w:bookmarkStart w:id="112" w:name="a-custom-calling"/>
+    <w:bookmarkStart w:id="113" w:name="a-custom-calling"/>
     <w:p>
       <w:pPr>
         <w:pStyle w:val="Heading2"/>
@@ -27555,7 +27988,7 @@
       <w:pPr>
         <w:numPr>
           <w:ilvl w:val="0"/>
-          <w:numId w:val="1034"/>
+          <w:numId w:val="1035"/>
         </w:numPr>
         <w:pStyle w:val="Compact"/>
       </w:pPr>
@@ -27601,7 +28034,7 @@
       <w:pPr>
         <w:numPr>
           <w:ilvl w:val="0"/>
-          <w:numId w:val="1034"/>
+          <w:numId w:val="1035"/>
         </w:numPr>
         <w:pStyle w:val="Compact"/>
       </w:pPr>
@@ -27623,7 +28056,7 @@
       <w:pPr>
         <w:numPr>
           <w:ilvl w:val="0"/>
-          <w:numId w:val="1034"/>
+          <w:numId w:val="1035"/>
         </w:numPr>
         <w:pStyle w:val="Compact"/>
       </w:pPr>
@@ -27645,7 +28078,7 @@
       <w:pPr>
         <w:numPr>
           <w:ilvl w:val="0"/>
-          <w:numId w:val="1034"/>
+          <w:numId w:val="1035"/>
         </w:numPr>
         <w:pStyle w:val="Compact"/>
       </w:pPr>
@@ -27710,8 +28143,8 @@
         <w:t xml:space="preserve">.</w:t>
       </w:r>
     </w:p>
-    <w:bookmarkEnd w:id="112"/>
-    <w:bookmarkStart w:id="121" w:name="a-custom-origin"/>
+    <w:bookmarkEnd w:id="113"/>
+    <w:bookmarkStart w:id="122" w:name="a-custom-origin"/>
     <w:p>
       <w:pPr>
         <w:pStyle w:val="Heading2"/>
@@ -27728,7 +28161,7 @@
         <w:t xml:space="preserve">Build it with the GM, one step at a time.</w:t>
       </w:r>
     </w:p>
-    <w:bookmarkStart w:id="113" w:name="the-concept"/>
+    <w:bookmarkStart w:id="114" w:name="the-concept"/>
     <w:p>
       <w:pPr>
         <w:pStyle w:val="Heading3"/>
@@ -27745,8 +28178,8 @@
         <w:t xml:space="preserve">Two or three sentences: where they come from, what sets them apart, and how others see them. It should be something the origins in this book don’t already cover.</w:t>
       </w:r>
     </w:p>
-    <w:bookmarkEnd w:id="113"/>
-    <w:bookmarkStart w:id="114" w:name="the-tier"/>
+    <w:bookmarkEnd w:id="114"/>
+    <w:bookmarkStart w:id="115" w:name="the-tier"/>
     <w:p>
       <w:pPr>
         <w:pStyle w:val="Heading3"/>
@@ -28043,8 +28476,8 @@
         <w:t xml:space="preserve">When in doubt, choose the higher tier.</w:t>
       </w:r>
     </w:p>
-    <w:bookmarkEnd w:id="114"/>
-    <w:bookmarkStart w:id="115" w:name="attribute-adjustments"/>
+    <w:bookmarkEnd w:id="115"/>
+    <w:bookmarkStart w:id="116" w:name="attribute-adjustments"/>
     <w:p>
       <w:pPr>
         <w:pStyle w:val="Heading3"/>
@@ -28090,8 +28523,8 @@
         <w:t xml:space="preserve">: a +2 needs a −2 or two −1s. The adjustments move the attribute’s base (+1 starts it at 11) and raise its starting maximum (13 plus the bonus). Most origins change two to four attributes.</w:t>
       </w:r>
     </w:p>
-    <w:bookmarkEnd w:id="115"/>
-    <w:bookmarkStart w:id="116" w:name="core-rules-tier-1-and-up"/>
+    <w:bookmarkEnd w:id="116"/>
+    <w:bookmarkStart w:id="117" w:name="core-rules-tier-1-and-up"/>
     <w:p>
       <w:pPr>
         <w:pStyle w:val="Heading3"/>
@@ -28108,8 +28541,8 @@
         <w:t xml:space="preserve">One to three short rules that always apply: what they can do (see in the dark, resist cold, a free Trained skill) and what it costs (a weakness, a people’s distrust, a hazard they can’t abide). A strength with no drawback is worth more than it looks, so price it a tier higher.</w:t>
       </w:r>
     </w:p>
-    <w:bookmarkEnd w:id="116"/>
-    <w:bookmarkStart w:id="117" w:name="origin-advantages"/>
+    <w:bookmarkEnd w:id="117"/>
+    <w:bookmarkStart w:id="118" w:name="origin-advantages"/>
     <w:p>
       <w:pPr>
         <w:pStyle w:val="Heading3"/>
@@ -28164,8 +28597,8 @@
         <w:t xml:space="preserve">: a problem the trait causes, with a clear trigger and a real consequence, which earns a Grit point when it bites, like any complication. A character takes one advantage, general or origin, so make them distinct choices.</w:t>
       </w:r>
     </w:p>
-    <w:bookmarkEnd w:id="117"/>
-    <w:bookmarkStart w:id="118" w:name="an-alternate-form-optional-tier-2-or-3"/>
+    <w:bookmarkEnd w:id="118"/>
+    <w:bookmarkStart w:id="119" w:name="an-alternate-form-optional-tier-2-or-3"/>
     <w:p>
       <w:pPr>
         <w:pStyle w:val="Heading3"/>
@@ -28198,8 +28631,8 @@
         <w:t xml:space="preserve">apply.</w:t>
       </w:r>
     </w:p>
-    <w:bookmarkEnd w:id="118"/>
-    <w:bookmarkStart w:id="119" w:name="in-the-creator"/>
+    <w:bookmarkEnd w:id="119"/>
+    <w:bookmarkStart w:id="120" w:name="in-the-creator"/>
     <w:p>
       <w:pPr>
         <w:pStyle w:val="Heading3"/>
@@ -28212,7 +28645,7 @@
       <w:pPr>
         <w:numPr>
           <w:ilvl w:val="0"/>
-          <w:numId w:val="1035"/>
+          <w:numId w:val="1036"/>
         </w:numPr>
         <w:pStyle w:val="Compact"/>
       </w:pPr>
@@ -28240,7 +28673,7 @@
       <w:pPr>
         <w:numPr>
           <w:ilvl w:val="0"/>
-          <w:numId w:val="1035"/>
+          <w:numId w:val="1036"/>
         </w:numPr>
         <w:pStyle w:val="Compact"/>
       </w:pPr>
@@ -28252,7 +28685,7 @@
       <w:pPr>
         <w:numPr>
           <w:ilvl w:val="0"/>
-          <w:numId w:val="1035"/>
+          <w:numId w:val="1036"/>
         </w:numPr>
         <w:pStyle w:val="Compact"/>
       </w:pPr>
@@ -28280,7 +28713,7 @@
       <w:pPr>
         <w:numPr>
           <w:ilvl w:val="0"/>
-          <w:numId w:val="1035"/>
+          <w:numId w:val="1036"/>
         </w:numPr>
         <w:pStyle w:val="Compact"/>
       </w:pPr>
@@ -28304,8 +28737,8 @@
         <w:t xml:space="preserve">and enter the advantage and its companion complication.</w:t>
       </w:r>
     </w:p>
-    <w:bookmarkEnd w:id="119"/>
-    <w:bookmarkStart w:id="120" w:name="example"/>
+    <w:bookmarkEnd w:id="120"/>
+    <w:bookmarkStart w:id="121" w:name="example"/>
     <w:p>
       <w:pPr>
         <w:pStyle w:val="Heading3"/>
@@ -28410,10 +28843,10 @@
         <w:t xml:space="preserve">: something from the other side follows you; when it matters, accept the chill, the stopped clock or the panicked horse.</w:t>
       </w:r>
     </w:p>
-    <w:bookmarkEnd w:id="120"/>
     <w:bookmarkEnd w:id="121"/>
     <w:bookmarkEnd w:id="122"/>
-    <w:bookmarkStart w:id="123" w:name="complications"/>
+    <w:bookmarkEnd w:id="123"/>
+    <w:bookmarkStart w:id="124" w:name="complications"/>
     <w:p>
       <w:pPr>
         <w:pStyle w:val="Heading1"/>
@@ -29118,8 +29551,8 @@
         </w:tc>
       </w:tr>
     </w:tbl>
-    <w:bookmarkEnd w:id="123"/>
-    <w:bookmarkStart w:id="125" w:name="quick-reference"/>
+    <w:bookmarkEnd w:id="124"/>
+    <w:bookmarkStart w:id="126" w:name="quick-reference"/>
     <w:p>
       <w:pPr>
         <w:pStyle w:val="Heading1"/>
@@ -29310,7 +29743,7 @@
       <w:r>
         <w:t xml:space="preserve"> </w:t>
       </w:r>
-      <w:hyperlink r:id="rId124">
+      <w:hyperlink r:id="rId125">
         <w:r>
           <w:rPr>
             <w:rStyle w:val="Hyperlink"/>
@@ -29322,7 +29755,7 @@
         <w:t xml:space="preserve">. You may share, adapt, and use it for any purpose, including commercially, as long as you give appropriate credit to the author.</w:t>
       </w:r>
     </w:p>
-    <w:bookmarkEnd w:id="125"/>
+    <w:bookmarkEnd w:id="126"/>
     <w:sectPr/>
   </w:body>
 </w:document>
@@ -29693,6 +30126,9 @@
     <w:abstractNumId w:val="991"/>
   </w:num>
   <w:num w:numId="1016">
+    <w:abstractNumId w:val="991"/>
+  </w:num>
+  <w:num w:numId="1017">
     <w:abstractNumId w:val="99411"/>
     <w:lvlOverride w:ilvl="0">
       <w:startOverride w:val="1"/>
@@ -29722,10 +30158,10 @@
       <w:startOverride w:val="1"/>
     </w:lvlOverride>
   </w:num>
-  <w:num w:numId="1017">
+  <w:num w:numId="1018">
     <w:abstractNumId w:val="991"/>
   </w:num>
-  <w:num w:numId="1018">
+  <w:num w:numId="1019">
     <w:abstractNumId w:val="99411"/>
     <w:lvlOverride w:ilvl="0">
       <w:startOverride w:val="1"/>
@@ -29754,9 +30190,6 @@
     <w:lvlOverride w:ilvl="8">
       <w:startOverride w:val="1"/>
     </w:lvlOverride>
-  </w:num>
-  <w:num w:numId="1019">
-    <w:abstractNumId w:val="991"/>
   </w:num>
   <w:num w:numId="1020">
     <w:abstractNumId w:val="991"/>
@@ -29801,6 +30234,9 @@
     <w:abstractNumId w:val="991"/>
   </w:num>
   <w:num w:numId="1034">
+    <w:abstractNumId w:val="991"/>
+  </w:num>
+  <w:num w:numId="1035">
     <w:abstractNumId w:val="99411"/>
     <w:lvlOverride w:ilvl="0">
       <w:startOverride w:val="1"/>
@@ -29830,7 +30266,7 @@
       <w:startOverride w:val="1"/>
     </w:lvlOverride>
   </w:num>
-  <w:num w:numId="1035">
+  <w:num w:numId="1036">
     <w:abstractNumId w:val="99411"/>
     <w:lvlOverride w:ilvl="0">
       <w:startOverride w:val="1"/>

</xml_diff>

<commit_message>
Trails: the Wraith, the Banshee and the Headless Rider
Three new threats with their weaknesses: the Wraith (hurt only by silver,
cold iron, salt and fire; its touch drinks life), the Banshee (an omen who
can't be hurt; her keen dazes and marks one person until dawn) and the
Headless Rider (a hell-ridden revenant who rests only when its head is laid
back in the grave). They appear in the Players' Guide, the GM view and the
battle map.

Co-Authored-By: Claude Opus 5.5 <noreply@anthropic.com>
Claude-Session: https://claude.ai/code/session_015SADCFzhKijkC2foUmXrpC
</commit_message>
<xml_diff>
--- a/legend-dynamics/site/trails-of-blood-and-dust/Trails_of_Blood_Dust_Players_Guide.docx
+++ b/legend-dynamics/site/trails-of-blood-and-dust/Trails_of_Blood_Dust_Players_Guide.docx
@@ -19055,6 +19055,72 @@
                 <w:b/>
                 <w:sz w:val="19"/>
               </w:rPr>
+              <w:t xml:space="preserve">Wraith</w:t>
+            </w:r>
+          </w:p>
+        </w:tc>
+        <w:tc>
+          <w:tcPr/>
+          <w:p>
+            <w:pPr>
+              <w:pStyle w:val="Compact"/>
+              <w:jc w:val="left"/>
+            </w:pPr>
+            <w:r>
+              <w:rPr>
+                <w:sz w:val="19"/>
+              </w:rPr>
+              <w:t xml:space="preserve">Only silver, cold iron, salt and fire hurt it. It can’t cross a line of salt or iron filings. Destroyed for good only when its bones are found and burned.</w:t>
+            </w:r>
+          </w:p>
+        </w:tc>
+      </w:tr>
+      <w:tr>
+        <w:tc>
+          <w:tcPr/>
+          <w:p>
+            <w:pPr>
+              <w:pStyle w:val="Compact"/>
+              <w:jc w:val="left"/>
+            </w:pPr>
+            <w:r>
+              <w:rPr>
+                <w:b/>
+                <w:sz w:val="19"/>
+              </w:rPr>
+              <w:t xml:space="preserve">Banshee</w:t>
+            </w:r>
+          </w:p>
+        </w:tc>
+        <w:tc>
+          <w:tcPr/>
+          <w:p>
+            <w:pPr>
+              <w:pStyle w:val="Compact"/>
+              <w:jc w:val="left"/>
+            </w:pPr>
+            <w:r>
+              <w:rPr>
+                <w:sz w:val="19"/>
+              </w:rPr>
+              <w:t xml:space="preserve">Weapons don’t touch her. She leaves at dawn if the one she keens for is still alive. A hit with silver, or an iron bell rung at her, silences her for the scene.</w:t>
+            </w:r>
+          </w:p>
+        </w:tc>
+      </w:tr>
+      <w:tr>
+        <w:tc>
+          <w:tcPr/>
+          <w:p>
+            <w:pPr>
+              <w:pStyle w:val="Compact"/>
+              <w:jc w:val="left"/>
+            </w:pPr>
+            <w:r>
+              <w:rPr>
+                <w:b/>
+                <w:sz w:val="19"/>
+              </w:rPr>
               <w:t xml:space="preserve">Ghoul</w:t>
             </w:r>
           </w:p>
@@ -19104,6 +19170,39 @@
                 <w:sz w:val="19"/>
               </w:rPr>
               <w:t xml:space="preserve">Holy water burns it; a ritual banishes it. It must keep a bargain to the letter.</w:t>
+            </w:r>
+          </w:p>
+        </w:tc>
+      </w:tr>
+      <w:tr>
+        <w:tc>
+          <w:tcPr/>
+          <w:p>
+            <w:pPr>
+              <w:pStyle w:val="Compact"/>
+              <w:jc w:val="left"/>
+            </w:pPr>
+            <w:r>
+              <w:rPr>
+                <w:b/>
+                <w:sz w:val="19"/>
+              </w:rPr>
+              <w:t xml:space="preserve">Headless Rider</w:t>
+            </w:r>
+          </w:p>
+        </w:tc>
+        <w:tc>
+          <w:tcPr/>
+          <w:p>
+            <w:pPr>
+              <w:pStyle w:val="Compact"/>
+              <w:jc w:val="left"/>
+            </w:pPr>
+            <w:r>
+              <w:rPr>
+                <w:sz w:val="19"/>
+              </w:rPr>
+              <w:t xml:space="preserve">Its head, hidden near where it died: laid back in the grave, the rider rests for good. It can’t cross running water, so a bridge over a creek is safety.</w:t>
             </w:r>
           </w:p>
         </w:tc>
@@ -19199,6 +19298,50 @@
       </w:r>
       <w:r>
         <w:t xml:space="preserve">A vampire who drains a victim to Dying can choose to turn them.</w:t>
+      </w:r>
+    </w:p>
+    <w:p>
+      <w:pPr>
+        <w:numPr>
+          <w:ilvl w:val="0"/>
+          <w:numId w:val="1021"/>
+        </w:numPr>
+        <w:pStyle w:val="Compact"/>
+      </w:pPr>
+      <w:r>
+        <w:rPr>
+          <w:bCs/>
+          <w:b/>
+        </w:rPr>
+        <w:t xml:space="preserve">A wraith’s touch.</w:t>
+      </w:r>
+      <w:r>
+        <w:t xml:space="preserve"> </w:t>
+      </w:r>
+      <w:r>
+        <w:t xml:space="preserve">Someone killed by it rises as a wraith at the next new moon, unless they’re buried with salt in the coffin.</w:t>
+      </w:r>
+    </w:p>
+    <w:p>
+      <w:pPr>
+        <w:numPr>
+          <w:ilvl w:val="0"/>
+          <w:numId w:val="1021"/>
+        </w:numPr>
+        <w:pStyle w:val="Compact"/>
+      </w:pPr>
+      <w:r>
+        <w:rPr>
+          <w:bCs/>
+          <w:b/>
+        </w:rPr>
+        <w:t xml:space="preserve">A banshee’s keening.</w:t>
+      </w:r>
+      <w:r>
+        <w:t xml:space="preserve"> </w:t>
+      </w:r>
+      <w:r>
+        <w:t xml:space="preserve">She is tied to a family’s blood, not a place: once she has keened for one of a line, she can follow that family from town to town.</w:t>
       </w:r>
     </w:p>
     <w:bookmarkEnd w:id="86"/>
@@ -20147,6 +20290,220 @@
                 <w:b/>
                 <w:sz w:val="19"/>
               </w:rPr>
+              <w:t xml:space="preserve">Wraith</w:t>
+            </w:r>
+          </w:p>
+        </w:tc>
+        <w:tc>
+          <w:tcPr/>
+          <w:p>
+            <w:pPr>
+              <w:pStyle w:val="Compact"/>
+              <w:jc w:val="left"/>
+            </w:pPr>
+            <w:r>
+              <w:rPr>
+                <w:sz w:val="19"/>
+              </w:rPr>
+              <w:t xml:space="preserve">Brawling 13, Stealth 14</w:t>
+            </w:r>
+          </w:p>
+        </w:tc>
+        <w:tc>
+          <w:tcPr/>
+          <w:p>
+            <w:pPr>
+              <w:pStyle w:val="Compact"/>
+              <w:jc w:val="left"/>
+            </w:pPr>
+            <w:r>
+              <w:rPr>
+                <w:sz w:val="19"/>
+              </w:rPr>
+              <w:t xml:space="preserve">10</w:t>
+            </w:r>
+          </w:p>
+        </w:tc>
+        <w:tc>
+          <w:tcPr/>
+          <w:p>
+            <w:pPr>
+              <w:pStyle w:val="Compact"/>
+              <w:jc w:val="left"/>
+            </w:pPr>
+            <w:r>
+              <w:rPr>
+                <w:sz w:val="19"/>
+              </w:rPr>
+              <w:t xml:space="preserve">3</w:t>
+            </w:r>
+          </w:p>
+        </w:tc>
+        <w:tc>
+          <w:tcPr/>
+          <w:p>
+            <w:pPr>
+              <w:pStyle w:val="Compact"/>
+              <w:jc w:val="left"/>
+            </w:pPr>
+            <w:r>
+              <w:rPr>
+                <w:sz w:val="19"/>
+              </w:rPr>
+              <w:t xml:space="preserve">Grave touch (1)</w:t>
+            </w:r>
+          </w:p>
+        </w:tc>
+        <w:tc>
+          <w:tcPr/>
+          <w:p>
+            <w:pPr>
+              <w:pStyle w:val="Compact"/>
+              <w:jc w:val="left"/>
+            </w:pPr>
+            <w:r>
+              <w:rPr>
+                <w:bCs/>
+                <w:b/>
+                <w:sz w:val="19"/>
+              </w:rPr>
+              <w:t xml:space="preserve">Life-drinker.</w:t>
+            </w:r>
+            <w:r>
+              <w:rPr>
+                <w:sz w:val="19"/>
+              </w:rPr>
+              <w:t xml:space="preserve"> </w:t>
+            </w:r>
+            <w:r>
+              <w:rPr>
+                <w:sz w:val="19"/>
+              </w:rPr>
+              <w:t xml:space="preserve">Passes through walls; only silver, cold iron, salt or fire can hurt it. Each box its touch marks clears one of its own.</w:t>
+            </w:r>
+          </w:p>
+        </w:tc>
+      </w:tr>
+      <w:tr>
+        <w:tc>
+          <w:tcPr/>
+          <w:p>
+            <w:pPr>
+              <w:pStyle w:val="Compact"/>
+              <w:jc w:val="left"/>
+            </w:pPr>
+            <w:r>
+              <w:rPr>
+                <w:b/>
+                <w:sz w:val="19"/>
+              </w:rPr>
+              <w:t xml:space="preserve">Banshee</w:t>
+            </w:r>
+          </w:p>
+        </w:tc>
+        <w:tc>
+          <w:tcPr/>
+          <w:p>
+            <w:pPr>
+              <w:pStyle w:val="Compact"/>
+              <w:jc w:val="left"/>
+            </w:pPr>
+            <w:r>
+              <w:rPr>
+                <w:sz w:val="19"/>
+              </w:rPr>
+              <w:t xml:space="preserve">Will 15</w:t>
+            </w:r>
+          </w:p>
+        </w:tc>
+        <w:tc>
+          <w:tcPr/>
+          <w:p>
+            <w:pPr>
+              <w:pStyle w:val="Compact"/>
+              <w:jc w:val="left"/>
+            </w:pPr>
+            <w:r>
+              <w:rPr>
+                <w:sz w:val="19"/>
+              </w:rPr>
+              <w:t xml:space="preserve">—</w:t>
+            </w:r>
+          </w:p>
+        </w:tc>
+        <w:tc>
+          <w:tcPr/>
+          <w:p>
+            <w:pPr>
+              <w:pStyle w:val="Compact"/>
+              <w:jc w:val="left"/>
+            </w:pPr>
+            <w:r>
+              <w:rPr>
+                <w:sz w:val="19"/>
+              </w:rPr>
+              <w:t xml:space="preserve">—</w:t>
+            </w:r>
+          </w:p>
+        </w:tc>
+        <w:tc>
+          <w:tcPr/>
+          <w:p>
+            <w:pPr>
+              <w:pStyle w:val="Compact"/>
+              <w:jc w:val="left"/>
+            </w:pPr>
+            <w:r>
+              <w:rPr>
+                <w:sz w:val="19"/>
+              </w:rPr>
+              <w:t xml:space="preserve">The keen</w:t>
+            </w:r>
+          </w:p>
+        </w:tc>
+        <w:tc>
+          <w:tcPr/>
+          <w:p>
+            <w:pPr>
+              <w:pStyle w:val="Compact"/>
+              <w:jc w:val="left"/>
+            </w:pPr>
+            <w:r>
+              <w:rPr>
+                <w:bCs/>
+                <w:b/>
+                <w:sz w:val="19"/>
+              </w:rPr>
+              <w:t xml:space="preserve">Death-omen.</w:t>
+            </w:r>
+            <w:r>
+              <w:rPr>
+                <w:sz w:val="19"/>
+              </w:rPr>
+              <w:t xml:space="preserve"> </w:t>
+            </w:r>
+            <w:r>
+              <w:rPr>
+                <w:sz w:val="19"/>
+              </w:rPr>
+              <w:t xml:space="preserve">Can’t be hurt. Once per scene her keen makes everyone in earshot roll Will or be Dazed for a round. Until dawn, the one she keens for can’t shrug off a telling hit with Grit, and stabilizing them is at −2.</w:t>
+            </w:r>
+          </w:p>
+        </w:tc>
+      </w:tr>
+      <w:tr>
+        <w:tc>
+          <w:tcPr/>
+          <w:p>
+            <w:pPr>
+              <w:pStyle w:val="Compact"/>
+              <w:jc w:val="left"/>
+            </w:pPr>
+            <w:r>
+              <w:rPr>
+                <w:b/>
+                <w:sz w:val="19"/>
+              </w:rPr>
               <w:t xml:space="preserve">Witch</w:t>
             </w:r>
           </w:p>
@@ -20451,6 +20808,113 @@
                 <w:sz w:val="19"/>
               </w:rPr>
               <w:t xml:space="preserve">Rises at the next midnight unless its grave is salted and burned.</w:t>
+            </w:r>
+          </w:p>
+        </w:tc>
+      </w:tr>
+      <w:tr>
+        <w:tc>
+          <w:tcPr/>
+          <w:p>
+            <w:pPr>
+              <w:pStyle w:val="Compact"/>
+              <w:jc w:val="left"/>
+            </w:pPr>
+            <w:r>
+              <w:rPr>
+                <w:b/>
+                <w:sz w:val="19"/>
+              </w:rPr>
+              <w:t xml:space="preserve">Headless Rider</w:t>
+            </w:r>
+          </w:p>
+        </w:tc>
+        <w:tc>
+          <w:tcPr/>
+          <w:p>
+            <w:pPr>
+              <w:pStyle w:val="Compact"/>
+              <w:jc w:val="left"/>
+            </w:pPr>
+            <w:r>
+              <w:rPr>
+                <w:sz w:val="19"/>
+              </w:rPr>
+              <w:t xml:space="preserve">Melee 14, Shooting 13</w:t>
+            </w:r>
+          </w:p>
+        </w:tc>
+        <w:tc>
+          <w:tcPr/>
+          <w:p>
+            <w:pPr>
+              <w:pStyle w:val="Compact"/>
+              <w:jc w:val="left"/>
+            </w:pPr>
+            <w:r>
+              <w:rPr>
+                <w:sz w:val="19"/>
+              </w:rPr>
+              <w:t xml:space="preserve">10</w:t>
+            </w:r>
+          </w:p>
+        </w:tc>
+        <w:tc>
+          <w:tcPr/>
+          <w:p>
+            <w:pPr>
+              <w:pStyle w:val="Compact"/>
+              <w:jc w:val="left"/>
+            </w:pPr>
+            <w:r>
+              <w:rPr>
+                <w:sz w:val="19"/>
+              </w:rPr>
+              <w:t xml:space="preserve">4</w:t>
+            </w:r>
+          </w:p>
+        </w:tc>
+        <w:tc>
+          <w:tcPr/>
+          <w:p>
+            <w:pPr>
+              <w:pStyle w:val="Compact"/>
+              <w:jc w:val="left"/>
+            </w:pPr>
+            <w:r>
+              <w:rPr>
+                <w:sz w:val="19"/>
+              </w:rPr>
+              <w:t xml:space="preserve">Saber (2), revolver</w:t>
+            </w:r>
+          </w:p>
+        </w:tc>
+        <w:tc>
+          <w:tcPr/>
+          <w:p>
+            <w:pPr>
+              <w:pStyle w:val="Compact"/>
+              <w:jc w:val="left"/>
+            </w:pPr>
+            <w:r>
+              <w:rPr>
+                <w:bCs/>
+                <w:b/>
+                <w:sz w:val="19"/>
+              </w:rPr>
+              <w:t xml:space="preserve">Hell-ridden.</w:t>
+            </w:r>
+            <w:r>
+              <w:rPr>
+                <w:sz w:val="19"/>
+              </w:rPr>
+              <w:t xml:space="preserve"> </w:t>
+            </w:r>
+            <w:r>
+              <w:rPr>
+                <w:sz w:val="19"/>
+              </w:rPr>
+              <w:t xml:space="preserve">Its horse never tires: Riding 15 in a chase. No head to stun or aim at. Rises at the next midnight unless its head is laid back in its grave.</w:t>
             </w:r>
           </w:p>
         </w:tc>

</xml_diff>

<commit_message>
Trails: the Wendigo and the Skinwalker
The Wendigo, a winter hunger-spirit hurt properly only by fire, with the
Hunger curse for those who eat human flesh to survive; and the Skinwalker,
a witch who steals shapes and voices, mortal in its own shape and forced
back into it by its true name.

Co-Authored-By: Claude Opus 5.5 <noreply@anthropic.com>
Claude-Session: https://claude.ai/code/session_015SADCFzhKijkC2foUmXrpC
</commit_message>
<xml_diff>
--- a/legend-dynamics/site/trails-of-blood-and-dust/Trails_of_Blood_Dust_Players_Guide.docx
+++ b/legend-dynamics/site/trails-of-blood-and-dust/Trails_of_Blood_Dust_Players_Guide.docx
@@ -19187,6 +19187,72 @@
                 <w:b/>
                 <w:sz w:val="19"/>
               </w:rPr>
+              <w:t xml:space="preserve">Wendigo</w:t>
+            </w:r>
+          </w:p>
+        </w:tc>
+        <w:tc>
+          <w:tcPr/>
+          <w:p>
+            <w:pPr>
+              <w:pStyle w:val="Compact"/>
+              <w:jc w:val="left"/>
+            </w:pPr>
+            <w:r>
+              <w:rPr>
+                <w:sz w:val="19"/>
+              </w:rPr>
+              <w:t xml:space="preserve">Fire: the only thing that truly hurts it. It is destroyed for good only when its heart of ice is cut out and burned. It is strongest in deep winter and weakest in summer heat.</w:t>
+            </w:r>
+          </w:p>
+        </w:tc>
+      </w:tr>
+      <w:tr>
+        <w:tc>
+          <w:tcPr/>
+          <w:p>
+            <w:pPr>
+              <w:pStyle w:val="Compact"/>
+              <w:jc w:val="left"/>
+            </w:pPr>
+            <w:r>
+              <w:rPr>
+                <w:b/>
+                <w:sz w:val="19"/>
+              </w:rPr>
+              <w:t xml:space="preserve">Skinwalker</w:t>
+            </w:r>
+          </w:p>
+        </w:tc>
+        <w:tc>
+          <w:tcPr/>
+          <w:p>
+            <w:pPr>
+              <w:pStyle w:val="Compact"/>
+              <w:jc w:val="left"/>
+            </w:pPr>
+            <w:r>
+              <w:rPr>
+                <w:sz w:val="19"/>
+              </w:rPr>
+              <w:t xml:space="preserve">Underneath, it is a person. In a stolen shape, ordinary wounds mark only 1 box at a time; in its own shape, it is as mortal as anyone. Speak its true name to its face and it is forced back into its own shape for the scene.</w:t>
+            </w:r>
+          </w:p>
+        </w:tc>
+      </w:tr>
+      <w:tr>
+        <w:tc>
+          <w:tcPr/>
+          <w:p>
+            <w:pPr>
+              <w:pStyle w:val="Compact"/>
+              <w:jc w:val="left"/>
+            </w:pPr>
+            <w:r>
+              <w:rPr>
+                <w:b/>
+                <w:sz w:val="19"/>
+              </w:rPr>
               <w:t xml:space="preserve">Headless Rider</w:t>
             </w:r>
           </w:p>
@@ -19298,6 +19364,44 @@
       </w:r>
       <w:r>
         <w:t xml:space="preserve">A vampire who drains a victim to Dying can choose to turn them.</w:t>
+      </w:r>
+    </w:p>
+    <w:p>
+      <w:pPr>
+        <w:numPr>
+          <w:ilvl w:val="0"/>
+          <w:numId w:val="1021"/>
+        </w:numPr>
+        <w:pStyle w:val="Compact"/>
+      </w:pPr>
+      <w:r>
+        <w:rPr>
+          <w:bCs/>
+          <w:b/>
+        </w:rPr>
+        <w:t xml:space="preserve">The wendigo’s hunger.</w:t>
+      </w:r>
+      <w:r>
+        <w:t xml:space="preserve"> </w:t>
+      </w:r>
+      <w:r>
+        <w:t xml:space="preserve">It begins with someone who ate human flesh to survive a starving winter in the high passes. A character who does starts a 4-segment</w:t>
+      </w:r>
+      <w:r>
+        <w:t xml:space="preserve"> </w:t>
+      </w:r>
+      <w:r>
+        <w:rPr>
+          <w:bCs/>
+          <w:b/>
+        </w:rPr>
+        <w:t xml:space="preserve">Hunger</w:t>
+      </w:r>
+      <w:r>
+        <w:t xml:space="preserve"> </w:t>
+      </w:r>
+      <w:r>
+        <w:t xml:space="preserve">clock, ticking each week they go without it again; when it fills, they belong to the wendigo. Only a major ritual lifts it.</w:t>
       </w:r>
     </w:p>
     <w:p>
@@ -20611,6 +20715,113 @@
                 <w:b/>
                 <w:sz w:val="19"/>
               </w:rPr>
+              <w:t xml:space="preserve">Skinwalker</w:t>
+            </w:r>
+          </w:p>
+        </w:tc>
+        <w:tc>
+          <w:tcPr/>
+          <w:p>
+            <w:pPr>
+              <w:pStyle w:val="Compact"/>
+              <w:jc w:val="left"/>
+            </w:pPr>
+            <w:r>
+              <w:rPr>
+                <w:sz w:val="19"/>
+              </w:rPr>
+              <w:t xml:space="preserve">Brawling 14, Deception 14, Stealth 14</w:t>
+            </w:r>
+          </w:p>
+        </w:tc>
+        <w:tc>
+          <w:tcPr/>
+          <w:p>
+            <w:pPr>
+              <w:pStyle w:val="Compact"/>
+              <w:jc w:val="left"/>
+            </w:pPr>
+            <w:r>
+              <w:rPr>
+                <w:sz w:val="19"/>
+              </w:rPr>
+              <w:t xml:space="preserve">11</w:t>
+            </w:r>
+          </w:p>
+        </w:tc>
+        <w:tc>
+          <w:tcPr/>
+          <w:p>
+            <w:pPr>
+              <w:pStyle w:val="Compact"/>
+              <w:jc w:val="left"/>
+            </w:pPr>
+            <w:r>
+              <w:rPr>
+                <w:sz w:val="19"/>
+              </w:rPr>
+              <w:t xml:space="preserve">3</w:t>
+            </w:r>
+          </w:p>
+        </w:tc>
+        <w:tc>
+          <w:tcPr/>
+          <w:p>
+            <w:pPr>
+              <w:pStyle w:val="Compact"/>
+              <w:jc w:val="left"/>
+            </w:pPr>
+            <w:r>
+              <w:rPr>
+                <w:sz w:val="19"/>
+              </w:rPr>
+              <w:t xml:space="preserve">Claws (2)</w:t>
+            </w:r>
+          </w:p>
+        </w:tc>
+        <w:tc>
+          <w:tcPr/>
+          <w:p>
+            <w:pPr>
+              <w:pStyle w:val="Compact"/>
+              <w:jc w:val="left"/>
+            </w:pPr>
+            <w:r>
+              <w:rPr>
+                <w:bCs/>
+                <w:b/>
+                <w:sz w:val="19"/>
+              </w:rPr>
+              <w:t xml:space="preserve">Stolen shapes.</w:t>
+            </w:r>
+            <w:r>
+              <w:rPr>
+                <w:sz w:val="19"/>
+              </w:rPr>
+              <w:t xml:space="preserve"> </w:t>
+            </w:r>
+            <w:r>
+              <w:rPr>
+                <w:sz w:val="19"/>
+              </w:rPr>
+              <w:t xml:space="preserve">Wears the shape of a coyote, a wolf, an owl or a person it has seen, and mimics voices. Once per scene, meeting its eyes means a Will roll or being Dazed for a round.</w:t>
+            </w:r>
+          </w:p>
+        </w:tc>
+      </w:tr>
+      <w:tr>
+        <w:tc>
+          <w:tcPr/>
+          <w:p>
+            <w:pPr>
+              <w:pStyle w:val="Compact"/>
+              <w:jc w:val="left"/>
+            </w:pPr>
+            <w:r>
+              <w:rPr>
+                <w:b/>
+                <w:sz w:val="19"/>
+              </w:rPr>
               <w:t xml:space="preserve">Hellhound</w:t>
             </w:r>
           </w:p>
@@ -20701,6 +20912,113 @@
                 <w:sz w:val="19"/>
               </w:rPr>
               <w:t xml:space="preserve">Always finds its quarry; holy water drives it off.</w:t>
+            </w:r>
+          </w:p>
+        </w:tc>
+      </w:tr>
+      <w:tr>
+        <w:tc>
+          <w:tcPr/>
+          <w:p>
+            <w:pPr>
+              <w:pStyle w:val="Compact"/>
+              <w:jc w:val="left"/>
+            </w:pPr>
+            <w:r>
+              <w:rPr>
+                <w:b/>
+                <w:sz w:val="19"/>
+              </w:rPr>
+              <w:t xml:space="preserve">Wendigo</w:t>
+            </w:r>
+          </w:p>
+        </w:tc>
+        <w:tc>
+          <w:tcPr/>
+          <w:p>
+            <w:pPr>
+              <w:pStyle w:val="Compact"/>
+              <w:jc w:val="left"/>
+            </w:pPr>
+            <w:r>
+              <w:rPr>
+                <w:sz w:val="19"/>
+              </w:rPr>
+              <w:t xml:space="preserve">Brawling 15, Tracking 15</w:t>
+            </w:r>
+          </w:p>
+        </w:tc>
+        <w:tc>
+          <w:tcPr/>
+          <w:p>
+            <w:pPr>
+              <w:pStyle w:val="Compact"/>
+              <w:jc w:val="left"/>
+            </w:pPr>
+            <w:r>
+              <w:rPr>
+                <w:sz w:val="19"/>
+              </w:rPr>
+              <w:t xml:space="preserve">11</w:t>
+            </w:r>
+          </w:p>
+        </w:tc>
+        <w:tc>
+          <w:tcPr/>
+          <w:p>
+            <w:pPr>
+              <w:pStyle w:val="Compact"/>
+              <w:jc w:val="left"/>
+            </w:pPr>
+            <w:r>
+              <w:rPr>
+                <w:sz w:val="19"/>
+              </w:rPr>
+              <w:t xml:space="preserve">4</w:t>
+            </w:r>
+          </w:p>
+        </w:tc>
+        <w:tc>
+          <w:tcPr/>
+          <w:p>
+            <w:pPr>
+              <w:pStyle w:val="Compact"/>
+              <w:jc w:val="left"/>
+            </w:pPr>
+            <w:r>
+              <w:rPr>
+                <w:sz w:val="19"/>
+              </w:rPr>
+              <w:t xml:space="preserve">Claws and teeth (2)</w:t>
+            </w:r>
+          </w:p>
+        </w:tc>
+        <w:tc>
+          <w:tcPr/>
+          <w:p>
+            <w:pPr>
+              <w:pStyle w:val="Compact"/>
+              <w:jc w:val="left"/>
+            </w:pPr>
+            <w:r>
+              <w:rPr>
+                <w:bCs/>
+                <w:b/>
+                <w:sz w:val="19"/>
+              </w:rPr>
+              <w:t xml:space="preserve">Endless hunger.</w:t>
+            </w:r>
+            <w:r>
+              <w:rPr>
+                <w:sz w:val="19"/>
+              </w:rPr>
+              <w:t xml:space="preserve"> </w:t>
+            </w:r>
+            <w:r>
+              <w:rPr>
+                <w:sz w:val="19"/>
+              </w:rPr>
+              <w:t xml:space="preserve">Calls out in the voices of the lost to lure prey; ignores the Wounded penalty. Only fire marks more than 1 box at a time, and it rises again unless its heart of ice is burned.</w:t>
             </w:r>
           </w:p>
         </w:tc>

</xml_diff>

<commit_message>
Trails seeds: the Wendigo and the Skinwalker
They replace the two darkness entries that overlapped others (a
necromancer's army, a sorcerer's working gone wrong), in the guide, the
creator and the Discord bot.

Co-Authored-By: Claude Opus 5.5 <noreply@anthropic.com>
Claude-Session: https://claude.ai/code/session_015SADCFzhKijkC2foUmXrpC
</commit_message>
<xml_diff>
--- a/legend-dynamics/site/trails-of-blood-and-dust/Trails_of_Blood_Dust_Players_Guide.docx
+++ b/legend-dynamics/site/trails-of-blood-and-dust/Trails_of_Blood_Dust_Players_Guide.docx
@@ -16116,7 +16116,7 @@
               <w:rPr>
                 <w:sz w:val="19"/>
               </w:rPr>
-              <w:t xml:space="preserve">A necromancer raising an army</w:t>
+              <w:t xml:space="preserve">A wendigo stalking a snowbound camp</w:t>
             </w:r>
           </w:p>
         </w:tc>
@@ -16368,7 +16368,7 @@
               <w:rPr>
                 <w:sz w:val="19"/>
               </w:rPr>
-              <w:t xml:space="preserve">A sorcerer’s working gone wrong</w:t>
+              <w:t xml:space="preserve">A skinwalker wearing a neighbor’s face</w:t>
             </w:r>
           </w:p>
         </w:tc>

</xml_diff>

<commit_message>
Trails seeds: the Wraith, the Banshee and the Headless Rider
The Wraith and the Headless Rider join the darkness table (replacing a
hunter turned monster, which the twists already cover, and the revenant
gunslinger); the Banshee becomes a twist, replacing the vaguest entry.

Co-Authored-By: Claude Opus 5.5 <noreply@anthropic.com>
Claude-Session: https://claude.ai/code/session_015SADCFzhKijkC2foUmXrpC
</commit_message>
<xml_diff>
--- a/legend-dynamics/site/trails-of-blood-and-dust/Trails_of_Blood_Dust_Players_Guide.docx
+++ b/legend-dynamics/site/trails-of-blood-and-dust/Trails_of_Blood_Dust_Players_Guide.docx
@@ -15612,7 +15612,7 @@
               <w:rPr>
                 <w:sz w:val="19"/>
               </w:rPr>
-              <w:t xml:space="preserve">A hunter turned monster</w:t>
+              <w:t xml:space="preserve">A wraith feeding on a boarding house</w:t>
             </w:r>
           </w:p>
         </w:tc>
@@ -16179,7 +16179,7 @@
               <w:rPr>
                 <w:sz w:val="19"/>
               </w:rPr>
-              <w:t xml:space="preserve">A revenant gunslinger</w:t>
+              <w:t xml:space="preserve">A headless rider on the stage road</w:t>
             </w:r>
           </w:p>
         </w:tc>
@@ -17068,7 +17068,7 @@
               <w:rPr>
                 <w:sz w:val="19"/>
               </w:rPr>
-              <w:t xml:space="preserve">A character’s complication comes into play</w:t>
+              <w:t xml:space="preserve">A banshee keens for one of the characters</w:t>
             </w:r>
           </w:p>
         </w:tc>

</xml_diff>

<commit_message>
Bare hands parry fists only: no parrying blades, claws or fangs with an open hand
Trails drops its bare-hands-against-claws rule; the core Parry rule says it
outright; the Encounter panel no longer offers a bare-handed parry against
natural weapons; the sheet's Parry labels say fists only.

Co-Authored-By: Claude Opus 5.5 <noreply@anthropic.com>
Claude-Session: https://claude.ai/code/session_015SADCFzhKijkC2foUmXrpC
</commit_message>
<xml_diff>
--- a/legend-dynamics/site/trails-of-blood-and-dust/Trails_of_Blood_Dust_Players_Guide.docx
+++ b/legend-dynamics/site/trails-of-blood-and-dust/Trails_of_Blood_Dust_Players_Guide.docx
@@ -7940,7 +7940,7 @@
         <w:t xml:space="preserve"> </w:t>
       </w:r>
       <w:r>
-        <w:t xml:space="preserve">Against a weapon in hand or fists, roll Melee −3 with a weapon in hand, or Brawling −3 bare-handed against fists. A second parry in the same round (with Additional Defense) is a further −2. Nobody parries a shot or a missile.</w:t>
+        <w:t xml:space="preserve">Against a weapon in hand or fists, roll Melee −3 with a weapon in hand, or Brawling −3 bare-handed against fists. An open hand can’t parry a blade, claws or fangs. A second parry in the same round (with Additional Defense) is a further −2. Nobody parries a shot or a missile.</w:t>
       </w:r>
     </w:p>
     <w:p>
@@ -8505,28 +8505,6 @@
       </w:pPr>
       <w:r>
         <w:t xml:space="preserve">Trails of Blood &amp; Dust adds these to the attack and defense rules above.</w:t>
-      </w:r>
-    </w:p>
-    <w:p>
-      <w:pPr>
-        <w:numPr>
-          <w:ilvl w:val="0"/>
-          <w:numId w:val="1010"/>
-        </w:numPr>
-        <w:pStyle w:val="Compact"/>
-      </w:pPr>
-      <w:r>
-        <w:rPr>
-          <w:bCs/>
-          <w:b/>
-        </w:rPr>
-        <w:t xml:space="preserve">Bare hands against claws.</w:t>
-      </w:r>
-      <w:r>
-        <w:t xml:space="preserve"> </w:t>
-      </w:r>
-      <w:r>
-        <w:t xml:space="preserve">Out West you can parry claws and fangs bare-handed too, not just fists: Brawling −3.</w:t>
       </w:r>
     </w:p>
     <w:p>

</xml_diff>

<commit_message>
Trails: a broken talisman is renewed only between jobs, from its maker
The Talisman Edge's charm is renewed between jobs only by going back to
the one who made it, or another worker of the same tradition; until
then it stays spent. Edge text, sheet note and the setting's folk
talismans section. The changelog gets a 'setting rules change' kind, so
one setting's rule doesn't move the core rules' date.

Co-Authored-By: Claude Opus 5.5 <noreply@anthropic.com>
Claude-Session: https://claude.ai/code/session_015SADCFzhKijkC2foUmXrpC
</commit_message>
<xml_diff>
--- a/legend-dynamics/site/trails-of-blood-and-dust/Trails_of_Blood_Dust_Players_Guide.docx
+++ b/legend-dynamics/site/trails-of-blood-and-dust/Trails_of_Blood_Dust_Players_Guide.docx
@@ -3862,7 +3862,7 @@
               <w:rPr>
                 <w:sz w:val="19"/>
               </w:rPr>
-              <w:t xml:space="preserve">A ready charm from the folk traditions: a hoodoo mojo hand, a gris-gris, a Himmelsbrief (a German heaven’s letter) sewn in your coat, a buckeye blessed by a granny woman. It holds a Minor ritual agreed with the GM; break it to release it. Anyone can carry one. It’s renewed between jobs and doesn’t count against a charm limit.</w:t>
+              <w:t xml:space="preserve">A ready charm from the folk traditions: a hoodoo mojo hand, a gris-gris, a Himmelsbrief (a German heaven’s letter) sewn in your coat, a buckeye blessed by a granny woman. It holds a Minor ritual agreed with the GM; break it to release it. Anyone can carry one, and it doesn’t count against a charm limit. Once it’s broken, you can renew it only between jobs, and only by going back to its maker or another worker of the same tradition; until you do, it stays spent.</w:t>
             </w:r>
           </w:p>
         </w:tc>
@@ -19108,7 +19108,7 @@
         <w:t xml:space="preserve"> </w:t>
       </w:r>
       <w:r>
-        <w:t xml:space="preserve">Edge: a mojo hand from a hoodoo root doctor, a gris-gris from a Voodoo mambo in New Orleans, a Himmelsbrief (heaven’s letter) from a Pennsylvania German Braucher, a blessed buckeye from an Appalachian granny woman. It holds a Minor ritual, is renewed between jobs, and doesn’t count against a charm limit.</w:t>
+        <w:t xml:space="preserve">Edge: a mojo hand from a hoodoo root doctor, a gris-gris from a Voodoo mambo in New Orleans, a Himmelsbrief (heaven’s letter) from a Pennsylvania German Braucher, a blessed buckeye from an Appalachian granny woman. It holds a Minor ritual and doesn’t count against a charm limit. Once broken, it’s renewed only between jobs, and only by going back to the one who made it or another of the same tradition: a mojo hand from a root doctor, a Himmelsbrief from a Braucher. A job that keeps you far from them leaves it spent.</w:t>
       </w:r>
     </w:p>
     <w:p>

</xml_diff>